<commit_message>
Entregas: evidencia del envío por Resend en el complemento
Captura de la fila de correo_saliente en ENVIADO y del correo recibido en
contacto@josephqaz.dev, en la ficha de concurrencia y en el Word. Una captura
sola va a todo el ancho. Plan, plan de acción e informe al día.

Co-Authored-By: Claude Opus 5.5 <noreply@anthropic.com>
</commit_message>
<xml_diff>
--- a/docs/entregas/Complemento - Sustentacion segundo corte - Acopio.docx
+++ b/docs/entregas/Complemento - Sustentacion segundo corte - Acopio.docx
@@ -1996,7 +1996,17 @@
         <w:t xml:space="preserve">•  </w:t>
       </w:r>
       <w:r>
-        <w:t xml:space="preserve">En vivo: se invita a un usuario desde la consola, la petición responde de inmediato y el correo llega desde </w:t>
+        <w:t xml:space="preserve">Prueba real con Resend, el 30 de octubre en la API local: un registro de Donador para </w:t>
+      </w:r>
+      <w:r>
+        <w:rPr>
+          <w:rFonts w:ascii="Consolas" w:hAnsi="Consolas"/>
+          <w:sz w:val="19"/>
+        </w:rPr>
+        <w:t>contacto@josephqaz.dev</w:t>
+      </w:r>
+      <w:r>
+        <w:t xml:space="preserve"> respondió 202 de inmediato y dejó el correo de confirmación en la cola a las 05:50:11. El consumidor lo tomó en su siguiente pasada y Resend lo aceptó a las 05:51:01, en el primer intento. El correo llegó a la bandeja desde </w:t>
       </w:r>
       <w:r>
         <w:rPr>
@@ -2006,74 +2016,145 @@
         <w:t>no-reply@josephqaz.dev</w:t>
       </w:r>
       <w:r>
-        <w:t xml:space="preserve"> en menos de un minuto.</w:t>
+        <w:t>.</w:t>
       </w:r>
     </w:p>
-    <w:tbl>
-      <w:tblPr>
-        <w:tblStyle w:val="Tablaconcuadrcula"/>
-        <w:tblW w:type="auto" w:w="0"/>
+    <w:p>
+      <w:pPr>
+        <w:keepNext/>
+        <w:spacing w:after="40"/>
         <w:jc w:val="center"/>
-        <w:tblLook w:firstColumn="1" w:firstRow="1" w:lastColumn="0" w:lastRow="0" w:noHBand="0" w:noVBand="1" w:val="04A0"/>
-      </w:tblPr>
-      <w:tblGrid>
-        <w:gridCol w:w="9184"/>
-      </w:tblGrid>
-      <w:tr>
-        <w:tc>
-          <w:tcPr>
-            <w:tcW w:type="dxa" w:w="9184"/>
-            <w:shd w:val="clear" w:color="auto" w:fill="FFF4E5"/>
-          </w:tcPr>
-          <w:p>
-            <w:pPr>
-              <w:jc w:val="center"/>
-            </w:pPr>
-            <w:r>
-              <w:rPr>
-                <w:b/>
-                <w:sz w:val="18"/>
-              </w:rPr>
-              <w:t xml:space="preserve">Pendiente: la captura del panel de Resend con el correo entregado y la de la fila de </w:t>
-            </w:r>
-            <w:r>
-              <w:rPr>
-                <w:rFonts w:ascii="Consolas" w:hAnsi="Consolas"/>
-                <w:b/>
-                <w:sz w:val="15"/>
-              </w:rPr>
-              <w:t>correo_saliente</w:t>
-            </w:r>
-            <w:r>
-              <w:rPr>
-                <w:b/>
-                <w:sz w:val="18"/>
-              </w:rPr>
-              <w:t xml:space="preserve"> en </w:t>
-            </w:r>
-            <w:r>
-              <w:rPr>
-                <w:rFonts w:ascii="Consolas" w:hAnsi="Consolas"/>
-                <w:b/>
-                <w:sz w:val="15"/>
-              </w:rPr>
-              <w:t>ENVIADO</w:t>
-            </w:r>
-            <w:r>
-              <w:rPr>
-                <w:b/>
-                <w:sz w:val="18"/>
-              </w:rPr>
-              <w:t>. Se toman el 30 de octubre, con la API key de Resend puesta en el servidor.</w:t>
-            </w:r>
-          </w:p>
-        </w:tc>
-      </w:tr>
-    </w:tbl>
+      </w:pPr>
+      <w:r>
+        <w:drawing>
+          <wp:inline xmlns:a="http://schemas.openxmlformats.org/drawingml/2006/main" xmlns:pic="http://schemas.openxmlformats.org/drawingml/2006/picture">
+            <wp:extent cx="5831840" cy="1380579"/>
+            <wp:docPr id="4" name="Picture 4"/>
+            <wp:cNvGraphicFramePr>
+              <a:graphicFrameLocks noChangeAspect="1"/>
+            </wp:cNvGraphicFramePr>
+            <a:graphic>
+              <a:graphicData uri="http://schemas.openxmlformats.org/drawingml/2006/picture">
+                <pic:pic>
+                  <pic:nvPicPr>
+                    <pic:cNvPr id="0" name="correo-saliente-enviado.png"/>
+                    <pic:cNvPicPr/>
+                  </pic:nvPicPr>
+                  <pic:blipFill>
+                    <a:blip r:embed="rId30"/>
+                    <a:stretch>
+                      <a:fillRect/>
+                    </a:stretch>
+                  </pic:blipFill>
+                  <pic:spPr>
+                    <a:xfrm>
+                      <a:off x="0" y="0"/>
+                      <a:ext cx="5831840" cy="1380579"/>
+                    </a:xfrm>
+                    <a:prstGeom prst="rect"/>
+                  </pic:spPr>
+                </pic:pic>
+              </a:graphicData>
+            </a:graphic>
+          </wp:inline>
+        </w:drawing>
+      </w:r>
+    </w:p>
     <w:p>
       <w:pPr>
+        <w:jc w:val="center"/>
+      </w:pPr>
+      <w:r>
+        <w:rPr>
+          <w:b/>
+          <w:color w:val="57534E"/>
+          <w:sz w:val="18"/>
+        </w:rPr>
+        <w:t xml:space="preserve">Figura 4. </w:t>
+      </w:r>
+      <w:r>
+        <w:rPr>
+          <w:color w:val="57534E"/>
+          <w:sz w:val="18"/>
+        </w:rPr>
+        <w:t>La fila de correo_saliente después del envío: estado ENVIADO, un intento y sin error.</w:t>
+      </w:r>
+    </w:p>
+    <w:p>
+      <w:r>
+        <w:t xml:space="preserve">El correo de confirmación en la bandeja de </w:t>
+      </w:r>
+      <w:r>
+        <w:rPr>
+          <w:rFonts w:ascii="Consolas" w:hAnsi="Consolas"/>
+          <w:sz w:val="19"/>
+        </w:rPr>
+        <w:t>contacto@josephqaz.dev</w:t>
+      </w:r>
+      <w:r>
+        <w:t>, con el enlace para confirmar la cuenta:</w:t>
+      </w:r>
+    </w:p>
+    <w:p>
+      <w:pPr>
+        <w:keepNext/>
         <w:spacing w:after="40"/>
-      </w:pPr>
+        <w:jc w:val="center"/>
+      </w:pPr>
+      <w:r>
+        <w:drawing>
+          <wp:inline xmlns:a="http://schemas.openxmlformats.org/drawingml/2006/main" xmlns:pic="http://schemas.openxmlformats.org/drawingml/2006/picture">
+            <wp:extent cx="5831840" cy="2226568"/>
+            <wp:docPr id="5" name="Picture 5"/>
+            <wp:cNvGraphicFramePr>
+              <a:graphicFrameLocks noChangeAspect="1"/>
+            </wp:cNvGraphicFramePr>
+            <a:graphic>
+              <a:graphicData uri="http://schemas.openxmlformats.org/drawingml/2006/picture">
+                <pic:pic>
+                  <pic:nvPicPr>
+                    <pic:cNvPr id="0" name="resend-bandeja.png"/>
+                    <pic:cNvPicPr/>
+                  </pic:nvPicPr>
+                  <pic:blipFill>
+                    <a:blip r:embed="rId31"/>
+                    <a:stretch>
+                      <a:fillRect/>
+                    </a:stretch>
+                  </pic:blipFill>
+                  <pic:spPr>
+                    <a:xfrm>
+                      <a:off x="0" y="0"/>
+                      <a:ext cx="5831840" cy="2226568"/>
+                    </a:xfrm>
+                    <a:prstGeom prst="rect"/>
+                  </pic:spPr>
+                </pic:pic>
+              </a:graphicData>
+            </a:graphic>
+          </wp:inline>
+        </w:drawing>
+      </w:r>
+    </w:p>
+    <w:p>
+      <w:pPr>
+        <w:jc w:val="center"/>
+      </w:pPr>
+      <w:r>
+        <w:rPr>
+          <w:b/>
+          <w:color w:val="57534E"/>
+          <w:sz w:val="18"/>
+        </w:rPr>
+        <w:t xml:space="preserve">Figura 5. </w:t>
+      </w:r>
+      <w:r>
+        <w:rPr>
+          <w:color w:val="57534E"/>
+          <w:sz w:val="18"/>
+        </w:rPr>
+        <w:t>El correo «Confirma tu correo en Acopio» recibido desde no-reply@josephqaz.dev.</w:t>
+      </w:r>
     </w:p>
     <w:p>
       <w:pPr>

</xml_diff>

<commit_message>
Diagramas: estados de la donación, capas de la API y cola de correo dibujados a mano
El diagrama de estados pasa de Mermaid a SVG a mano (comportamiento.html), con
colores por actor, flechas numeradas y notación evento [guarda] / efecto. El de
paquetes de la API gana un riel con las cinco capas, y la cola de correo tiene su
diagrama (concurrencia.html). exportar-complemento.mjs saca los PNG; build.mjs ya
no extrae el Mermaid. El documento del complemento explica cómo leer cada uno y el
Word pone los diagramas apaisados en páginas horizontales. ADR-0023 corregido: un
módulo puede importar a otro de su misma capa, nunca a uno de arriba.

Co-Authored-By: Claude Opus 5.5 <noreply@anthropic.com>
</commit_message>
<xml_diff>
--- a/docs/entregas/Complemento - Sustentacion segundo corte - Acopio.docx
+++ b/docs/entregas/Complemento - Sustentacion segundo corte - Acopio.docx
@@ -112,22 +112,1113 @@
         <w:pStyle w:val="Ttulo2"/>
       </w:pPr>
       <w:r>
-        <w:t>1a. Diagrama de paquetes</w:t>
+        <w:t>1a. Qué muestra el diagrama de paquetes</w:t>
       </w:r>
     </w:p>
     <w:p>
       <w:r>
-        <w:t xml:space="preserve">El diagrama se dibuja a mano en </w:t>
+        <w:t>El diagrama tiene dos láminas. La primera muestra el repositorio completo: la web, la API, el código compartido, los colores, el esquema de la base y la infraestructura. La segunda entra en la API y muestra sus doce módulos. Cada caja es una carpeta real del repositorio y lleva su ruta. Adentro aparecen las clases que más pesan en ese paquete, con su nombre en el código y su estereotipo («servicio», «controlador», «interfaz», «dao»).</w:t>
+      </w:r>
+    </w:p>
+    <w:p>
+      <w:pPr>
+        <w:sectPr>
+          <w:footerReference w:type="default" r:id="rId8"/>
+          <w:pgSz w:w="11906" w:h="16838"/>
+          <w:pgMar w:top="1247" w:right="1361" w:bottom="1134" w:left="1361" w:header="720" w:footer="720" w:gutter="0"/>
+          <w:cols w:space="720"/>
+          <w:docGrid w:linePitch="360"/>
+        </w:sectPr>
+      </w:pPr>
+    </w:p>
+    <w:p>
+      <w:pPr>
+        <w:keepNext/>
+        <w:spacing w:after="40"/>
+        <w:jc w:val="center"/>
+      </w:pPr>
+      <w:r>
+        <w:drawing>
+          <wp:inline xmlns:a="http://schemas.openxmlformats.org/drawingml/2006/main" xmlns:pic="http://schemas.openxmlformats.org/drawingml/2006/picture">
+            <wp:extent cx="8963660" cy="4132596"/>
+            <wp:docPr id="1" name="Picture 1"/>
+            <wp:cNvGraphicFramePr>
+              <a:graphicFrameLocks noChangeAspect="1"/>
+            </wp:cNvGraphicFramePr>
+            <a:graphic>
+              <a:graphicData uri="http://schemas.openxmlformats.org/drawingml/2006/picture">
+                <pic:pic>
+                  <pic:nvPicPr>
+                    <pic:cNvPr id="0" name="arquitectura-03-paquetes-del-monorepo.png"/>
+                    <pic:cNvPicPr/>
+                  </pic:nvPicPr>
+                  <pic:blipFill>
+                    <a:blip r:embed="rId27"/>
+                    <a:stretch>
+                      <a:fillRect/>
+                    </a:stretch>
+                  </pic:blipFill>
+                  <pic:spPr>
+                    <a:xfrm>
+                      <a:off x="0" y="0"/>
+                      <a:ext cx="8963660" cy="4132596"/>
+                    </a:xfrm>
+                    <a:prstGeom prst="rect"/>
+                  </pic:spPr>
+                </pic:pic>
+              </a:graphicData>
+            </a:graphic>
+          </wp:inline>
+        </w:drawing>
+      </w:r>
+    </w:p>
+    <w:p>
+      <w:pPr>
+        <w:jc w:val="center"/>
+      </w:pPr>
+      <w:r>
+        <w:rPr>
+          <w:b/>
+          <w:color w:val="57534E"/>
+          <w:sz w:val="18"/>
+        </w:rPr>
+        <w:t xml:space="preserve">Figura 1. </w:t>
+      </w:r>
+      <w:r>
+        <w:rPr>
+          <w:color w:val="57534E"/>
+          <w:sz w:val="18"/>
+        </w:rPr>
+        <w:t>Paquetes del monorepo: la web y la API no comparten código salvo packages/shared; se comunican por HTTP y por el contrato OpenAPI.</w:t>
+      </w:r>
+    </w:p>
+    <w:p>
+      <w:pPr>
+        <w:sectPr>
+          <w:pgSz w:w="16838" w:h="11906" w:orient="landscape"/>
+          <w:pgMar w:top="1247" w:right="1361" w:bottom="1134" w:left="1361" w:header="720" w:footer="720" w:gutter="0"/>
+          <w:cols w:space="720"/>
+          <w:docGrid w:linePitch="360"/>
+        </w:sectPr>
+      </w:pPr>
+    </w:p>
+    <w:p>
+      <w:r>
+        <w:t xml:space="preserve">En la primera lámina, la flecha continua significa «importa código de» y la punteada «genera, exporta o llama por HTTP». La web nunca importa código de la API: le habla por HTTP en </w:t>
       </w:r>
       <w:r>
         <w:rPr>
           <w:rFonts w:ascii="Consolas" w:hAnsi="Consolas"/>
           <w:sz w:val="19"/>
         </w:rPr>
-        <w:t>docs/02-arquitectura/diagramas/paquetes.html</w:t>
+        <w:t>/api</w:t>
       </w:r>
       <w:r>
-        <w:t xml:space="preserve"> y tiene dos láminas. La primera muestra el monorepo y la segunda los doce módulos de la API. El 30 de octubre lo comparamos con los imports reales del código: los doce módulos coincidían, pero solo estaba dibujada la dependencia de </w:t>
+        <w:t xml:space="preserve"> y toma los tipos del contrato </w:t>
+      </w:r>
+      <w:r>
+        <w:rPr>
+          <w:rFonts w:ascii="Consolas" w:hAnsi="Consolas"/>
+          <w:sz w:val="19"/>
+        </w:rPr>
+        <w:t>openapi.json</w:t>
+      </w:r>
+      <w:r>
+        <w:t xml:space="preserve">, que la API exporta. Lo único que comparten es </w:t>
+      </w:r>
+      <w:r>
+        <w:rPr>
+          <w:rFonts w:ascii="Consolas" w:hAnsi="Consolas"/>
+          <w:sz w:val="19"/>
+        </w:rPr>
+        <w:t>packages/shared</w:t>
+      </w:r>
+      <w:r>
+        <w:t>, donde viven las fórmulas del motor y las unidades, para que la web muestre el mismo número que calcula la API.</w:t>
+      </w:r>
+    </w:p>
+    <w:p>
+      <w:pPr>
+        <w:keepNext/>
+        <w:spacing w:after="40"/>
+        <w:jc w:val="center"/>
+      </w:pPr>
+      <w:r>
+        <w:drawing>
+          <wp:inline xmlns:a="http://schemas.openxmlformats.org/drawingml/2006/main" xmlns:pic="http://schemas.openxmlformats.org/drawingml/2006/picture">
+            <wp:extent cx="5831840" cy="4586894"/>
+            <wp:docPr id="2" name="Picture 2"/>
+            <wp:cNvGraphicFramePr>
+              <a:graphicFrameLocks noChangeAspect="1"/>
+            </wp:cNvGraphicFramePr>
+            <a:graphic>
+              <a:graphicData uri="http://schemas.openxmlformats.org/drawingml/2006/picture">
+                <pic:pic>
+                  <pic:nvPicPr>
+                    <pic:cNvPr id="0" name="arquitectura-04-paquetes-de-la-api.png"/>
+                    <pic:cNvPicPr/>
+                  </pic:nvPicPr>
+                  <pic:blipFill>
+                    <a:blip r:embed="rId28"/>
+                    <a:stretch>
+                      <a:fillRect/>
+                    </a:stretch>
+                  </pic:blipFill>
+                  <pic:spPr>
+                    <a:xfrm>
+                      <a:off x="0" y="0"/>
+                      <a:ext cx="5831840" cy="4586894"/>
+                    </a:xfrm>
+                    <a:prstGeom prst="rect"/>
+                  </pic:spPr>
+                </pic:pic>
+              </a:graphicData>
+            </a:graphic>
+          </wp:inline>
+        </w:drawing>
+      </w:r>
+    </w:p>
+    <w:p>
+      <w:pPr>
+        <w:jc w:val="center"/>
+      </w:pPr>
+      <w:r>
+        <w:rPr>
+          <w:b/>
+          <w:color w:val="57534E"/>
+          <w:sz w:val="18"/>
+        </w:rPr>
+        <w:t xml:space="preserve">Figura 2. </w:t>
+      </w:r>
+      <w:r>
+        <w:rPr>
+          <w:color w:val="57534E"/>
+          <w:sz w:val="18"/>
+        </w:rPr>
+        <w:t>Paquetes de la API en cinco capas: integración, procesos, registro, red y catálogo, y transversales. Las dependencias bajan o van de lado, nunca suben.</w:t>
+      </w:r>
+    </w:p>
+    <w:p>
+      <w:r>
+        <w:t xml:space="preserve">La segunda lámina se lee de arriba hacia abajo. El riel de la izquierda nombra las cinco capas y dice qué resuelve cada una. Cada flecha es un </w:t>
+      </w:r>
+      <w:r>
+        <w:rPr>
+          <w:rFonts w:ascii="Consolas" w:hAnsi="Consolas"/>
+          <w:sz w:val="19"/>
+        </w:rPr>
+        <w:t>import</w:t>
+      </w:r>
+      <w:r>
+        <w:t xml:space="preserve"> que existe en el código, y todas apuntan hacia abajo o hacia un módulo de la misma capa; ninguna sube. Los módulos que usan casi todos, </w:t>
+      </w:r>
+      <w:r>
+        <w:rPr>
+          <w:rFonts w:ascii="Consolas" w:hAnsi="Consolas"/>
+          <w:sz w:val="19"/>
+        </w:rPr>
+        <w:t>identidad</w:t>
+      </w:r>
+      <w:r>
+        <w:t xml:space="preserve"> (sesión y permisos) y </w:t>
+      </w:r>
+      <w:r>
+        <w:rPr>
+          <w:rFonts w:ascii="Consolas" w:hAnsi="Consolas"/>
+          <w:sz w:val="19"/>
+        </w:rPr>
+        <w:t>auditoria</w:t>
+      </w:r>
+      <w:r>
+        <w:t xml:space="preserve"> (bitácora), se marcan con una etiqueta y no con flechas, porque doce flechas más taparían el resto.</w:t>
+      </w:r>
+    </w:p>
+    <w:tbl>
+      <w:tblPr>
+        <w:tblStyle w:val="Tablaconcuadrcula"/>
+        <w:tblW w:type="auto" w:w="0"/>
+        <w:jc w:val="center"/>
+        <w:tblLook w:firstColumn="1" w:firstRow="1" w:lastColumn="0" w:lastRow="0" w:noHBand="0" w:noVBand="1" w:val="04A0"/>
+      </w:tblPr>
+      <w:tblGrid>
+        <w:gridCol w:w="2296"/>
+        <w:gridCol w:w="2296"/>
+        <w:gridCol w:w="2296"/>
+        <w:gridCol w:w="2296"/>
+      </w:tblGrid>
+      <w:tr>
+        <w:trPr>
+          <w:cantSplit w:val="true"/>
+          <w:tblHeader w:val="true"/>
+        </w:trPr>
+        <w:tc>
+          <w:tcPr>
+            <w:tcW w:type="dxa" w:w="2296"/>
+            <w:shd w:val="clear" w:color="auto" w:fill="0F6E6E"/>
+          </w:tcPr>
+          <w:p>
+            <w:pPr>
+              <w:spacing w:after="40"/>
+              <w:jc w:val="left"/>
+            </w:pPr>
+            <w:r>
+              <w:rPr>
+                <w:b/>
+                <w:color w:val="FFFFFF"/>
+                <w:sz w:val="16"/>
+              </w:rPr>
+              <w:t>Capa</w:t>
+            </w:r>
+          </w:p>
+        </w:tc>
+        <w:tc>
+          <w:tcPr>
+            <w:tcW w:type="dxa" w:w="2296"/>
+            <w:shd w:val="clear" w:color="auto" w:fill="0F6E6E"/>
+          </w:tcPr>
+          <w:p>
+            <w:pPr>
+              <w:spacing w:after="40"/>
+              <w:jc w:val="left"/>
+            </w:pPr>
+            <w:r>
+              <w:rPr>
+                <w:b/>
+                <w:color w:val="FFFFFF"/>
+                <w:sz w:val="16"/>
+              </w:rPr>
+              <w:t>Módulos</w:t>
+            </w:r>
+          </w:p>
+        </w:tc>
+        <w:tc>
+          <w:tcPr>
+            <w:tcW w:type="dxa" w:w="2296"/>
+            <w:shd w:val="clear" w:color="auto" w:fill="0F6E6E"/>
+          </w:tcPr>
+          <w:p>
+            <w:pPr>
+              <w:spacing w:after="40"/>
+              <w:jc w:val="left"/>
+            </w:pPr>
+            <w:r>
+              <w:rPr>
+                <w:b/>
+                <w:color w:val="FFFFFF"/>
+                <w:sz w:val="16"/>
+              </w:rPr>
+              <w:t>Qué resuelve</w:t>
+            </w:r>
+          </w:p>
+        </w:tc>
+        <w:tc>
+          <w:tcPr>
+            <w:tcW w:type="dxa" w:w="2296"/>
+            <w:shd w:val="clear" w:color="auto" w:fill="0F6E6E"/>
+          </w:tcPr>
+          <w:p>
+            <w:pPr>
+              <w:spacing w:after="40"/>
+              <w:jc w:val="left"/>
+            </w:pPr>
+            <w:r>
+              <w:rPr>
+                <w:b/>
+                <w:color w:val="FFFFFF"/>
+                <w:sz w:val="16"/>
+              </w:rPr>
+              <w:t xml:space="preserve">De qué depende, además de </w:t>
+            </w:r>
+            <w:r>
+              <w:rPr>
+                <w:rFonts w:ascii="Consolas" w:hAnsi="Consolas"/>
+                <w:b/>
+                <w:color w:val="FFFFFF"/>
+                <w:sz w:val="13"/>
+              </w:rPr>
+              <w:t>identidad</w:t>
+            </w:r>
+            <w:r>
+              <w:rPr>
+                <w:b/>
+                <w:color w:val="FFFFFF"/>
+                <w:sz w:val="16"/>
+              </w:rPr>
+              <w:t xml:space="preserve"> y </w:t>
+            </w:r>
+            <w:r>
+              <w:rPr>
+                <w:rFonts w:ascii="Consolas" w:hAnsi="Consolas"/>
+                <w:b/>
+                <w:color w:val="FFFFFF"/>
+                <w:sz w:val="13"/>
+              </w:rPr>
+              <w:t>auditoria</w:t>
+            </w:r>
+          </w:p>
+        </w:tc>
+      </w:tr>
+      <w:tr>
+        <w:trPr>
+          <w:cantSplit w:val="true"/>
+        </w:trPr>
+        <w:tc>
+          <w:tcPr>
+            <w:tcW w:type="dxa" w:w="2296"/>
+          </w:tcPr>
+          <w:p>
+            <w:pPr>
+              <w:spacing w:after="40"/>
+              <w:jc w:val="left"/>
+            </w:pPr>
+            <w:r>
+              <w:rPr>
+                <w:sz w:val="16"/>
+              </w:rPr>
+              <w:t>1. Integración</w:t>
+            </w:r>
+          </w:p>
+        </w:tc>
+        <w:tc>
+          <w:tcPr>
+            <w:tcW w:type="dxa" w:w="2296"/>
+          </w:tcPr>
+          <w:p>
+            <w:pPr>
+              <w:spacing w:after="40"/>
+              <w:jc w:val="left"/>
+            </w:pPr>
+            <w:r>
+              <w:rPr>
+                <w:rFonts w:ascii="Consolas" w:hAnsi="Consolas"/>
+                <w:sz w:val="13"/>
+              </w:rPr>
+              <w:t>importacion</w:t>
+            </w:r>
+          </w:p>
+        </w:tc>
+        <w:tc>
+          <w:tcPr>
+            <w:tcW w:type="dxa" w:w="2296"/>
+          </w:tcPr>
+          <w:p>
+            <w:pPr>
+              <w:spacing w:after="40"/>
+              <w:jc w:val="left"/>
+            </w:pPr>
+            <w:r>
+              <w:rPr>
+                <w:sz w:val="16"/>
+              </w:rPr>
+              <w:t>Trae puntos de acopio de RedAcopio y de archivos CSV</w:t>
+            </w:r>
+          </w:p>
+        </w:tc>
+        <w:tc>
+          <w:tcPr>
+            <w:tcW w:type="dxa" w:w="2296"/>
+          </w:tcPr>
+          <w:p>
+            <w:pPr>
+              <w:spacing w:after="40"/>
+              <w:jc w:val="left"/>
+            </w:pPr>
+            <w:r>
+              <w:rPr>
+                <w:rFonts w:ascii="Consolas" w:hAnsi="Consolas"/>
+                <w:sz w:val="13"/>
+              </w:rPr>
+              <w:t>acopios</w:t>
+            </w:r>
+            <w:r>
+              <w:rPr>
+                <w:sz w:val="16"/>
+              </w:rPr>
+              <w:t xml:space="preserve">, </w:t>
+            </w:r>
+            <w:r>
+              <w:rPr>
+                <w:rFonts w:ascii="Consolas" w:hAnsi="Consolas"/>
+                <w:sz w:val="13"/>
+              </w:rPr>
+              <w:t>catalogo</w:t>
+            </w:r>
+            <w:r>
+              <w:rPr>
+                <w:sz w:val="16"/>
+              </w:rPr>
+              <w:t xml:space="preserve">, </w:t>
+            </w:r>
+            <w:r>
+              <w:rPr>
+                <w:rFonts w:ascii="Consolas" w:hAnsi="Consolas"/>
+                <w:sz w:val="13"/>
+              </w:rPr>
+              <w:t>inventario</w:t>
+            </w:r>
+            <w:r>
+              <w:rPr>
+                <w:sz w:val="16"/>
+              </w:rPr>
+              <w:t xml:space="preserve">, </w:t>
+            </w:r>
+            <w:r>
+              <w:rPr>
+                <w:rFonts w:ascii="Consolas" w:hAnsi="Consolas"/>
+                <w:sz w:val="13"/>
+              </w:rPr>
+              <w:t>turnos</w:t>
+            </w:r>
+            <w:r>
+              <w:rPr>
+                <w:sz w:val="16"/>
+              </w:rPr>
+              <w:t xml:space="preserve">, </w:t>
+            </w:r>
+            <w:r>
+              <w:rPr>
+                <w:rFonts w:ascii="Consolas" w:hAnsi="Consolas"/>
+                <w:sz w:val="13"/>
+              </w:rPr>
+              <w:t>almacenamiento</w:t>
+            </w:r>
+          </w:p>
+        </w:tc>
+      </w:tr>
+      <w:tr>
+        <w:trPr>
+          <w:cantSplit w:val="true"/>
+        </w:trPr>
+        <w:tc>
+          <w:tcPr>
+            <w:tcW w:type="dxa" w:w="2296"/>
+          </w:tcPr>
+          <w:p>
+            <w:pPr>
+              <w:spacing w:after="40"/>
+              <w:jc w:val="left"/>
+            </w:pPr>
+            <w:r>
+              <w:rPr>
+                <w:sz w:val="16"/>
+              </w:rPr>
+              <w:t>2. Procesos</w:t>
+            </w:r>
+          </w:p>
+        </w:tc>
+        <w:tc>
+          <w:tcPr>
+            <w:tcW w:type="dxa" w:w="2296"/>
+          </w:tcPr>
+          <w:p>
+            <w:pPr>
+              <w:spacing w:after="40"/>
+              <w:jc w:val="left"/>
+            </w:pPr>
+            <w:r>
+              <w:rPr>
+                <w:rFonts w:ascii="Consolas" w:hAnsi="Consolas"/>
+                <w:sz w:val="13"/>
+              </w:rPr>
+              <w:t>motor</w:t>
+            </w:r>
+            <w:r>
+              <w:rPr>
+                <w:sz w:val="16"/>
+              </w:rPr>
+              <w:t xml:space="preserve">, </w:t>
+            </w:r>
+            <w:r>
+              <w:rPr>
+                <w:rFonts w:ascii="Consolas" w:hAnsi="Consolas"/>
+                <w:sz w:val="13"/>
+              </w:rPr>
+              <w:t>turnos</w:t>
+            </w:r>
+          </w:p>
+        </w:tc>
+        <w:tc>
+          <w:tcPr>
+            <w:tcW w:type="dxa" w:w="2296"/>
+          </w:tcPr>
+          <w:p>
+            <w:pPr>
+              <w:spacing w:after="40"/>
+              <w:jc w:val="left"/>
+            </w:pPr>
+            <w:r>
+              <w:rPr>
+                <w:sz w:val="16"/>
+              </w:rPr>
+              <w:t>El motor calcula necesidad, excedentes, sugerencias y remisiones; turnos maneja jornadas, reservas y asistencia</w:t>
+            </w:r>
+          </w:p>
+        </w:tc>
+        <w:tc>
+          <w:tcPr>
+            <w:tcW w:type="dxa" w:w="2296"/>
+          </w:tcPr>
+          <w:p>
+            <w:pPr>
+              <w:spacing w:after="40"/>
+              <w:jc w:val="left"/>
+            </w:pPr>
+            <w:r>
+              <w:rPr>
+                <w:rFonts w:ascii="Consolas" w:hAnsi="Consolas"/>
+                <w:sz w:val="13"/>
+              </w:rPr>
+              <w:t>motor</w:t>
+            </w:r>
+            <w:r>
+              <w:rPr>
+                <w:sz w:val="16"/>
+              </w:rPr>
+              <w:t xml:space="preserve">: </w:t>
+            </w:r>
+            <w:r>
+              <w:rPr>
+                <w:rFonts w:ascii="Consolas" w:hAnsi="Consolas"/>
+                <w:sz w:val="13"/>
+              </w:rPr>
+              <w:t>comprobantes</w:t>
+            </w:r>
+            <w:r>
+              <w:rPr>
+                <w:sz w:val="16"/>
+              </w:rPr>
+              <w:t xml:space="preserve">, </w:t>
+            </w:r>
+            <w:r>
+              <w:rPr>
+                <w:rFonts w:ascii="Consolas" w:hAnsi="Consolas"/>
+                <w:sz w:val="13"/>
+              </w:rPr>
+              <w:t>inventario</w:t>
+            </w:r>
+            <w:r>
+              <w:rPr>
+                <w:sz w:val="16"/>
+              </w:rPr>
+              <w:t xml:space="preserve">, </w:t>
+            </w:r>
+            <w:r>
+              <w:rPr>
+                <w:rFonts w:ascii="Consolas" w:hAnsi="Consolas"/>
+                <w:sz w:val="13"/>
+              </w:rPr>
+              <w:t>acopios</w:t>
+            </w:r>
+            <w:r>
+              <w:rPr>
+                <w:sz w:val="16"/>
+              </w:rPr>
+              <w:t xml:space="preserve">, </w:t>
+            </w:r>
+            <w:r>
+              <w:rPr>
+                <w:rFonts w:ascii="Consolas" w:hAnsi="Consolas"/>
+                <w:sz w:val="13"/>
+              </w:rPr>
+              <w:t>catalogo</w:t>
+            </w:r>
+            <w:r>
+              <w:rPr>
+                <w:sz w:val="16"/>
+              </w:rPr>
+              <w:t xml:space="preserve">, </w:t>
+            </w:r>
+            <w:r>
+              <w:rPr>
+                <w:rFonts w:ascii="Consolas" w:hAnsi="Consolas"/>
+                <w:sz w:val="13"/>
+              </w:rPr>
+              <w:t>almacenamiento</w:t>
+            </w:r>
+            <w:r>
+              <w:rPr>
+                <w:sz w:val="16"/>
+              </w:rPr>
+              <w:t xml:space="preserve">. </w:t>
+            </w:r>
+            <w:r>
+              <w:rPr>
+                <w:rFonts w:ascii="Consolas" w:hAnsi="Consolas"/>
+                <w:sz w:val="13"/>
+              </w:rPr>
+              <w:t>turnos</w:t>
+            </w:r>
+            <w:r>
+              <w:rPr>
+                <w:sz w:val="16"/>
+              </w:rPr>
+              <w:t xml:space="preserve">: </w:t>
+            </w:r>
+            <w:r>
+              <w:rPr>
+                <w:rFonts w:ascii="Consolas" w:hAnsi="Consolas"/>
+                <w:sz w:val="13"/>
+              </w:rPr>
+              <w:t>acopios</w:t>
+            </w:r>
+            <w:r>
+              <w:rPr>
+                <w:sz w:val="16"/>
+              </w:rPr>
+              <w:t xml:space="preserve">, </w:t>
+            </w:r>
+            <w:r>
+              <w:rPr>
+                <w:rFonts w:ascii="Consolas" w:hAnsi="Consolas"/>
+                <w:sz w:val="13"/>
+              </w:rPr>
+              <w:t>notificaciones</w:t>
+            </w:r>
+          </w:p>
+        </w:tc>
+      </w:tr>
+      <w:tr>
+        <w:trPr>
+          <w:cantSplit w:val="true"/>
+        </w:trPr>
+        <w:tc>
+          <w:tcPr>
+            <w:tcW w:type="dxa" w:w="2296"/>
+          </w:tcPr>
+          <w:p>
+            <w:pPr>
+              <w:spacing w:after="40"/>
+              <w:jc w:val="left"/>
+            </w:pPr>
+            <w:r>
+              <w:rPr>
+                <w:sz w:val="16"/>
+              </w:rPr>
+              <w:t>3. Registro</w:t>
+            </w:r>
+          </w:p>
+        </w:tc>
+        <w:tc>
+          <w:tcPr>
+            <w:tcW w:type="dxa" w:w="2296"/>
+          </w:tcPr>
+          <w:p>
+            <w:pPr>
+              <w:spacing w:after="40"/>
+              <w:jc w:val="left"/>
+            </w:pPr>
+            <w:r>
+              <w:rPr>
+                <w:rFonts w:ascii="Consolas" w:hAnsi="Consolas"/>
+                <w:sz w:val="13"/>
+              </w:rPr>
+              <w:t>comprobantes</w:t>
+            </w:r>
+            <w:r>
+              <w:rPr>
+                <w:sz w:val="16"/>
+              </w:rPr>
+              <w:t xml:space="preserve">, </w:t>
+            </w:r>
+            <w:r>
+              <w:rPr>
+                <w:rFonts w:ascii="Consolas" w:hAnsi="Consolas"/>
+                <w:sz w:val="13"/>
+              </w:rPr>
+              <w:t>inventario</w:t>
+            </w:r>
+          </w:p>
+        </w:tc>
+        <w:tc>
+          <w:tcPr>
+            <w:tcW w:type="dxa" w:w="2296"/>
+          </w:tcPr>
+          <w:p>
+            <w:pPr>
+              <w:spacing w:after="40"/>
+              <w:jc w:val="left"/>
+            </w:pPr>
+            <w:r>
+              <w:rPr>
+                <w:sz w:val="16"/>
+              </w:rPr>
+              <w:t>Las donaciones con folio y los movimientos de inventario, de los que sale el saldo</w:t>
+            </w:r>
+          </w:p>
+        </w:tc>
+        <w:tc>
+          <w:tcPr>
+            <w:tcW w:type="dxa" w:w="2296"/>
+          </w:tcPr>
+          <w:p>
+            <w:pPr>
+              <w:spacing w:after="40"/>
+              <w:jc w:val="left"/>
+            </w:pPr>
+            <w:r>
+              <w:rPr>
+                <w:rFonts w:ascii="Consolas" w:hAnsi="Consolas"/>
+                <w:sz w:val="13"/>
+              </w:rPr>
+              <w:t>comprobantes</w:t>
+            </w:r>
+            <w:r>
+              <w:rPr>
+                <w:sz w:val="16"/>
+              </w:rPr>
+              <w:t xml:space="preserve">: </w:t>
+            </w:r>
+            <w:r>
+              <w:rPr>
+                <w:rFonts w:ascii="Consolas" w:hAnsi="Consolas"/>
+                <w:sz w:val="13"/>
+              </w:rPr>
+              <w:t>inventario</w:t>
+            </w:r>
+            <w:r>
+              <w:rPr>
+                <w:sz w:val="16"/>
+              </w:rPr>
+              <w:t xml:space="preserve">, </w:t>
+            </w:r>
+            <w:r>
+              <w:rPr>
+                <w:rFonts w:ascii="Consolas" w:hAnsi="Consolas"/>
+                <w:sz w:val="13"/>
+              </w:rPr>
+              <w:t>acopios</w:t>
+            </w:r>
+            <w:r>
+              <w:rPr>
+                <w:sz w:val="16"/>
+              </w:rPr>
+              <w:t xml:space="preserve">, </w:t>
+            </w:r>
+            <w:r>
+              <w:rPr>
+                <w:rFonts w:ascii="Consolas" w:hAnsi="Consolas"/>
+                <w:sz w:val="13"/>
+              </w:rPr>
+              <w:t>catalogo</w:t>
+            </w:r>
+            <w:r>
+              <w:rPr>
+                <w:sz w:val="16"/>
+              </w:rPr>
+              <w:t xml:space="preserve">, </w:t>
+            </w:r>
+            <w:r>
+              <w:rPr>
+                <w:rFonts w:ascii="Consolas" w:hAnsi="Consolas"/>
+                <w:sz w:val="13"/>
+              </w:rPr>
+              <w:t>almacenamiento</w:t>
+            </w:r>
+            <w:r>
+              <w:rPr>
+                <w:sz w:val="16"/>
+              </w:rPr>
+              <w:t xml:space="preserve">, </w:t>
+            </w:r>
+            <w:r>
+              <w:rPr>
+                <w:rFonts w:ascii="Consolas" w:hAnsi="Consolas"/>
+                <w:sz w:val="13"/>
+              </w:rPr>
+              <w:t>notificaciones</w:t>
+            </w:r>
+            <w:r>
+              <w:rPr>
+                <w:sz w:val="16"/>
+              </w:rPr>
+              <w:t xml:space="preserve">. </w:t>
+            </w:r>
+            <w:r>
+              <w:rPr>
+                <w:rFonts w:ascii="Consolas" w:hAnsi="Consolas"/>
+                <w:sz w:val="13"/>
+              </w:rPr>
+              <w:t>inventario</w:t>
+            </w:r>
+            <w:r>
+              <w:rPr>
+                <w:sz w:val="16"/>
+              </w:rPr>
+              <w:t xml:space="preserve">: </w:t>
+            </w:r>
+            <w:r>
+              <w:rPr>
+                <w:rFonts w:ascii="Consolas" w:hAnsi="Consolas"/>
+                <w:sz w:val="13"/>
+              </w:rPr>
+              <w:t>acopios</w:t>
+            </w:r>
+            <w:r>
+              <w:rPr>
+                <w:sz w:val="16"/>
+              </w:rPr>
+              <w:t xml:space="preserve">, </w:t>
+            </w:r>
+            <w:r>
+              <w:rPr>
+                <w:rFonts w:ascii="Consolas" w:hAnsi="Consolas"/>
+                <w:sz w:val="13"/>
+              </w:rPr>
+              <w:t>catalogo</w:t>
+            </w:r>
+          </w:p>
+        </w:tc>
+      </w:tr>
+      <w:tr>
+        <w:trPr>
+          <w:cantSplit w:val="true"/>
+        </w:trPr>
+        <w:tc>
+          <w:tcPr>
+            <w:tcW w:type="dxa" w:w="2296"/>
+          </w:tcPr>
+          <w:p>
+            <w:pPr>
+              <w:spacing w:after="40"/>
+              <w:jc w:val="left"/>
+            </w:pPr>
+            <w:r>
+              <w:rPr>
+                <w:sz w:val="16"/>
+              </w:rPr>
+              <w:t>4. Red y catálogo</w:t>
+            </w:r>
+          </w:p>
+        </w:tc>
+        <w:tc>
+          <w:tcPr>
+            <w:tcW w:type="dxa" w:w="2296"/>
+          </w:tcPr>
+          <w:p>
+            <w:pPr>
+              <w:spacing w:after="40"/>
+              <w:jc w:val="left"/>
+            </w:pPr>
+            <w:r>
+              <w:rPr>
+                <w:rFonts w:ascii="Consolas" w:hAnsi="Consolas"/>
+                <w:sz w:val="13"/>
+              </w:rPr>
+              <w:t>acopios</w:t>
+            </w:r>
+            <w:r>
+              <w:rPr>
+                <w:sz w:val="16"/>
+              </w:rPr>
+              <w:t xml:space="preserve">, </w:t>
+            </w:r>
+            <w:r>
+              <w:rPr>
+                <w:rFonts w:ascii="Consolas" w:hAnsi="Consolas"/>
+                <w:sz w:val="13"/>
+              </w:rPr>
+              <w:t>catalogo</w:t>
+            </w:r>
+          </w:p>
+        </w:tc>
+        <w:tc>
+          <w:tcPr>
+            <w:tcW w:type="dxa" w:w="2296"/>
+          </w:tcPr>
+          <w:p>
+            <w:pPr>
+              <w:spacing w:after="40"/>
+              <w:jc w:val="left"/>
+            </w:pPr>
+            <w:r>
+              <w:rPr>
+                <w:sz w:val="16"/>
+              </w:rPr>
+              <w:t>Dónde se recibe (acopios, zonas, entidades, causas) y qué se recibe (categorías, códigos de barras, canasta, emergencias)</w:t>
+            </w:r>
+          </w:p>
+        </w:tc>
+        <w:tc>
+          <w:tcPr>
+            <w:tcW w:type="dxa" w:w="2296"/>
+          </w:tcPr>
+          <w:p>
+            <w:pPr>
+              <w:spacing w:after="40"/>
+              <w:jc w:val="left"/>
+            </w:pPr>
+            <w:r>
+              <w:rPr>
+                <w:rFonts w:ascii="Consolas" w:hAnsi="Consolas"/>
+                <w:sz w:val="13"/>
+              </w:rPr>
+              <w:t>acopios</w:t>
+            </w:r>
+            <w:r>
+              <w:rPr>
+                <w:sz w:val="16"/>
+              </w:rPr>
+              <w:t xml:space="preserve">: </w:t>
+            </w:r>
+            <w:r>
+              <w:rPr>
+                <w:rFonts w:ascii="Consolas" w:hAnsi="Consolas"/>
+                <w:sz w:val="13"/>
+              </w:rPr>
+              <w:t>almacenamiento</w:t>
+            </w:r>
+          </w:p>
+        </w:tc>
+      </w:tr>
+      <w:tr>
+        <w:trPr>
+          <w:cantSplit w:val="true"/>
+        </w:trPr>
+        <w:tc>
+          <w:tcPr>
+            <w:tcW w:type="dxa" w:w="2296"/>
+          </w:tcPr>
+          <w:p>
+            <w:pPr>
+              <w:spacing w:after="40"/>
+              <w:jc w:val="left"/>
+            </w:pPr>
+            <w:r>
+              <w:rPr>
+                <w:sz w:val="16"/>
+              </w:rPr>
+              <w:t>5. Transversales</w:t>
+            </w:r>
+          </w:p>
+        </w:tc>
+        <w:tc>
+          <w:tcPr>
+            <w:tcW w:type="dxa" w:w="2296"/>
+          </w:tcPr>
+          <w:p>
+            <w:pPr>
+              <w:spacing w:after="40"/>
+              <w:jc w:val="left"/>
+            </w:pPr>
+            <w:r>
+              <w:rPr>
+                <w:rFonts w:ascii="Consolas" w:hAnsi="Consolas"/>
+                <w:sz w:val="13"/>
+              </w:rPr>
+              <w:t>identidad</w:t>
+            </w:r>
+            <w:r>
+              <w:rPr>
+                <w:sz w:val="16"/>
+              </w:rPr>
+              <w:t xml:space="preserve">, </w:t>
+            </w:r>
+            <w:r>
+              <w:rPr>
+                <w:rFonts w:ascii="Consolas" w:hAnsi="Consolas"/>
+                <w:sz w:val="13"/>
+              </w:rPr>
+              <w:t>auditoria</w:t>
+            </w:r>
+            <w:r>
+              <w:rPr>
+                <w:sz w:val="16"/>
+              </w:rPr>
+              <w:t xml:space="preserve">, </w:t>
+            </w:r>
+            <w:r>
+              <w:rPr>
+                <w:rFonts w:ascii="Consolas" w:hAnsi="Consolas"/>
+                <w:sz w:val="13"/>
+              </w:rPr>
+              <w:t>notificaciones</w:t>
+            </w:r>
+            <w:r>
+              <w:rPr>
+                <w:sz w:val="16"/>
+              </w:rPr>
+              <w:t xml:space="preserve">, </w:t>
+            </w:r>
+            <w:r>
+              <w:rPr>
+                <w:rFonts w:ascii="Consolas" w:hAnsi="Consolas"/>
+                <w:sz w:val="13"/>
+              </w:rPr>
+              <w:t>almacenamiento</w:t>
+            </w:r>
+            <w:r>
+              <w:rPr>
+                <w:sz w:val="16"/>
+              </w:rPr>
+              <w:t xml:space="preserve">, </w:t>
+            </w:r>
+            <w:r>
+              <w:rPr>
+                <w:rFonts w:ascii="Consolas" w:hAnsi="Consolas"/>
+                <w:sz w:val="13"/>
+              </w:rPr>
+              <w:t>salud</w:t>
+            </w:r>
+          </w:p>
+        </w:tc>
+        <w:tc>
+          <w:tcPr>
+            <w:tcW w:type="dxa" w:w="2296"/>
+          </w:tcPr>
+          <w:p>
+            <w:pPr>
+              <w:spacing w:after="40"/>
+              <w:jc w:val="left"/>
+            </w:pPr>
+            <w:r>
+              <w:rPr>
+                <w:sz w:val="16"/>
+              </w:rPr>
+              <w:t>Sesión, bitácora, cola de correo, archivos en Garage y chequeo de salud</w:t>
+            </w:r>
+          </w:p>
+        </w:tc>
+        <w:tc>
+          <w:tcPr>
+            <w:tcW w:type="dxa" w:w="2296"/>
+          </w:tcPr>
+          <w:p>
+            <w:pPr>
+              <w:spacing w:after="40"/>
+              <w:jc w:val="left"/>
+            </w:pPr>
+            <w:r>
+              <w:rPr>
+                <w:rFonts w:ascii="Consolas" w:hAnsi="Consolas"/>
+                <w:sz w:val="13"/>
+              </w:rPr>
+              <w:t>identidad</w:t>
+            </w:r>
+            <w:r>
+              <w:rPr>
+                <w:sz w:val="16"/>
+              </w:rPr>
+              <w:t xml:space="preserve">: </w:t>
+            </w:r>
+            <w:r>
+              <w:rPr>
+                <w:rFonts w:ascii="Consolas" w:hAnsi="Consolas"/>
+                <w:sz w:val="13"/>
+              </w:rPr>
+              <w:t>notificaciones</w:t>
+            </w:r>
+          </w:p>
+        </w:tc>
+      </w:tr>
+    </w:tbl>
+    <w:p>
+      <w:pPr>
+        <w:spacing w:after="40"/>
+      </w:pPr>
+    </w:p>
+    <w:p>
+      <w:r>
+        <w:t xml:space="preserve">El 30 de octubre comparamos el diagrama con los imports reales y faltaba una dependencia: solo estaba dibujada la de </w:t>
       </w:r>
       <w:r>
         <w:rPr>
@@ -147,17 +1238,7 @@
         <w:t>almacenamiento</w:t>
       </w:r>
       <w:r>
-        <w:t xml:space="preserve">. También dependen de </w:t>
-      </w:r>
-      <w:r>
-        <w:rPr>
-          <w:rFonts w:ascii="Consolas" w:hAnsi="Consolas"/>
-          <w:sz w:val="19"/>
-        </w:rPr>
-        <w:t>almacenamiento</w:t>
-      </w:r>
-      <w:r>
-        <w:t xml:space="preserve"> los módulos </w:t>
+        <w:t xml:space="preserve">, y también dependen de él </w:t>
       </w:r>
       <w:r>
         <w:rPr>
@@ -187,149 +1268,7 @@
         <w:t>importacion</w:t>
       </w:r>
       <w:r>
-        <w:t xml:space="preserve">, y ahora el diagrama lo dice con una etiqueta, como ya hacía con </w:t>
-      </w:r>
-      <w:r>
-        <w:rPr>
-          <w:rFonts w:ascii="Consolas" w:hAnsi="Consolas"/>
-          <w:sz w:val="19"/>
-        </w:rPr>
-        <w:t>identidad</w:t>
-      </w:r>
-      <w:r>
-        <w:t xml:space="preserve"> y </w:t>
-      </w:r>
-      <w:r>
-        <w:rPr>
-          <w:rFonts w:ascii="Consolas" w:hAnsi="Consolas"/>
-          <w:sz w:val="19"/>
-        </w:rPr>
-        <w:t>auditoria</w:t>
-      </w:r>
-      <w:r>
-        <w:t>.</w:t>
-      </w:r>
-    </w:p>
-    <w:p>
-      <w:pPr>
-        <w:keepNext/>
-        <w:spacing w:after="40"/>
-        <w:jc w:val="center"/>
-      </w:pPr>
-      <w:r>
-        <w:drawing>
-          <wp:inline xmlns:a="http://schemas.openxmlformats.org/drawingml/2006/main" xmlns:pic="http://schemas.openxmlformats.org/drawingml/2006/picture">
-            <wp:extent cx="5831840" cy="2688705"/>
-            <wp:docPr id="1" name="Picture 1"/>
-            <wp:cNvGraphicFramePr>
-              <a:graphicFrameLocks noChangeAspect="1"/>
-            </wp:cNvGraphicFramePr>
-            <a:graphic>
-              <a:graphicData uri="http://schemas.openxmlformats.org/drawingml/2006/picture">
-                <pic:pic>
-                  <pic:nvPicPr>
-                    <pic:cNvPr id="0" name="arquitectura-03-paquetes-del-monorepo.png"/>
-                    <pic:cNvPicPr/>
-                  </pic:nvPicPr>
-                  <pic:blipFill>
-                    <a:blip r:embed="rId27"/>
-                    <a:stretch>
-                      <a:fillRect/>
-                    </a:stretch>
-                  </pic:blipFill>
-                  <pic:spPr>
-                    <a:xfrm>
-                      <a:off x="0" y="0"/>
-                      <a:ext cx="5831840" cy="2688705"/>
-                    </a:xfrm>
-                    <a:prstGeom prst="rect"/>
-                  </pic:spPr>
-                </pic:pic>
-              </a:graphicData>
-            </a:graphic>
-          </wp:inline>
-        </w:drawing>
-      </w:r>
-    </w:p>
-    <w:p>
-      <w:pPr>
-        <w:jc w:val="center"/>
-      </w:pPr>
-      <w:r>
-        <w:rPr>
-          <w:b/>
-          <w:color w:val="57534E"/>
-          <w:sz w:val="18"/>
-        </w:rPr>
-        <w:t xml:space="preserve">Figura 1. </w:t>
-      </w:r>
-      <w:r>
-        <w:rPr>
-          <w:color w:val="57534E"/>
-          <w:sz w:val="18"/>
-        </w:rPr>
-        <w:t>Paquetes del monorepo: la web, la API y los paquetes compartidos.</w:t>
-      </w:r>
-    </w:p>
-    <w:p>
-      <w:pPr>
-        <w:keepNext/>
-        <w:spacing w:after="40"/>
-        <w:jc w:val="center"/>
-      </w:pPr>
-      <w:r>
-        <w:drawing>
-          <wp:inline xmlns:a="http://schemas.openxmlformats.org/drawingml/2006/main" xmlns:pic="http://schemas.openxmlformats.org/drawingml/2006/picture">
-            <wp:extent cx="5831840" cy="5349009"/>
-            <wp:docPr id="2" name="Picture 2"/>
-            <wp:cNvGraphicFramePr>
-              <a:graphicFrameLocks noChangeAspect="1"/>
-            </wp:cNvGraphicFramePr>
-            <a:graphic>
-              <a:graphicData uri="http://schemas.openxmlformats.org/drawingml/2006/picture">
-                <pic:pic>
-                  <pic:nvPicPr>
-                    <pic:cNvPr id="0" name="arquitectura-04-paquetes-de-la-api.png"/>
-                    <pic:cNvPicPr/>
-                  </pic:nvPicPr>
-                  <pic:blipFill>
-                    <a:blip r:embed="rId28"/>
-                    <a:stretch>
-                      <a:fillRect/>
-                    </a:stretch>
-                  </pic:blipFill>
-                  <pic:spPr>
-                    <a:xfrm>
-                      <a:off x="0" y="0"/>
-                      <a:ext cx="5831840" cy="5349009"/>
-                    </a:xfrm>
-                    <a:prstGeom prst="rect"/>
-                  </pic:spPr>
-                </pic:pic>
-              </a:graphicData>
-            </a:graphic>
-          </wp:inline>
-        </w:drawing>
-      </w:r>
-    </w:p>
-    <w:p>
-      <w:pPr>
-        <w:jc w:val="center"/>
-      </w:pPr>
-      <w:r>
-        <w:rPr>
-          <w:b/>
-          <w:color w:val="57534E"/>
-          <w:sz w:val="18"/>
-        </w:rPr>
-        <w:t xml:space="preserve">Figura 2. </w:t>
-      </w:r>
-      <w:r>
-        <w:rPr>
-          <w:color w:val="57534E"/>
-          <w:sz w:val="18"/>
-        </w:rPr>
-        <w:t>Paquetes de la API: los módulos de dominio arriba y los transversales abajo. Cada módulo importa solo a los de abajo.</w:t>
+        <w:t>. Ahora la etiqueta junto a esa flecha los nombra. La regla de capas no depende de que alguien la recuerde: dependency-cruiser la revisa en cada pull request y el CI falla si un módulo importa a uno que no tiene permitido.</w:t>
       </w:r>
     </w:p>
     <w:p>
@@ -348,7 +1287,7 @@
         <w:t>ADR-0023</w:t>
       </w:r>
       <w:r>
-        <w:t>, porque el número 0002 ya era otra decisión y los números no se reutilizan. El ADR-001 del curso es el ADR-0008 del repositorio.</w:t>
+        <w:t>: el número 0002 ya era otra decisión y los números no se reutilizan. El ADR-001 del curso es el ADR-0008 del repositorio.</w:t>
       </w:r>
     </w:p>
     <w:tbl>
@@ -442,7 +1381,7 @@
               <w:rPr>
                 <w:sz w:val="16"/>
               </w:rPr>
-              <w:t>Somos cuatro personas, cada una con módulos propios. La web y la API cambian juntas y usan las mismas fórmulas del motor. La bitácora se escribe en la misma transacción que cada cambio y el saldo sale de los movimientos, así que todo vive en una sola base. RNF-13 exige módulos sin dependencias circulares</w:t>
+              <w:t>Somos cuatro personas y cada una tiene módulos propios, así que la estructura de carpetas tenía que evitar que el cambio de una tocara archivos de otra. La web y la API cambian juntas y usan las mismas fórmulas del motor. La bitácora se escribe en la misma transacción que cada cambio y el saldo sale de los movimientos, lo que obliga a una sola base y un solo proceso. RNF-13 exige módulos sin dependencias circulares</w:t>
             </w:r>
           </w:p>
         </w:tc>
@@ -559,163 +1498,111 @@
               <w:rPr>
                 <w:sz w:val="16"/>
               </w:rPr>
-              <w:t xml:space="preserve">. La web solo habla con la API por HTTP y toma los tipos del contrato OpenAPI. En la API, un módulo por dominio, apilados en capas: </w:t>
+              <w:t>. La web solo habla con la API por HTTP y toma los tipos del contrato OpenAPI. En la API, un módulo por dominio, apilado en las cinco capas del diagrama. Un módulo importa a los de capas inferiores y, en dos casos, a uno de su misma capa (</w:t>
             </w:r>
             <w:r>
               <w:rPr>
                 <w:rFonts w:ascii="Consolas" w:hAnsi="Consolas"/>
                 <w:sz w:val="13"/>
               </w:rPr>
-              <w:t>importacion</w:t>
+              <w:t>comprobantes</w:t>
             </w:r>
             <w:r>
               <w:rPr>
                 <w:sz w:val="16"/>
               </w:rPr>
-              <w:t xml:space="preserve">; luego </w:t>
+              <w:t xml:space="preserve"> usa </w:t>
             </w:r>
             <w:r>
               <w:rPr>
                 <w:rFonts w:ascii="Consolas" w:hAnsi="Consolas"/>
                 <w:sz w:val="13"/>
               </w:rPr>
-              <w:t>motor</w:t>
+              <w:t>inventario</w:t>
             </w:r>
             <w:r>
               <w:rPr>
                 <w:sz w:val="16"/>
               </w:rPr>
-              <w:t xml:space="preserve"> y </w:t>
+              <w:t xml:space="preserve">; </w:t>
             </w:r>
             <w:r>
               <w:rPr>
                 <w:rFonts w:ascii="Consolas" w:hAnsi="Consolas"/>
                 <w:sz w:val="13"/>
               </w:rPr>
-              <w:t>turnos</w:t>
+              <w:t>identidad</w:t>
             </w:r>
             <w:r>
               <w:rPr>
                 <w:sz w:val="16"/>
               </w:rPr>
-              <w:t xml:space="preserve">; luego </w:t>
+              <w:t xml:space="preserve"> usa </w:t>
             </w:r>
             <w:r>
               <w:rPr>
                 <w:rFonts w:ascii="Consolas" w:hAnsi="Consolas"/>
                 <w:sz w:val="13"/>
               </w:rPr>
-              <w:t>comprobantes</w:t>
+              <w:t>auditoria</w:t>
             </w:r>
             <w:r>
               <w:rPr>
                 <w:sz w:val="16"/>
               </w:rPr>
-              <w:t xml:space="preserve"> e </w:t>
+              <w:t xml:space="preserve"> y </w:t>
             </w:r>
             <w:r>
               <w:rPr>
                 <w:rFonts w:ascii="Consolas" w:hAnsi="Consolas"/>
                 <w:sz w:val="13"/>
               </w:rPr>
-              <w:t>inventario</w:t>
+              <w:t>notificaciones</w:t>
             </w:r>
             <w:r>
               <w:rPr>
                 <w:sz w:val="16"/>
               </w:rPr>
-              <w:t xml:space="preserve">; luego </w:t>
+              <w:t xml:space="preserve">). Ninguno importa hacia arriba, y dependency-cruiser lo revisa en CI. Cuando un módulo de abajo necesita algo de uno de arriba, declara un puerto en </w:t>
             </w:r>
             <w:r>
               <w:rPr>
                 <w:rFonts w:ascii="Consolas" w:hAnsi="Consolas"/>
                 <w:sz w:val="13"/>
               </w:rPr>
-              <w:t>acopios</w:t>
+              <w:t>comun/</w:t>
             </w:r>
             <w:r>
               <w:rPr>
                 <w:sz w:val="16"/>
               </w:rPr>
-              <w:t xml:space="preserve"> y </w:t>
+              <w:t xml:space="preserve"> y el de arriba lo implementa (</w:t>
             </w:r>
             <w:r>
               <w:rPr>
                 <w:rFonts w:ascii="Consolas" w:hAnsi="Consolas"/>
                 <w:sz w:val="13"/>
               </w:rPr>
-              <w:t>catalogo</w:t>
+              <w:t>VerificadorUbicaciones</w:t>
             </w:r>
             <w:r>
               <w:rPr>
                 <w:sz w:val="16"/>
               </w:rPr>
-              <w:t>; y abajo los transversales (</w:t>
+              <w:t xml:space="preserve">, </w:t>
             </w:r>
             <w:r>
               <w:rPr>
                 <w:rFonts w:ascii="Consolas" w:hAnsi="Consolas"/>
                 <w:sz w:val="13"/>
               </w:rPr>
-              <w:t>identidad</w:t>
+              <w:t>ProveedorIdentidad</w:t>
             </w:r>
             <w:r>
               <w:rPr>
                 <w:sz w:val="16"/>
               </w:rPr>
-              <w:t xml:space="preserve">, </w:t>
-            </w:r>
-            <w:r>
-              <w:rPr>
-                <w:rFonts w:ascii="Consolas" w:hAnsi="Consolas"/>
-                <w:sz w:val="13"/>
-              </w:rPr>
-              <w:t>auditoria</w:t>
-            </w:r>
-            <w:r>
-              <w:rPr>
-                <w:sz w:val="16"/>
-              </w:rPr>
-              <w:t xml:space="preserve">, </w:t>
-            </w:r>
-            <w:r>
-              <w:rPr>
-                <w:rFonts w:ascii="Consolas" w:hAnsi="Consolas"/>
-                <w:sz w:val="13"/>
-              </w:rPr>
-              <w:t>notificaciones</w:t>
-            </w:r>
-            <w:r>
-              <w:rPr>
-                <w:sz w:val="16"/>
-              </w:rPr>
-              <w:t xml:space="preserve">, </w:t>
-            </w:r>
-            <w:r>
-              <w:rPr>
-                <w:rFonts w:ascii="Consolas" w:hAnsi="Consolas"/>
-                <w:sz w:val="13"/>
-              </w:rPr>
-              <w:t>almacenamiento</w:t>
-            </w:r>
-            <w:r>
-              <w:rPr>
-                <w:sz w:val="16"/>
-              </w:rPr>
-              <w:t xml:space="preserve">, </w:t>
-            </w:r>
-            <w:r>
-              <w:rPr>
-                <w:rFonts w:ascii="Consolas" w:hAnsi="Consolas"/>
-                <w:sz w:val="13"/>
-              </w:rPr>
-              <w:t>salud</w:t>
-            </w:r>
-            <w:r>
-              <w:rPr>
-                <w:sz w:val="16"/>
-              </w:rPr>
-              <w:t>). Cada módulo importa solo a los de abajo, y dependency-cruiser lo revisa en CI</w:t>
+              <w:t>)</w:t>
             </w:r>
           </w:p>
         </w:tc>
@@ -754,7 +1641,7 @@
               <w:rPr>
                 <w:sz w:val="16"/>
               </w:rPr>
-              <w:t>Organizar por capas técnicas, con carpetas globales de controladores, servicios y repositorios. También separar la web y la API en dos repositorios</w:t>
+              <w:t>Organizar por capas técnicas, con carpetas globales de controladores, servicios y repositorios, donde cualquier servicio puede llamar a cualquier otro. También separar la web y la API en dos repositorios</w:t>
             </w:r>
           </w:p>
         </w:tc>
@@ -793,7 +1680,20 @@
               <w:rPr>
                 <w:sz w:val="16"/>
               </w:rPr>
-              <w:t>Cada módulo es un límite del dominio y casi siempre lo que una persona tiene asignado. La regla de dependencias la revisa una herramienta en cada PR. Las fórmulas se escriben una sola vez y la web muestra el mismo número que calcula la API. Por capas técnicas, las cuatro personas tocarían las mismas carpetas y nada impediría que el motor leyera tablas ajenas</w:t>
+              <w:t xml:space="preserve">Cada módulo es un límite del dominio y casi siempre lo que una persona tiene asignado. La regla de dependencias la revisa una herramienta en cada PR. Las fórmulas se escriben una sola vez. Con capas técnicas, las cuatro personas tocarían las mismas carpetas y nada impediría que el motor leyera tablas de otro módulo. Con dos repositorios, un cambio de endpoint necesitaría dos PR coordinados y </w:t>
+            </w:r>
+            <w:r>
+              <w:rPr>
+                <w:rFonts w:ascii="Consolas" w:hAnsi="Consolas"/>
+                <w:sz w:val="13"/>
+              </w:rPr>
+              <w:t>packages/shared</w:t>
+            </w:r>
+            <w:r>
+              <w:rPr>
+                <w:sz w:val="16"/>
+              </w:rPr>
+              <w:t xml:space="preserve"> tendría que publicarse como paquete</w:t>
             </w:r>
           </w:p>
         </w:tc>
@@ -832,59 +1732,20 @@
               <w:rPr>
                 <w:sz w:val="16"/>
               </w:rPr>
-              <w:t xml:space="preserve">Facilita ubicar un cambio, medir su impacto y cambiar la web y la API en el mismo PR. Limita las llamadas hacia arriba: cuando hacen falta, se resuelven con un puerto en </w:t>
+              <w:t xml:space="preserve">Facilita ubicar un cambio, medir qué afecta y cambiar la web y la API en el mismo PR. Limita las llamadas hacia arriba, que necesitan un puerto, y deja todo en un proceso: el motor no se puede escalar aparte. Puede requerir ajustes: </w:t>
             </w:r>
             <w:r>
               <w:rPr>
                 <w:rFonts w:ascii="Consolas" w:hAnsi="Consolas"/>
                 <w:sz w:val="13"/>
               </w:rPr>
-              <w:t>comun/</w:t>
+              <w:t>motor</w:t>
             </w:r>
             <w:r>
               <w:rPr>
                 <w:sz w:val="16"/>
               </w:rPr>
-              <w:t xml:space="preserve"> (</w:t>
-            </w:r>
-            <w:r>
-              <w:rPr>
-                <w:rFonts w:ascii="Consolas" w:hAnsi="Consolas"/>
-                <w:sz w:val="13"/>
-              </w:rPr>
-              <w:t>VerificadorUbicaciones</w:t>
-            </w:r>
-            <w:r>
-              <w:rPr>
-                <w:sz w:val="16"/>
-              </w:rPr>
-              <w:t xml:space="preserve">, </w:t>
-            </w:r>
-            <w:r>
-              <w:rPr>
-                <w:rFonts w:ascii="Consolas" w:hAnsi="Consolas"/>
-                <w:sz w:val="13"/>
-              </w:rPr>
-              <w:t>ProveedorIdentidad</w:t>
-            </w:r>
-            <w:r>
-              <w:rPr>
-                <w:sz w:val="16"/>
-              </w:rPr>
-              <w:t xml:space="preserve">). Todo corre en un proceso. Puede requerir ajustes: </w:t>
-            </w:r>
-            <w:r>
-              <w:rPr>
-                <w:rFonts w:ascii="Consolas" w:hAnsi="Consolas"/>
-                <w:sz w:val="13"/>
-              </w:rPr>
-              <w:t>motor</w:t>
-            </w:r>
-            <w:r>
-              <w:rPr>
-                <w:sz w:val="16"/>
-              </w:rPr>
-              <w:t xml:space="preserve"> ya depende de siete módulos y convendría partirlo si sigue creciendo, y la cola de correo solo es segura con una instancia de la API</w:t>
+              <w:t xml:space="preserve"> ya depende de siete módulos y convendría partirlo si sigue creciendo, y la cola de correo solo es segura con una instancia de la API (P-089)</w:t>
             </w:r>
           </w:p>
         </w:tc>
@@ -905,68 +1766,15 @@
     </w:p>
     <w:p>
       <w:pPr>
-        <w:keepNext/>
-        <w:spacing w:after="40"/>
-        <w:jc w:val="center"/>
+        <w:pStyle w:val="Ttulo2"/>
       </w:pPr>
       <w:r>
-        <w:drawing>
-          <wp:inline xmlns:a="http://schemas.openxmlformats.org/drawingml/2006/main" xmlns:pic="http://schemas.openxmlformats.org/drawingml/2006/picture">
-            <wp:extent cx="5831840" cy="4524703"/>
-            <wp:docPr id="3" name="Picture 3"/>
-            <wp:cNvGraphicFramePr>
-              <a:graphicFrameLocks noChangeAspect="1"/>
-            </wp:cNvGraphicFramePr>
-            <a:graphic>
-              <a:graphicData uri="http://schemas.openxmlformats.org/drawingml/2006/picture">
-                <pic:pic>
-                  <pic:nvPicPr>
-                    <pic:cNvPr id="0" name="comportamiento-01-ciclo-de-vida-de-la-donacion.png"/>
-                    <pic:cNvPicPr/>
-                  </pic:nvPicPr>
-                  <pic:blipFill>
-                    <a:blip r:embed="rId29"/>
-                    <a:stretch>
-                      <a:fillRect/>
-                    </a:stretch>
-                  </pic:blipFill>
-                  <pic:spPr>
-                    <a:xfrm>
-                      <a:off x="0" y="0"/>
-                      <a:ext cx="5831840" cy="4524703"/>
-                    </a:xfrm>
-                    <a:prstGeom prst="rect"/>
-                  </pic:spPr>
-                </pic:pic>
-              </a:graphicData>
-            </a:graphic>
-          </wp:inline>
-        </w:drawing>
-      </w:r>
-    </w:p>
-    <w:p>
-      <w:pPr>
-        <w:jc w:val="center"/>
-      </w:pPr>
-      <w:r>
-        <w:rPr>
-          <w:b/>
-          <w:color w:val="57534E"/>
-          <w:sz w:val="18"/>
-        </w:rPr>
-        <w:t xml:space="preserve">Figura 3. </w:t>
-      </w:r>
-      <w:r>
-        <w:rPr>
-          <w:color w:val="57534E"/>
-          <w:sz w:val="18"/>
-        </w:rPr>
-        <w:t>Ciclo de vida de una donación: PREPARADO, PENDIENTE, CONCILIADO, RECHAZADO y CANCELADO, con el evento, la guarda y el actor de cada transición.</w:t>
+        <w:t>2a. Qué representa y por qué un diagrama de estados</w:t>
       </w:r>
     </w:p>
     <w:p>
       <w:r>
-        <w:t xml:space="preserve">El diagrama sigue a una donación (tabla </w:t>
+        <w:t xml:space="preserve">El diagrama sigue el ciclo de vida de una donación (tabla </w:t>
       </w:r>
       <w:r>
         <w:rPr>
@@ -986,22 +1794,1341 @@
         <w:t>EstadoComprobante</w:t>
       </w:r>
       <w:r>
-        <w:t>) desde que el Donador la prepara en el portal hasta que un Auditor la concilia contra las entradas de inventario o la rechaza. Corresponde a la historia HU-006 («Comprobar que mi donación llegó») y a los requerimientos RF-CMP-001B (preparar), RF-CMP-001C (recibir), RF-CMP-004 (conciliar), RF-CMP-005 (rechazar) y RF-CMP-006 (seguimiento por folio). Las guardas son reglas de negocio que la API hace cumplir: un Donador tiene como máximo cinco donaciones preparadas, una preparada vence a los siete días, solo el Operador asignado al acopio la recibe y nadie concilia sin una entrada vinculada. Elegimos un diagrama de estados porque en la donación intervienen cuatro actores (Donador, Operador, Auditor y una tarea programada), y lo que cada uno puede hacer depende del estado en que la encuentra. En un diagrama de actividades esas reglas quedarían repartidas entre carriles, y costaría ver que un rechazo se puede revertir y una conciliación no.</w:t>
+        <w:t>): desde que el Donador la prepara en el portal hasta que un Auditor la concilia contra las entradas de inventario, la rechaza, o hasta que se cancela. Corresponde a la historia HU-006 («Comprobar que mi donación llegó») y a los requerimientos RF-CMP-001B (preparar una donación), RF-CMP-001C (confirmar la recepción física), RF-CMP-004 (conciliar), RF-CMP-005 (rechazar) y RF-CMP-006 (seguimiento por folio).</w:t>
       </w:r>
     </w:p>
     <w:p>
       <w:r>
-        <w:t xml:space="preserve">El modelo corresponde a lo implementado. Cada transición tiene un método del módulo </w:t>
+        <w:t>Elegimos un diagrama de estados porque en la donación intervienen cuatro actores (Donador, Operador, Auditor y una tarea programada) y lo que cada uno puede hacer depende del estado en que la encuentra. Un diagrama de actividades habría repartido esas reglas entre carriles y no dejaría ver de un vistazo, por ejemplo, que un rechazo se puede revertir y una conciliación no.</w:t>
+      </w:r>
+    </w:p>
+    <w:p>
+      <w:pPr>
+        <w:sectPr>
+          <w:pgSz w:w="11906" w:h="16838"/>
+          <w:pgMar w:top="1247" w:right="1361" w:bottom="1134" w:left="1361" w:header="720" w:footer="720" w:gutter="0"/>
+          <w:cols w:space="720"/>
+          <w:docGrid w:linePitch="360"/>
+        </w:sectPr>
+      </w:pPr>
+    </w:p>
+    <w:p>
+      <w:pPr>
+        <w:keepNext/>
+        <w:spacing w:after="40"/>
+        <w:jc w:val="center"/>
+      </w:pPr>
+      <w:r>
+        <w:drawing>
+          <wp:inline xmlns:a="http://schemas.openxmlformats.org/drawingml/2006/main" xmlns:pic="http://schemas.openxmlformats.org/drawingml/2006/picture">
+            <wp:extent cx="8297570" cy="4896375"/>
+            <wp:docPr id="3" name="Picture 3"/>
+            <wp:cNvGraphicFramePr>
+              <a:graphicFrameLocks noChangeAspect="1"/>
+            </wp:cNvGraphicFramePr>
+            <a:graphic>
+              <a:graphicData uri="http://schemas.openxmlformats.org/drawingml/2006/picture">
+                <pic:pic>
+                  <pic:nvPicPr>
+                    <pic:cNvPr id="0" name="comportamiento-01-estados-de-la-donacion.png"/>
+                    <pic:cNvPicPr/>
+                  </pic:nvPicPr>
+                  <pic:blipFill>
+                    <a:blip r:embed="rId29"/>
+                    <a:stretch>
+                      <a:fillRect/>
+                    </a:stretch>
+                  </pic:blipFill>
+                  <pic:spPr>
+                    <a:xfrm>
+                      <a:off x="0" y="0"/>
+                      <a:ext cx="8297570" cy="4896375"/>
+                    </a:xfrm>
+                    <a:prstGeom prst="rect"/>
+                  </pic:spPr>
+                </pic:pic>
+              </a:graphicData>
+            </a:graphic>
+          </wp:inline>
+        </w:drawing>
+      </w:r>
+    </w:p>
+    <w:p>
+      <w:pPr>
+        <w:jc w:val="center"/>
+      </w:pPr>
+      <w:r>
+        <w:rPr>
+          <w:b/>
+          <w:color w:val="57534E"/>
+          <w:sz w:val="18"/>
+        </w:rPr>
+        <w:t xml:space="preserve">Figura 3. </w:t>
+      </w:r>
+      <w:r>
+        <w:rPr>
+          <w:color w:val="57534E"/>
+          <w:sz w:val="18"/>
+        </w:rPr>
+        <w:t>Estados de la donación: PREPARADO, PENDIENTE, CONCILIADO, RECHAZADO y CANCELADO, con nueve transiciones numeradas y coloreadas según quién las dispara.</w:t>
+      </w:r>
+    </w:p>
+    <w:p>
+      <w:pPr>
+        <w:sectPr>
+          <w:pgSz w:w="16838" w:h="11906" w:orient="landscape"/>
+          <w:pgMar w:top="1247" w:right="1361" w:bottom="1134" w:left="1361" w:header="720" w:footer="720" w:gutter="0"/>
+          <w:cols w:space="720"/>
+          <w:docGrid w:linePitch="360"/>
+        </w:sectPr>
+      </w:pPr>
+    </w:p>
+    <w:p>
+      <w:pPr>
+        <w:pStyle w:val="Ttulo2"/>
+      </w:pPr>
+      <w:r>
+        <w:t>2b. Cómo leerlo</w:t>
+      </w:r>
+    </w:p>
+    <w:p>
+      <w:pPr>
+        <w:pStyle w:val="Vineta"/>
+      </w:pPr>
+      <w:r>
+        <w:t xml:space="preserve">•  </w:t>
+      </w:r>
+      <w:r>
+        <w:t>Cada caja es un estado; la frase debajo del nombre dice qué significa para la persona que donó. Las cajas grises de borde grueso (CONCILIADO y CANCELADO) son estados finales: de ahí la donación no sale.</w:t>
+      </w:r>
+    </w:p>
+    <w:p>
+      <w:pPr>
+        <w:pStyle w:val="Vineta"/>
+      </w:pPr>
+      <w:r>
+        <w:t xml:space="preserve">•  </w:t>
+      </w:r>
+      <w:r>
+        <w:t>El color de la flecha dice quién dispara el cambio: verde azulado el Donador, ocre el Operador del acopio, índigo el Auditor (o el Admin) y gris punteado la tarea programada, que corre sin que nadie la pida.</w:t>
+      </w:r>
+    </w:p>
+    <w:p>
+      <w:pPr>
+        <w:pStyle w:val="Vineta"/>
+      </w:pPr>
+      <w:r>
+        <w:t xml:space="preserve">•  </w:t>
+      </w:r>
+      <w:r>
+        <w:t>Cada etiqueta sigue la notación UML: primero el evento, entre corchetes la guarda (la condición que la API exige) y después de la barra el efecto que deja la transición.</w:t>
+      </w:r>
+    </w:p>
+    <w:p>
+      <w:pPr>
+        <w:pStyle w:val="Vineta"/>
+      </w:pPr>
+      <w:r>
+        <w:t xml:space="preserve">•  </w:t>
+      </w:r>
+      <w:r>
+        <w:t>Los números del 1 al 9 son los mismos de la tabla de abajo, que dice qué método del código implementa cada flecha.</w:t>
+      </w:r>
+    </w:p>
+    <w:p>
+      <w:pPr>
+        <w:pStyle w:val="Ttulo2"/>
+      </w:pPr>
+      <w:r>
+        <w:t>2c. Recorridos</w:t>
+      </w:r>
+    </w:p>
+    <w:p>
+      <w:r>
+        <w:t>El recorrido normal es 1 → 2 → 5. El Donador prepara la donación y recibe un folio con su QR. La lleva al acopio, donde el Operador escanea el folio, confirma cada línea y la API registra una entrada de inventario por línea (2). Luego el Auditor revisa que lo recibido cuadre con esas entradas y la concilia (5).</w:t>
+      </w:r>
+    </w:p>
+    <w:p>
+      <w:r>
+        <w:t>Los otros caminos cubren lo que pasa en la práctica:</w:t>
+      </w:r>
+    </w:p>
+    <w:p>
+      <w:pPr>
+        <w:pStyle w:val="Vineta"/>
+      </w:pPr>
+      <w:r>
+        <w:t xml:space="preserve">•  </w:t>
+      </w:r>
+      <w:r>
+        <w:t>La donación llegó, pero las entradas se registraron sin escanear el folio. El Auditor las vincula después (3), y puede seguir vinculando más mientras esté PENDIENTE (4).</w:t>
+      </w:r>
+    </w:p>
+    <w:p>
+      <w:pPr>
+        <w:pStyle w:val="Vineta"/>
+      </w:pPr>
+      <w:r>
+        <w:t xml:space="preserve">•  </w:t>
+      </w:r>
+      <w:r>
+        <w:t>Lo recibido no cuadra. El Auditor la rechaza con un motivo y el Donador recibe un correo por la cola de la sección 3 (6). Si el rechazo fue un error, el Auditor lo revierte (7).</w:t>
+      </w:r>
+    </w:p>
+    <w:p>
+      <w:pPr>
+        <w:pStyle w:val="Vineta"/>
+      </w:pPr>
+      <w:r>
+        <w:t xml:space="preserve">•  </w:t>
+      </w:r>
+      <w:r>
+        <w:t>La donación nunca llegó. El Donador la cancela (8) o, si pasan siete días sin entregarla, la tarea diaria de las 00:15 la cancela sola (9).</w:t>
+      </w:r>
+    </w:p>
+    <w:tbl>
+      <w:tblPr>
+        <w:tblStyle w:val="Tablaconcuadrcula"/>
+        <w:tblW w:type="auto" w:w="0"/>
+        <w:jc w:val="center"/>
+        <w:tblLook w:firstColumn="1" w:firstRow="1" w:lastColumn="0" w:lastRow="0" w:noHBand="0" w:noVBand="1" w:val="04A0"/>
+      </w:tblPr>
+      <w:tblGrid>
+        <w:gridCol w:w="1837"/>
+        <w:gridCol w:w="1837"/>
+        <w:gridCol w:w="1837"/>
+        <w:gridCol w:w="1837"/>
+        <w:gridCol w:w="1837"/>
+      </w:tblGrid>
+      <w:tr>
+        <w:trPr>
+          <w:cantSplit w:val="true"/>
+          <w:tblHeader w:val="true"/>
+        </w:trPr>
+        <w:tc>
+          <w:tcPr>
+            <w:tcW w:type="dxa" w:w="1837"/>
+            <w:shd w:val="clear" w:color="auto" w:fill="0F6E6E"/>
+          </w:tcPr>
+          <w:p>
+            <w:pPr>
+              <w:spacing w:after="40"/>
+              <w:jc w:val="left"/>
+            </w:pPr>
+            <w:r>
+              <w:rPr>
+                <w:b/>
+                <w:color w:val="FFFFFF"/>
+                <w:sz w:val="16"/>
+              </w:rPr>
+              <w:t>#</w:t>
+            </w:r>
+          </w:p>
+        </w:tc>
+        <w:tc>
+          <w:tcPr>
+            <w:tcW w:type="dxa" w:w="1837"/>
+            <w:shd w:val="clear" w:color="auto" w:fill="0F6E6E"/>
+          </w:tcPr>
+          <w:p>
+            <w:pPr>
+              <w:spacing w:after="40"/>
+              <w:jc w:val="left"/>
+            </w:pPr>
+            <w:r>
+              <w:rPr>
+                <w:b/>
+                <w:color w:val="FFFFFF"/>
+                <w:sz w:val="16"/>
+              </w:rPr>
+              <w:t>Transición</w:t>
+            </w:r>
+          </w:p>
+        </w:tc>
+        <w:tc>
+          <w:tcPr>
+            <w:tcW w:type="dxa" w:w="1837"/>
+            <w:shd w:val="clear" w:color="auto" w:fill="0F6E6E"/>
+          </w:tcPr>
+          <w:p>
+            <w:pPr>
+              <w:spacing w:after="40"/>
+              <w:jc w:val="left"/>
+            </w:pPr>
+            <w:r>
+              <w:rPr>
+                <w:b/>
+                <w:color w:val="FFFFFF"/>
+                <w:sz w:val="16"/>
+              </w:rPr>
+              <w:t>Quién</w:t>
+            </w:r>
+          </w:p>
+        </w:tc>
+        <w:tc>
+          <w:tcPr>
+            <w:tcW w:type="dxa" w:w="1837"/>
+            <w:shd w:val="clear" w:color="auto" w:fill="0F6E6E"/>
+          </w:tcPr>
+          <w:p>
+            <w:pPr>
+              <w:spacing w:after="40"/>
+              <w:jc w:val="left"/>
+            </w:pPr>
+            <w:r>
+              <w:rPr>
+                <w:b/>
+                <w:color w:val="FFFFFF"/>
+                <w:sz w:val="16"/>
+              </w:rPr>
+              <w:t>Guarda que exige la API</w:t>
+            </w:r>
+          </w:p>
+        </w:tc>
+        <w:tc>
+          <w:tcPr>
+            <w:tcW w:type="dxa" w:w="1837"/>
+            <w:shd w:val="clear" w:color="auto" w:fill="0F6E6E"/>
+          </w:tcPr>
+          <w:p>
+            <w:pPr>
+              <w:spacing w:after="40"/>
+              <w:jc w:val="left"/>
+            </w:pPr>
+            <w:r>
+              <w:rPr>
+                <w:b/>
+                <w:color w:val="FFFFFF"/>
+                <w:sz w:val="16"/>
+              </w:rPr>
+              <w:t>Método</w:t>
+            </w:r>
+          </w:p>
+        </w:tc>
+      </w:tr>
+      <w:tr>
+        <w:trPr>
+          <w:cantSplit w:val="true"/>
+        </w:trPr>
+        <w:tc>
+          <w:tcPr>
+            <w:tcW w:type="dxa" w:w="1837"/>
+          </w:tcPr>
+          <w:p>
+            <w:pPr>
+              <w:spacing w:after="40"/>
+              <w:jc w:val="left"/>
+            </w:pPr>
+            <w:r>
+              <w:rPr>
+                <w:sz w:val="16"/>
+              </w:rPr>
+              <w:t>1</w:t>
+            </w:r>
+          </w:p>
+        </w:tc>
+        <w:tc>
+          <w:tcPr>
+            <w:tcW w:type="dxa" w:w="1837"/>
+          </w:tcPr>
+          <w:p>
+            <w:pPr>
+              <w:spacing w:after="40"/>
+              <w:jc w:val="left"/>
+            </w:pPr>
+            <w:r>
+              <w:rPr>
+                <w:sz w:val="16"/>
+              </w:rPr>
+              <w:t>inicio → PREPARADO</w:t>
+            </w:r>
+          </w:p>
+        </w:tc>
+        <w:tc>
+          <w:tcPr>
+            <w:tcW w:type="dxa" w:w="1837"/>
+          </w:tcPr>
+          <w:p>
+            <w:pPr>
+              <w:spacing w:after="40"/>
+              <w:jc w:val="left"/>
+            </w:pPr>
+            <w:r>
+              <w:rPr>
+                <w:sz w:val="16"/>
+              </w:rPr>
+              <w:t>Donador</w:t>
+            </w:r>
+          </w:p>
+        </w:tc>
+        <w:tc>
+          <w:tcPr>
+            <w:tcW w:type="dxa" w:w="1837"/>
+          </w:tcPr>
+          <w:p>
+            <w:pPr>
+              <w:spacing w:after="40"/>
+              <w:jc w:val="left"/>
+            </w:pPr>
+            <w:r>
+              <w:rPr>
+                <w:sz w:val="16"/>
+              </w:rPr>
+              <w:t>El acopio está abierto y el Donador tiene menos de 5 donaciones preparadas</w:t>
+            </w:r>
+          </w:p>
+        </w:tc>
+        <w:tc>
+          <w:tcPr>
+            <w:tcW w:type="dxa" w:w="1837"/>
+          </w:tcPr>
+          <w:p>
+            <w:pPr>
+              <w:spacing w:after="40"/>
+              <w:jc w:val="left"/>
+            </w:pPr>
+            <w:r>
+              <w:rPr>
+                <w:rFonts w:ascii="Consolas" w:hAnsi="Consolas"/>
+                <w:sz w:val="13"/>
+              </w:rPr>
+              <w:t>DonacionesService.crear</w:t>
+            </w:r>
+          </w:p>
+        </w:tc>
+      </w:tr>
+      <w:tr>
+        <w:trPr>
+          <w:cantSplit w:val="true"/>
+        </w:trPr>
+        <w:tc>
+          <w:tcPr>
+            <w:tcW w:type="dxa" w:w="1837"/>
+          </w:tcPr>
+          <w:p>
+            <w:pPr>
+              <w:spacing w:after="40"/>
+              <w:jc w:val="left"/>
+            </w:pPr>
+            <w:r>
+              <w:rPr>
+                <w:sz w:val="16"/>
+              </w:rPr>
+              <w:t>2</w:t>
+            </w:r>
+          </w:p>
+        </w:tc>
+        <w:tc>
+          <w:tcPr>
+            <w:tcW w:type="dxa" w:w="1837"/>
+          </w:tcPr>
+          <w:p>
+            <w:pPr>
+              <w:spacing w:after="40"/>
+              <w:jc w:val="left"/>
+            </w:pPr>
+            <w:r>
+              <w:rPr>
+                <w:sz w:val="16"/>
+              </w:rPr>
+              <w:t>PREPARADO → PENDIENTE</w:t>
+            </w:r>
+          </w:p>
+        </w:tc>
+        <w:tc>
+          <w:tcPr>
+            <w:tcW w:type="dxa" w:w="1837"/>
+          </w:tcPr>
+          <w:p>
+            <w:pPr>
+              <w:spacing w:after="40"/>
+              <w:jc w:val="left"/>
+            </w:pPr>
+            <w:r>
+              <w:rPr>
+                <w:sz w:val="16"/>
+              </w:rPr>
+              <w:t>Operador</w:t>
+            </w:r>
+          </w:p>
+        </w:tc>
+        <w:tc>
+          <w:tcPr>
+            <w:tcW w:type="dxa" w:w="1837"/>
+          </w:tcPr>
+          <w:p>
+            <w:pPr>
+              <w:spacing w:after="40"/>
+              <w:jc w:val="left"/>
+            </w:pPr>
+            <w:r>
+              <w:rPr>
+                <w:sz w:val="16"/>
+              </w:rPr>
+              <w:t>Tiene asignado ese acopio y confirma cada línea una vez</w:t>
+            </w:r>
+          </w:p>
+        </w:tc>
+        <w:tc>
+          <w:tcPr>
+            <w:tcW w:type="dxa" w:w="1837"/>
+          </w:tcPr>
+          <w:p>
+            <w:pPr>
+              <w:spacing w:after="40"/>
+              <w:jc w:val="left"/>
+            </w:pPr>
+            <w:r>
+              <w:rPr>
+                <w:rFonts w:ascii="Consolas" w:hAnsi="Consolas"/>
+                <w:sz w:val="13"/>
+              </w:rPr>
+              <w:t>RecepcionService.recibir</w:t>
+            </w:r>
+          </w:p>
+        </w:tc>
+      </w:tr>
+      <w:tr>
+        <w:trPr>
+          <w:cantSplit w:val="true"/>
+        </w:trPr>
+        <w:tc>
+          <w:tcPr>
+            <w:tcW w:type="dxa" w:w="1837"/>
+          </w:tcPr>
+          <w:p>
+            <w:pPr>
+              <w:spacing w:after="40"/>
+              <w:jc w:val="left"/>
+            </w:pPr>
+            <w:r>
+              <w:rPr>
+                <w:sz w:val="16"/>
+              </w:rPr>
+              <w:t>3</w:t>
+            </w:r>
+          </w:p>
+        </w:tc>
+        <w:tc>
+          <w:tcPr>
+            <w:tcW w:type="dxa" w:w="1837"/>
+          </w:tcPr>
+          <w:p>
+            <w:pPr>
+              <w:spacing w:after="40"/>
+              <w:jc w:val="left"/>
+            </w:pPr>
+            <w:r>
+              <w:rPr>
+                <w:sz w:val="16"/>
+              </w:rPr>
+              <w:t>PREPARADO → PENDIENTE</w:t>
+            </w:r>
+          </w:p>
+        </w:tc>
+        <w:tc>
+          <w:tcPr>
+            <w:tcW w:type="dxa" w:w="1837"/>
+          </w:tcPr>
+          <w:p>
+            <w:pPr>
+              <w:spacing w:after="40"/>
+              <w:jc w:val="left"/>
+            </w:pPr>
+            <w:r>
+              <w:rPr>
+                <w:sz w:val="16"/>
+              </w:rPr>
+              <w:t>Auditor o Admin</w:t>
+            </w:r>
+          </w:p>
+        </w:tc>
+        <w:tc>
+          <w:tcPr>
+            <w:tcW w:type="dxa" w:w="1837"/>
+          </w:tcPr>
+          <w:p>
+            <w:pPr>
+              <w:spacing w:after="40"/>
+              <w:jc w:val="left"/>
+            </w:pPr>
+            <w:r>
+              <w:rPr>
+                <w:sz w:val="16"/>
+              </w:rPr>
+              <w:t>Las entradas son del mismo acopio y no pertenecen a otra donación</w:t>
+            </w:r>
+          </w:p>
+        </w:tc>
+        <w:tc>
+          <w:tcPr>
+            <w:tcW w:type="dxa" w:w="1837"/>
+          </w:tcPr>
+          <w:p>
+            <w:pPr>
+              <w:spacing w:after="40"/>
+              <w:jc w:val="left"/>
+            </w:pPr>
+            <w:r>
+              <w:rPr>
+                <w:rFonts w:ascii="Consolas" w:hAnsi="Consolas"/>
+                <w:sz w:val="13"/>
+              </w:rPr>
+              <w:t>ConciliacionService.vincular</w:t>
+            </w:r>
+          </w:p>
+        </w:tc>
+      </w:tr>
+      <w:tr>
+        <w:trPr>
+          <w:cantSplit w:val="true"/>
+        </w:trPr>
+        <w:tc>
+          <w:tcPr>
+            <w:tcW w:type="dxa" w:w="1837"/>
+          </w:tcPr>
+          <w:p>
+            <w:pPr>
+              <w:spacing w:after="40"/>
+              <w:jc w:val="left"/>
+            </w:pPr>
+            <w:r>
+              <w:rPr>
+                <w:sz w:val="16"/>
+              </w:rPr>
+              <w:t>4</w:t>
+            </w:r>
+          </w:p>
+        </w:tc>
+        <w:tc>
+          <w:tcPr>
+            <w:tcW w:type="dxa" w:w="1837"/>
+          </w:tcPr>
+          <w:p>
+            <w:pPr>
+              <w:spacing w:after="40"/>
+              <w:jc w:val="left"/>
+            </w:pPr>
+            <w:r>
+              <w:rPr>
+                <w:sz w:val="16"/>
+              </w:rPr>
+              <w:t>PENDIENTE → PENDIENTE</w:t>
+            </w:r>
+          </w:p>
+        </w:tc>
+        <w:tc>
+          <w:tcPr>
+            <w:tcW w:type="dxa" w:w="1837"/>
+          </w:tcPr>
+          <w:p>
+            <w:pPr>
+              <w:spacing w:after="40"/>
+              <w:jc w:val="left"/>
+            </w:pPr>
+            <w:r>
+              <w:rPr>
+                <w:sz w:val="16"/>
+              </w:rPr>
+              <w:t>Auditor o Admin</w:t>
+            </w:r>
+          </w:p>
+        </w:tc>
+        <w:tc>
+          <w:tcPr>
+            <w:tcW w:type="dxa" w:w="1837"/>
+          </w:tcPr>
+          <w:p>
+            <w:pPr>
+              <w:spacing w:after="40"/>
+              <w:jc w:val="left"/>
+            </w:pPr>
+            <w:r>
+              <w:rPr>
+                <w:sz w:val="16"/>
+              </w:rPr>
+              <w:t>Igual que 3</w:t>
+            </w:r>
+          </w:p>
+        </w:tc>
+        <w:tc>
+          <w:tcPr>
+            <w:tcW w:type="dxa" w:w="1837"/>
+          </w:tcPr>
+          <w:p>
+            <w:pPr>
+              <w:spacing w:after="40"/>
+              <w:jc w:val="left"/>
+            </w:pPr>
+            <w:r>
+              <w:rPr>
+                <w:rFonts w:ascii="Consolas" w:hAnsi="Consolas"/>
+                <w:sz w:val="13"/>
+              </w:rPr>
+              <w:t>ConciliacionService.vincular</w:t>
+            </w:r>
+          </w:p>
+        </w:tc>
+      </w:tr>
+      <w:tr>
+        <w:trPr>
+          <w:cantSplit w:val="true"/>
+        </w:trPr>
+        <w:tc>
+          <w:tcPr>
+            <w:tcW w:type="dxa" w:w="1837"/>
+          </w:tcPr>
+          <w:p>
+            <w:pPr>
+              <w:spacing w:after="40"/>
+              <w:jc w:val="left"/>
+            </w:pPr>
+            <w:r>
+              <w:rPr>
+                <w:sz w:val="16"/>
+              </w:rPr>
+              <w:t>5</w:t>
+            </w:r>
+          </w:p>
+        </w:tc>
+        <w:tc>
+          <w:tcPr>
+            <w:tcW w:type="dxa" w:w="1837"/>
+          </w:tcPr>
+          <w:p>
+            <w:pPr>
+              <w:spacing w:after="40"/>
+              <w:jc w:val="left"/>
+            </w:pPr>
+            <w:r>
+              <w:rPr>
+                <w:sz w:val="16"/>
+              </w:rPr>
+              <w:t>PENDIENTE → CONCILIADO</w:t>
+            </w:r>
+          </w:p>
+        </w:tc>
+        <w:tc>
+          <w:tcPr>
+            <w:tcW w:type="dxa" w:w="1837"/>
+          </w:tcPr>
+          <w:p>
+            <w:pPr>
+              <w:spacing w:after="40"/>
+              <w:jc w:val="left"/>
+            </w:pPr>
+            <w:r>
+              <w:rPr>
+                <w:sz w:val="16"/>
+              </w:rPr>
+              <w:t>Auditor o Admin</w:t>
+            </w:r>
+          </w:p>
+        </w:tc>
+        <w:tc>
+          <w:tcPr>
+            <w:tcW w:type="dxa" w:w="1837"/>
+          </w:tcPr>
+          <w:p>
+            <w:pPr>
+              <w:spacing w:after="40"/>
+              <w:jc w:val="left"/>
+            </w:pPr>
+            <w:r>
+              <w:rPr>
+                <w:sz w:val="16"/>
+              </w:rPr>
+              <w:t>Hay al menos una entrada vinculada</w:t>
+            </w:r>
+          </w:p>
+        </w:tc>
+        <w:tc>
+          <w:tcPr>
+            <w:tcW w:type="dxa" w:w="1837"/>
+          </w:tcPr>
+          <w:p>
+            <w:pPr>
+              <w:spacing w:after="40"/>
+              <w:jc w:val="left"/>
+            </w:pPr>
+            <w:r>
+              <w:rPr>
+                <w:rFonts w:ascii="Consolas" w:hAnsi="Consolas"/>
+                <w:sz w:val="13"/>
+              </w:rPr>
+              <w:t>ConciliacionService.conciliar</w:t>
+            </w:r>
+          </w:p>
+        </w:tc>
+      </w:tr>
+      <w:tr>
+        <w:trPr>
+          <w:cantSplit w:val="true"/>
+        </w:trPr>
+        <w:tc>
+          <w:tcPr>
+            <w:tcW w:type="dxa" w:w="1837"/>
+          </w:tcPr>
+          <w:p>
+            <w:pPr>
+              <w:spacing w:after="40"/>
+              <w:jc w:val="left"/>
+            </w:pPr>
+            <w:r>
+              <w:rPr>
+                <w:sz w:val="16"/>
+              </w:rPr>
+              <w:t>6</w:t>
+            </w:r>
+          </w:p>
+        </w:tc>
+        <w:tc>
+          <w:tcPr>
+            <w:tcW w:type="dxa" w:w="1837"/>
+          </w:tcPr>
+          <w:p>
+            <w:pPr>
+              <w:spacing w:after="40"/>
+              <w:jc w:val="left"/>
+            </w:pPr>
+            <w:r>
+              <w:rPr>
+                <w:sz w:val="16"/>
+              </w:rPr>
+              <w:t>PENDIENTE → RECHAZADO</w:t>
+            </w:r>
+          </w:p>
+        </w:tc>
+        <w:tc>
+          <w:tcPr>
+            <w:tcW w:type="dxa" w:w="1837"/>
+          </w:tcPr>
+          <w:p>
+            <w:pPr>
+              <w:spacing w:after="40"/>
+              <w:jc w:val="left"/>
+            </w:pPr>
+            <w:r>
+              <w:rPr>
+                <w:sz w:val="16"/>
+              </w:rPr>
+              <w:t>Auditor o Admin</w:t>
+            </w:r>
+          </w:p>
+        </w:tc>
+        <w:tc>
+          <w:tcPr>
+            <w:tcW w:type="dxa" w:w="1837"/>
+          </w:tcPr>
+          <w:p>
+            <w:pPr>
+              <w:spacing w:after="40"/>
+              <w:jc w:val="left"/>
+            </w:pPr>
+            <w:r>
+              <w:rPr>
+                <w:sz w:val="16"/>
+              </w:rPr>
+              <w:t>Indica un motivo; si el Donador tiene correo, se encola el aviso</w:t>
+            </w:r>
+          </w:p>
+        </w:tc>
+        <w:tc>
+          <w:tcPr>
+            <w:tcW w:type="dxa" w:w="1837"/>
+          </w:tcPr>
+          <w:p>
+            <w:pPr>
+              <w:spacing w:after="40"/>
+              <w:jc w:val="left"/>
+            </w:pPr>
+            <w:r>
+              <w:rPr>
+                <w:rFonts w:ascii="Consolas" w:hAnsi="Consolas"/>
+                <w:sz w:val="13"/>
+              </w:rPr>
+              <w:t>ConciliacionService.rechazar</w:t>
+            </w:r>
+          </w:p>
+        </w:tc>
+      </w:tr>
+      <w:tr>
+        <w:trPr>
+          <w:cantSplit w:val="true"/>
+        </w:trPr>
+        <w:tc>
+          <w:tcPr>
+            <w:tcW w:type="dxa" w:w="1837"/>
+          </w:tcPr>
+          <w:p>
+            <w:pPr>
+              <w:spacing w:after="40"/>
+              <w:jc w:val="left"/>
+            </w:pPr>
+            <w:r>
+              <w:rPr>
+                <w:sz w:val="16"/>
+              </w:rPr>
+              <w:t>7</w:t>
+            </w:r>
+          </w:p>
+        </w:tc>
+        <w:tc>
+          <w:tcPr>
+            <w:tcW w:type="dxa" w:w="1837"/>
+          </w:tcPr>
+          <w:p>
+            <w:pPr>
+              <w:spacing w:after="40"/>
+              <w:jc w:val="left"/>
+            </w:pPr>
+            <w:r>
+              <w:rPr>
+                <w:sz w:val="16"/>
+              </w:rPr>
+              <w:t>RECHAZADO → PENDIENTE</w:t>
+            </w:r>
+          </w:p>
+        </w:tc>
+        <w:tc>
+          <w:tcPr>
+            <w:tcW w:type="dxa" w:w="1837"/>
+          </w:tcPr>
+          <w:p>
+            <w:pPr>
+              <w:spacing w:after="40"/>
+              <w:jc w:val="left"/>
+            </w:pPr>
+            <w:r>
+              <w:rPr>
+                <w:sz w:val="16"/>
+              </w:rPr>
+              <w:t>Auditor o Admin</w:t>
+            </w:r>
+          </w:p>
+        </w:tc>
+        <w:tc>
+          <w:tcPr>
+            <w:tcW w:type="dxa" w:w="1837"/>
+          </w:tcPr>
+          <w:p>
+            <w:pPr>
+              <w:spacing w:after="40"/>
+              <w:jc w:val="left"/>
+            </w:pPr>
+            <w:r>
+              <w:rPr>
+                <w:sz w:val="16"/>
+              </w:rPr>
+              <w:t>El acopio está en su alcance</w:t>
+            </w:r>
+          </w:p>
+        </w:tc>
+        <w:tc>
+          <w:tcPr>
+            <w:tcW w:type="dxa" w:w="1837"/>
+          </w:tcPr>
+          <w:p>
+            <w:pPr>
+              <w:spacing w:after="40"/>
+              <w:jc w:val="left"/>
+            </w:pPr>
+            <w:r>
+              <w:rPr>
+                <w:rFonts w:ascii="Consolas" w:hAnsi="Consolas"/>
+                <w:sz w:val="13"/>
+              </w:rPr>
+              <w:t>ConciliacionService.revertirRechazo</w:t>
+            </w:r>
+          </w:p>
+        </w:tc>
+      </w:tr>
+      <w:tr>
+        <w:trPr>
+          <w:cantSplit w:val="true"/>
+        </w:trPr>
+        <w:tc>
+          <w:tcPr>
+            <w:tcW w:type="dxa" w:w="1837"/>
+          </w:tcPr>
+          <w:p>
+            <w:pPr>
+              <w:spacing w:after="40"/>
+              <w:jc w:val="left"/>
+            </w:pPr>
+            <w:r>
+              <w:rPr>
+                <w:sz w:val="16"/>
+              </w:rPr>
+              <w:t>8</w:t>
+            </w:r>
+          </w:p>
+        </w:tc>
+        <w:tc>
+          <w:tcPr>
+            <w:tcW w:type="dxa" w:w="1837"/>
+          </w:tcPr>
+          <w:p>
+            <w:pPr>
+              <w:spacing w:after="40"/>
+              <w:jc w:val="left"/>
+            </w:pPr>
+            <w:r>
+              <w:rPr>
+                <w:sz w:val="16"/>
+              </w:rPr>
+              <w:t>PREPARADO → CANCELADO</w:t>
+            </w:r>
+          </w:p>
+        </w:tc>
+        <w:tc>
+          <w:tcPr>
+            <w:tcW w:type="dxa" w:w="1837"/>
+          </w:tcPr>
+          <w:p>
+            <w:pPr>
+              <w:spacing w:after="40"/>
+              <w:jc w:val="left"/>
+            </w:pPr>
+            <w:r>
+              <w:rPr>
+                <w:sz w:val="16"/>
+              </w:rPr>
+              <w:t>Donador</w:t>
+            </w:r>
+          </w:p>
+        </w:tc>
+        <w:tc>
+          <w:tcPr>
+            <w:tcW w:type="dxa" w:w="1837"/>
+          </w:tcPr>
+          <w:p>
+            <w:pPr>
+              <w:spacing w:after="40"/>
+              <w:jc w:val="left"/>
+            </w:pPr>
+            <w:r>
+              <w:rPr>
+                <w:sz w:val="16"/>
+              </w:rPr>
+              <w:t>La donación es suya</w:t>
+            </w:r>
+          </w:p>
+        </w:tc>
+        <w:tc>
+          <w:tcPr>
+            <w:tcW w:type="dxa" w:w="1837"/>
+          </w:tcPr>
+          <w:p>
+            <w:pPr>
+              <w:spacing w:after="40"/>
+              <w:jc w:val="left"/>
+            </w:pPr>
+            <w:r>
+              <w:rPr>
+                <w:rFonts w:ascii="Consolas" w:hAnsi="Consolas"/>
+                <w:sz w:val="13"/>
+              </w:rPr>
+              <w:t>DonacionesService.cancelar</w:t>
+            </w:r>
+          </w:p>
+        </w:tc>
+      </w:tr>
+      <w:tr>
+        <w:trPr>
+          <w:cantSplit w:val="true"/>
+        </w:trPr>
+        <w:tc>
+          <w:tcPr>
+            <w:tcW w:type="dxa" w:w="1837"/>
+          </w:tcPr>
+          <w:p>
+            <w:pPr>
+              <w:spacing w:after="40"/>
+              <w:jc w:val="left"/>
+            </w:pPr>
+            <w:r>
+              <w:rPr>
+                <w:sz w:val="16"/>
+              </w:rPr>
+              <w:t>9</w:t>
+            </w:r>
+          </w:p>
+        </w:tc>
+        <w:tc>
+          <w:tcPr>
+            <w:tcW w:type="dxa" w:w="1837"/>
+          </w:tcPr>
+          <w:p>
+            <w:pPr>
+              <w:spacing w:after="40"/>
+              <w:jc w:val="left"/>
+            </w:pPr>
+            <w:r>
+              <w:rPr>
+                <w:sz w:val="16"/>
+              </w:rPr>
+              <w:t>PREPARADO → CANCELADO</w:t>
+            </w:r>
+          </w:p>
+        </w:tc>
+        <w:tc>
+          <w:tcPr>
+            <w:tcW w:type="dxa" w:w="1837"/>
+          </w:tcPr>
+          <w:p>
+            <w:pPr>
+              <w:spacing w:after="40"/>
+              <w:jc w:val="left"/>
+            </w:pPr>
+            <w:r>
+              <w:rPr>
+                <w:sz w:val="16"/>
+              </w:rPr>
+              <w:t xml:space="preserve">Tarea </w:t>
+            </w:r>
+            <w:r>
+              <w:rPr>
+                <w:rFonts w:ascii="Consolas" w:hAnsi="Consolas"/>
+                <w:sz w:val="13"/>
+              </w:rPr>
+              <w:t>preparadas-vencidas</w:t>
+            </w:r>
+          </w:p>
+        </w:tc>
+        <w:tc>
+          <w:tcPr>
+            <w:tcW w:type="dxa" w:w="1837"/>
+          </w:tcPr>
+          <w:p>
+            <w:pPr>
+              <w:spacing w:after="40"/>
+              <w:jc w:val="left"/>
+            </w:pPr>
+            <w:r>
+              <w:rPr>
+                <w:sz w:val="16"/>
+              </w:rPr>
+              <w:t>Pasaron 7 días sin entregarla</w:t>
+            </w:r>
+          </w:p>
+        </w:tc>
+        <w:tc>
+          <w:tcPr>
+            <w:tcW w:type="dxa" w:w="1837"/>
+          </w:tcPr>
+          <w:p>
+            <w:pPr>
+              <w:spacing w:after="40"/>
+              <w:jc w:val="left"/>
+            </w:pPr>
+            <w:r>
+              <w:rPr>
+                <w:rFonts w:ascii="Consolas" w:hAnsi="Consolas"/>
+                <w:sz w:val="13"/>
+              </w:rPr>
+              <w:t>TareasCustodiaService.cancelarVencidas</w:t>
+            </w:r>
+          </w:p>
+        </w:tc>
+      </w:tr>
+    </w:tbl>
+    <w:p>
+      <w:pPr>
+        <w:spacing w:after="40"/>
+      </w:pPr>
+    </w:p>
+    <w:p>
+      <w:r>
+        <w:t xml:space="preserve">Los límites de 5 preparadas y 7 días son los valores por defecto de </w:t>
       </w:r>
       <w:r>
         <w:rPr>
           <w:rFonts w:ascii="Consolas" w:hAnsi="Consolas"/>
           <w:sz w:val="19"/>
         </w:rPr>
-        <w:t>comprobantes</w:t>
+        <w:t>PREPARADAS_MAXIMO</w:t>
       </w:r>
       <w:r>
-        <w:t>:</w:t>
+        <w:t xml:space="preserve"> y </w:t>
+      </w:r>
+      <w:r>
+        <w:rPr>
+          <w:rFonts w:ascii="Consolas" w:hAnsi="Consolas"/>
+          <w:sz w:val="19"/>
+        </w:rPr>
+        <w:t>PREPARADA_VIGENCIA_DIAS</w:t>
+      </w:r>
+      <w:r>
+        <w:t xml:space="preserve">. Los métodos viven en </w:t>
+      </w:r>
+      <w:r>
+        <w:rPr>
+          <w:rFonts w:ascii="Consolas" w:hAnsi="Consolas"/>
+          <w:sz w:val="19"/>
+        </w:rPr>
+        <w:t>apps/api/src/modulos/comprobantes/</w:t>
+      </w:r>
+      <w:r>
+        <w:t>.</w:t>
+      </w:r>
+    </w:p>
+    <w:p>
+      <w:pPr>
+        <w:pStyle w:val="Ttulo2"/>
+      </w:pPr>
+      <w:r>
+        <w:t>2d. Dos transiciones a la vez</w:t>
+      </w:r>
+    </w:p>
+    <w:p>
+      <w:r>
+        <w:t xml:space="preserve">Las flechas 2 y 9 salen del mismo estado y pueden coincidir: el Operador recibe un folio en el mismo minuto en que la tarea diaria lo cancela. Cada cambio de estado exige el estado de origen dentro del mismo </w:t>
+      </w:r>
+      <w:r>
+        <w:rPr>
+          <w:rFonts w:ascii="Consolas" w:hAnsi="Consolas"/>
+          <w:sz w:val="19"/>
+        </w:rPr>
+        <w:t>UPDATE</w:t>
+      </w:r>
+      <w:r>
+        <w:t xml:space="preserve"> (</w:t>
+      </w:r>
+      <w:r>
+        <w:rPr>
+          <w:rFonts w:ascii="Consolas" w:hAnsi="Consolas"/>
+          <w:sz w:val="19"/>
+        </w:rPr>
+        <w:t>cambiarSiEstado</w:t>
+      </w:r>
+      <w:r>
+        <w:t xml:space="preserve"> del DAO de comprobantes), así que la segunda operación ya no encuentra la fila en PREPARADO y no cambia nada. La donación nunca queda recibida y cancelada al mismo tiempo.</w:t>
+      </w:r>
+    </w:p>
+    <w:p>
+      <w:pPr>
+        <w:pStyle w:val="Ttulo1"/>
+      </w:pPr>
+      <w:r>
+        <w:t>3. Bonificación: productor y consumidor con la cola de correo</w:t>
+      </w:r>
+    </w:p>
+    <w:p>
+      <w:pPr>
+        <w:pStyle w:val="Ttulo2"/>
+      </w:pPr>
+      <w:r>
+        <w:t>3a. El problema</w:t>
+      </w:r>
+    </w:p>
+    <w:p>
+      <w:r>
+        <w:t>Varias operaciones mandan un correo: invitar a un usuario, restablecer una contraseña, confirmar la cuenta de un Donador, avisar que una donación se rechazó y recordar un turno. Si el correo se enviara dentro de la petición, un servidor de correo lento haría esperar a quien invita, y uno caído haría fallar la invitación aunque el usuario ya estuviera creado. Al revés también hay riesgo: si la operación fallara después de enviar, el correo ya habría salido con un enlace que no sirve.</w:t>
+      </w:r>
+    </w:p>
+    <w:p>
+      <w:pPr>
+        <w:pStyle w:val="Ttulo2"/>
+      </w:pPr>
+      <w:r>
+        <w:t>3b. Componentes y cómo se comunican</w:t>
+      </w:r>
+    </w:p>
+    <w:p>
+      <w:pPr>
+        <w:sectPr>
+          <w:pgSz w:w="11906" w:h="16838"/>
+          <w:pgMar w:top="1247" w:right="1361" w:bottom="1134" w:left="1361" w:header="720" w:footer="720" w:gutter="0"/>
+          <w:cols w:space="720"/>
+          <w:docGrid w:linePitch="360"/>
+        </w:sectPr>
+      </w:pPr>
+    </w:p>
+    <w:p>
+      <w:pPr>
+        <w:keepNext/>
+        <w:spacing w:after="40"/>
+        <w:jc w:val="center"/>
+      </w:pPr>
+      <w:r>
+        <w:drawing>
+          <wp:inline xmlns:a="http://schemas.openxmlformats.org/drawingml/2006/main" xmlns:pic="http://schemas.openxmlformats.org/drawingml/2006/picture">
+            <wp:extent cx="8780689" cy="4896374"/>
+            <wp:docPr id="4" name="Picture 4"/>
+            <wp:cNvGraphicFramePr>
+              <a:graphicFrameLocks noChangeAspect="1"/>
+            </wp:cNvGraphicFramePr>
+            <a:graphic>
+              <a:graphicData uri="http://schemas.openxmlformats.org/drawingml/2006/picture">
+                <pic:pic>
+                  <pic:nvPicPr>
+                    <pic:cNvPr id="0" name="concurrencia-01-cola-de-correo.png"/>
+                    <pic:cNvPicPr/>
+                  </pic:nvPicPr>
+                  <pic:blipFill>
+                    <a:blip r:embed="rId30"/>
+                    <a:stretch>
+                      <a:fillRect/>
+                    </a:stretch>
+                  </pic:blipFill>
+                  <pic:spPr>
+                    <a:xfrm>
+                      <a:off x="0" y="0"/>
+                      <a:ext cx="8780689" cy="4896374"/>
+                    </a:xfrm>
+                    <a:prstGeom prst="rect"/>
+                  </pic:spPr>
+                </pic:pic>
+              </a:graphicData>
+            </a:graphic>
+          </wp:inline>
+        </w:drawing>
+      </w:r>
+    </w:p>
+    <w:p>
+      <w:pPr>
+        <w:jc w:val="center"/>
+      </w:pPr>
+      <w:r>
+        <w:rPr>
+          <w:b/>
+          <w:color w:val="57534E"/>
+          <w:sz w:val="18"/>
+        </w:rPr>
+        <w:t xml:space="preserve">Figura 4. </w:t>
+      </w:r>
+      <w:r>
+        <w:rPr>
+          <w:color w:val="57534E"/>
+          <w:sz w:val="18"/>
+        </w:rPr>
+        <w:t>Productores, cola y consumidor: cuatro servicios insertan en correo_saliente dentro de su transacción y responden sin esperar; cada minuto procesarCola envía por Resend y marca cada correo ENVIADO o FALLIDO.</w:t>
+      </w:r>
+    </w:p>
+    <w:p>
+      <w:pPr>
+        <w:sectPr>
+          <w:pgSz w:w="16838" w:h="11906" w:orient="landscape"/>
+          <w:pgMar w:top="1247" w:right="1361" w:bottom="1134" w:left="1361" w:header="720" w:footer="720" w:gutter="0"/>
+          <w:cols w:space="720"/>
+          <w:docGrid w:linePitch="360"/>
+        </w:sectPr>
+      </w:pPr>
+    </w:p>
+    <w:p>
+      <w:r>
+        <w:t xml:space="preserve">Productores y consumidor no se llaman entre sí. Lo único que comparten es la tabla </w:t>
+      </w:r>
+      <w:r>
+        <w:rPr>
+          <w:rFonts w:ascii="Consolas" w:hAnsi="Consolas"/>
+          <w:sz w:val="19"/>
+        </w:rPr>
+        <w:t>correo_saliente</w:t>
+      </w:r>
+      <w:r>
+        <w:t>, y por eso trabajan a ritmos distintos: la petición termina a la izquierda de la primera línea punteada del diagrama y el envío ocurre a la derecha, después.</w:t>
       </w:r>
     </w:p>
     <w:tbl>
@@ -1037,7 +3164,7 @@
                 <w:color w:val="FFFFFF"/>
                 <w:sz w:val="16"/>
               </w:rPr>
-              <w:t>Transición</w:t>
+              <w:t>Componente</w:t>
             </w:r>
           </w:p>
         </w:tc>
@@ -1057,7 +3184,7 @@
                 <w:color w:val="FFFFFF"/>
                 <w:sz w:val="16"/>
               </w:rPr>
-              <w:t>Quién</w:t>
+              <w:t>Papel</w:t>
             </w:r>
           </w:p>
         </w:tc>
@@ -1077,7 +3204,7 @@
                 <w:color w:val="FFFFFF"/>
                 <w:sz w:val="16"/>
               </w:rPr>
-              <w:t>Método</w:t>
+              <w:t>Dónde está en el código</w:t>
             </w:r>
           </w:p>
         </w:tc>
@@ -1097,9 +3224,49 @@
             </w:pPr>
             <w:r>
               <w:rPr>
+                <w:rFonts w:ascii="Consolas" w:hAnsi="Consolas"/>
+                <w:sz w:val="13"/>
+              </w:rPr>
+              <w:t>UsuariosService</w:t>
+            </w:r>
+            <w:r>
+              <w:rPr>
                 <w:sz w:val="16"/>
               </w:rPr>
-              <w:t>inicio → PREPARADO</w:t>
+              <w:t xml:space="preserve">, </w:t>
+            </w:r>
+            <w:r>
+              <w:rPr>
+                <w:rFonts w:ascii="Consolas" w:hAnsi="Consolas"/>
+                <w:sz w:val="13"/>
+              </w:rPr>
+              <w:t>DonadorService</w:t>
+            </w:r>
+            <w:r>
+              <w:rPr>
+                <w:sz w:val="16"/>
+              </w:rPr>
+              <w:t xml:space="preserve">, </w:t>
+            </w:r>
+            <w:r>
+              <w:rPr>
+                <w:rFonts w:ascii="Consolas" w:hAnsi="Consolas"/>
+                <w:sz w:val="13"/>
+              </w:rPr>
+              <w:t>ConciliacionService</w:t>
+            </w:r>
+            <w:r>
+              <w:rPr>
+                <w:sz w:val="16"/>
+              </w:rPr>
+              <w:t xml:space="preserve"> y los avisos de </w:t>
+            </w:r>
+            <w:r>
+              <w:rPr>
+                <w:rFonts w:ascii="Consolas" w:hAnsi="Consolas"/>
+                <w:sz w:val="13"/>
+              </w:rPr>
+              <w:t>turnos</w:t>
             </w:r>
           </w:p>
         </w:tc>
@@ -1116,7 +3283,20 @@
               <w:rPr>
                 <w:sz w:val="16"/>
               </w:rPr>
-              <w:t>Donador</w:t>
+              <w:t xml:space="preserve">Productores. Llaman a </w:t>
+            </w:r>
+            <w:r>
+              <w:rPr>
+                <w:rFonts w:ascii="Consolas" w:hAnsi="Consolas"/>
+                <w:sz w:val="13"/>
+              </w:rPr>
+              <w:t>NotificacionService.encolar</w:t>
+            </w:r>
+            <w:r>
+              <w:rPr>
+                <w:sz w:val="16"/>
+              </w:rPr>
+              <w:t xml:space="preserve"> dentro de la transacción de su operación: si la operación se deshace, el correo tampoco queda</w:t>
             </w:r>
           </w:p>
         </w:tc>
@@ -1134,7 +3314,39 @@
                 <w:rFonts w:ascii="Consolas" w:hAnsi="Consolas"/>
                 <w:sz w:val="13"/>
               </w:rPr>
-              <w:t>DonacionesService.crear</w:t>
+              <w:t>notificacion.service.ts</w:t>
+            </w:r>
+            <w:r>
+              <w:rPr>
+                <w:sz w:val="16"/>
+              </w:rPr>
+              <w:t xml:space="preserve">, método </w:t>
+            </w:r>
+            <w:r>
+              <w:rPr>
+                <w:rFonts w:ascii="Consolas" w:hAnsi="Consolas"/>
+                <w:sz w:val="13"/>
+              </w:rPr>
+              <w:t>encolar</w:t>
+            </w:r>
+            <w:r>
+              <w:rPr>
+                <w:sz w:val="16"/>
+              </w:rPr>
+              <w:t xml:space="preserve"> (línea 56); un uso en </w:t>
+            </w:r>
+            <w:r>
+              <w:rPr>
+                <w:rFonts w:ascii="Consolas" w:hAnsi="Consolas"/>
+                <w:sz w:val="13"/>
+              </w:rPr>
+              <w:t>identidad/usuarios/usuarios.service.ts</w:t>
+            </w:r>
+            <w:r>
+              <w:rPr>
+                <w:sz w:val="16"/>
+              </w:rPr>
+              <w:t>, línea 131</w:t>
             </w:r>
           </w:p>
         </w:tc>
@@ -1156,7 +3368,14 @@
               <w:rPr>
                 <w:sz w:val="16"/>
               </w:rPr>
-              <w:t>PREPARADO → CANCELADO</w:t>
+              <w:t xml:space="preserve">Tabla </w:t>
+            </w:r>
+            <w:r>
+              <w:rPr>
+                <w:rFonts w:ascii="Consolas" w:hAnsi="Consolas"/>
+                <w:sz w:val="13"/>
+              </w:rPr>
+              <w:t>correo_saliente</w:t>
             </w:r>
           </w:p>
         </w:tc>
@@ -1173,7 +3392,20 @@
               <w:rPr>
                 <w:sz w:val="16"/>
               </w:rPr>
-              <w:t>Donador</w:t>
+              <w:t xml:space="preserve">Cola. Guarda el estado (PENDIENTE, ENVIADO o FALLIDO), los intentos, el último error y </w:t>
+            </w:r>
+            <w:r>
+              <w:rPr>
+                <w:rFonts w:ascii="Consolas" w:hAnsi="Consolas"/>
+                <w:sz w:val="13"/>
+              </w:rPr>
+              <w:t>enviar_despues_de</w:t>
+            </w:r>
+            <w:r>
+              <w:rPr>
+                <w:sz w:val="16"/>
+              </w:rPr>
+              <w:t>. Tiene un índice por estado y fecha, que es la consulta del consumidor</w:t>
             </w:r>
           </w:p>
         </w:tc>
@@ -1188,10 +3420,42 @@
             </w:pPr>
             <w:r>
               <w:rPr>
+                <w:sz w:val="16"/>
+              </w:rPr>
+              <w:t xml:space="preserve">Modelo </w:t>
+            </w:r>
+            <w:r>
+              <w:rPr>
                 <w:rFonts w:ascii="Consolas" w:hAnsi="Consolas"/>
                 <w:sz w:val="13"/>
               </w:rPr>
-              <w:t>DonacionesService.cancelar</w:t>
+              <w:t>CorreoSaliente</w:t>
+            </w:r>
+            <w:r>
+              <w:rPr>
+                <w:sz w:val="16"/>
+              </w:rPr>
+              <w:t xml:space="preserve"> en </w:t>
+            </w:r>
+            <w:r>
+              <w:rPr>
+                <w:rFonts w:ascii="Consolas" w:hAnsi="Consolas"/>
+                <w:sz w:val="13"/>
+              </w:rPr>
+              <w:t>prisma/schema.prisma</w:t>
+            </w:r>
+            <w:r>
+              <w:rPr>
+                <w:sz w:val="16"/>
+              </w:rPr>
+              <w:t xml:space="preserve">; consultas en </w:t>
+            </w:r>
+            <w:r>
+              <w:rPr>
+                <w:rFonts w:ascii="Consolas" w:hAnsi="Consolas"/>
+                <w:sz w:val="13"/>
+              </w:rPr>
+              <w:t>notificaciones/dao/correo-saliente.dao.ts</w:t>
             </w:r>
           </w:p>
         </w:tc>
@@ -1211,9 +3475,10 @@
             </w:pPr>
             <w:r>
               <w:rPr>
-                <w:sz w:val="16"/>
-              </w:rPr>
-              <w:t>PREPARADO → CANCELADO</w:t>
+                <w:rFonts w:ascii="Consolas" w:hAnsi="Consolas"/>
+                <w:sz w:val="13"/>
+              </w:rPr>
+              <w:t>NotificacionService.procesarCola</w:t>
             </w:r>
           </w:p>
         </w:tc>
@@ -1230,20 +3495,20 @@
               <w:rPr>
                 <w:sz w:val="16"/>
               </w:rPr>
-              <w:t xml:space="preserve">Tarea </w:t>
+              <w:t>Consumidor. Corre cada minuto (</w:t>
             </w:r>
             <w:r>
               <w:rPr>
                 <w:rFonts w:ascii="Consolas" w:hAnsi="Consolas"/>
                 <w:sz w:val="13"/>
               </w:rPr>
-              <w:t>preparadas-vencidas</w:t>
+              <w:t>@Cron</w:t>
             </w:r>
             <w:r>
               <w:rPr>
                 <w:sz w:val="16"/>
               </w:rPr>
-              <w:t>, 00:15 hora de Colombia</w:t>
+              <w:t>), toma hasta 50 correos listos del más viejo al más nuevo y los envía</w:t>
             </w:r>
           </w:p>
         </w:tc>
@@ -1261,7 +3526,39 @@
                 <w:rFonts w:ascii="Consolas" w:hAnsi="Consolas"/>
                 <w:sz w:val="13"/>
               </w:rPr>
-              <w:t>TareasCustodiaService.cancelarVencidas</w:t>
+              <w:t>notificacion.service.ts</w:t>
+            </w:r>
+            <w:r>
+              <w:rPr>
+                <w:sz w:val="16"/>
+              </w:rPr>
+              <w:t xml:space="preserve">, </w:t>
+            </w:r>
+            <w:r>
+              <w:rPr>
+                <w:rFonts w:ascii="Consolas" w:hAnsi="Consolas"/>
+                <w:sz w:val="13"/>
+              </w:rPr>
+              <w:t>procesarCola</w:t>
+            </w:r>
+            <w:r>
+              <w:rPr>
+                <w:sz w:val="16"/>
+              </w:rPr>
+              <w:t xml:space="preserve"> (líneas 62 a 79) y </w:t>
+            </w:r>
+            <w:r>
+              <w:rPr>
+                <w:rFonts w:ascii="Consolas" w:hAnsi="Consolas"/>
+                <w:sz w:val="13"/>
+              </w:rPr>
+              <w:t>enviar</w:t>
+            </w:r>
+            <w:r>
+              <w:rPr>
+                <w:sz w:val="16"/>
+              </w:rPr>
+              <w:t xml:space="preserve"> (81 a 114)</w:t>
             </w:r>
           </w:p>
         </w:tc>
@@ -1283,7 +3580,7 @@
               <w:rPr>
                 <w:sz w:val="16"/>
               </w:rPr>
-              <w:t>PREPARADO → PENDIENTE</w:t>
+              <w:t>Resend</w:t>
             </w:r>
           </w:p>
         </w:tc>
@@ -1300,7 +3597,20 @@
               <w:rPr>
                 <w:sz w:val="16"/>
               </w:rPr>
-              <w:t>Operador del acopio</w:t>
+              <w:t>Servidor de correo, por SMTP (</w:t>
+            </w:r>
+            <w:r>
+              <w:rPr>
+                <w:rFonts w:ascii="Consolas" w:hAnsi="Consolas"/>
+                <w:sz w:val="13"/>
+              </w:rPr>
+              <w:t>smtp.resend.com</w:t>
+            </w:r>
+            <w:r>
+              <w:rPr>
+                <w:sz w:val="16"/>
+              </w:rPr>
+              <w:t>, puerto 465 con TLS). La API no usa el SDK de Resend: cambiar de proveedor es cambiar variables</w:t>
             </w:r>
           </w:p>
         </w:tc>
@@ -1318,235 +3628,13 @@
                 <w:rFonts w:ascii="Consolas" w:hAnsi="Consolas"/>
                 <w:sz w:val="13"/>
               </w:rPr>
-              <w:t>RecepcionService.recibir</w:t>
-            </w:r>
-          </w:p>
-        </w:tc>
-      </w:tr>
-      <w:tr>
-        <w:trPr>
-          <w:cantSplit w:val="true"/>
-        </w:trPr>
-        <w:tc>
-          <w:tcPr>
-            <w:tcW w:type="dxa" w:w="3061"/>
-          </w:tcPr>
-          <w:p>
-            <w:pPr>
-              <w:spacing w:after="40"/>
-              <w:jc w:val="left"/>
-            </w:pPr>
+              <w:t>.env.example</w:t>
+            </w:r>
             <w:r>
               <w:rPr>
                 <w:sz w:val="16"/>
               </w:rPr>
-              <w:t>PREPARADO o PENDIENTE → PENDIENTE</w:t>
-            </w:r>
-          </w:p>
-        </w:tc>
-        <w:tc>
-          <w:tcPr>
-            <w:tcW w:type="dxa" w:w="3061"/>
-          </w:tcPr>
-          <w:p>
-            <w:pPr>
-              <w:spacing w:after="40"/>
-              <w:jc w:val="left"/>
-            </w:pPr>
-            <w:r>
-              <w:rPr>
-                <w:sz w:val="16"/>
-              </w:rPr>
-              <w:t>Auditor o Admin</w:t>
-            </w:r>
-          </w:p>
-        </w:tc>
-        <w:tc>
-          <w:tcPr>
-            <w:tcW w:type="dxa" w:w="3061"/>
-          </w:tcPr>
-          <w:p>
-            <w:pPr>
-              <w:spacing w:after="40"/>
-              <w:jc w:val="left"/>
-            </w:pPr>
-            <w:r>
-              <w:rPr>
-                <w:rFonts w:ascii="Consolas" w:hAnsi="Consolas"/>
-                <w:sz w:val="13"/>
-              </w:rPr>
-              <w:t>ConciliacionService.vincular</w:t>
-            </w:r>
-          </w:p>
-        </w:tc>
-      </w:tr>
-      <w:tr>
-        <w:trPr>
-          <w:cantSplit w:val="true"/>
-        </w:trPr>
-        <w:tc>
-          <w:tcPr>
-            <w:tcW w:type="dxa" w:w="3061"/>
-          </w:tcPr>
-          <w:p>
-            <w:pPr>
-              <w:spacing w:after="40"/>
-              <w:jc w:val="left"/>
-            </w:pPr>
-            <w:r>
-              <w:rPr>
-                <w:sz w:val="16"/>
-              </w:rPr>
-              <w:t>PENDIENTE → CONCILIADO</w:t>
-            </w:r>
-          </w:p>
-        </w:tc>
-        <w:tc>
-          <w:tcPr>
-            <w:tcW w:type="dxa" w:w="3061"/>
-          </w:tcPr>
-          <w:p>
-            <w:pPr>
-              <w:spacing w:after="40"/>
-              <w:jc w:val="left"/>
-            </w:pPr>
-            <w:r>
-              <w:rPr>
-                <w:sz w:val="16"/>
-              </w:rPr>
-              <w:t>Auditor o Admin</w:t>
-            </w:r>
-          </w:p>
-        </w:tc>
-        <w:tc>
-          <w:tcPr>
-            <w:tcW w:type="dxa" w:w="3061"/>
-          </w:tcPr>
-          <w:p>
-            <w:pPr>
-              <w:spacing w:after="40"/>
-              <w:jc w:val="left"/>
-            </w:pPr>
-            <w:r>
-              <w:rPr>
-                <w:rFonts w:ascii="Consolas" w:hAnsi="Consolas"/>
-                <w:sz w:val="13"/>
-              </w:rPr>
-              <w:t>ConciliacionService.conciliar</w:t>
-            </w:r>
-          </w:p>
-        </w:tc>
-      </w:tr>
-      <w:tr>
-        <w:trPr>
-          <w:cantSplit w:val="true"/>
-        </w:trPr>
-        <w:tc>
-          <w:tcPr>
-            <w:tcW w:type="dxa" w:w="3061"/>
-          </w:tcPr>
-          <w:p>
-            <w:pPr>
-              <w:spacing w:after="40"/>
-              <w:jc w:val="left"/>
-            </w:pPr>
-            <w:r>
-              <w:rPr>
-                <w:sz w:val="16"/>
-              </w:rPr>
-              <w:t>PENDIENTE → RECHAZADO</w:t>
-            </w:r>
-          </w:p>
-        </w:tc>
-        <w:tc>
-          <w:tcPr>
-            <w:tcW w:type="dxa" w:w="3061"/>
-          </w:tcPr>
-          <w:p>
-            <w:pPr>
-              <w:spacing w:after="40"/>
-              <w:jc w:val="left"/>
-            </w:pPr>
-            <w:r>
-              <w:rPr>
-                <w:sz w:val="16"/>
-              </w:rPr>
-              <w:t>Auditor o Admin</w:t>
-            </w:r>
-          </w:p>
-        </w:tc>
-        <w:tc>
-          <w:tcPr>
-            <w:tcW w:type="dxa" w:w="3061"/>
-          </w:tcPr>
-          <w:p>
-            <w:pPr>
-              <w:spacing w:after="40"/>
-              <w:jc w:val="left"/>
-            </w:pPr>
-            <w:r>
-              <w:rPr>
-                <w:rFonts w:ascii="Consolas" w:hAnsi="Consolas"/>
-                <w:sz w:val="13"/>
-              </w:rPr>
-              <w:t>ConciliacionService.rechazar</w:t>
-            </w:r>
-          </w:p>
-        </w:tc>
-      </w:tr>
-      <w:tr>
-        <w:trPr>
-          <w:cantSplit w:val="true"/>
-        </w:trPr>
-        <w:tc>
-          <w:tcPr>
-            <w:tcW w:type="dxa" w:w="3061"/>
-          </w:tcPr>
-          <w:p>
-            <w:pPr>
-              <w:spacing w:after="40"/>
-              <w:jc w:val="left"/>
-            </w:pPr>
-            <w:r>
-              <w:rPr>
-                <w:sz w:val="16"/>
-              </w:rPr>
-              <w:t>RECHAZADO → PENDIENTE</w:t>
-            </w:r>
-          </w:p>
-        </w:tc>
-        <w:tc>
-          <w:tcPr>
-            <w:tcW w:type="dxa" w:w="3061"/>
-          </w:tcPr>
-          <w:p>
-            <w:pPr>
-              <w:spacing w:after="40"/>
-              <w:jc w:val="left"/>
-            </w:pPr>
-            <w:r>
-              <w:rPr>
-                <w:sz w:val="16"/>
-              </w:rPr>
-              <w:t>Auditor o Admin</w:t>
-            </w:r>
-          </w:p>
-        </w:tc>
-        <w:tc>
-          <w:tcPr>
-            <w:tcW w:type="dxa" w:w="3061"/>
-          </w:tcPr>
-          <w:p>
-            <w:pPr>
-              <w:spacing w:after="40"/>
-              <w:jc w:val="left"/>
-            </w:pPr>
-            <w:r>
-              <w:rPr>
-                <w:rFonts w:ascii="Consolas" w:hAnsi="Consolas"/>
-                <w:sz w:val="13"/>
-              </w:rPr>
-              <w:t>ConciliacionService.revertirRechazo</w:t>
+              <w:t xml:space="preserve"> y P-055</w:t>
             </w:r>
           </w:p>
         </w:tc>
@@ -1559,382 +3647,15 @@
     </w:p>
     <w:p>
       <w:r>
-        <w:t xml:space="preserve">Cada cambio de estado exige el estado anterior en el mismo </w:t>
-      </w:r>
-      <w:r>
-        <w:rPr>
-          <w:rFonts w:ascii="Consolas" w:hAnsi="Consolas"/>
-          <w:sz w:val="19"/>
-        </w:rPr>
-        <w:t>UPDATE</w:t>
-      </w:r>
-      <w:r>
-        <w:t xml:space="preserve">. Si el Operador recibe un folio en el mismo instante en que la tarea diaria lo cancela, una de las dos operaciones ya no encuentra la fila en </w:t>
-      </w:r>
-      <w:r>
-        <w:rPr>
-          <w:rFonts w:ascii="Consolas" w:hAnsi="Consolas"/>
-          <w:sz w:val="19"/>
-        </w:rPr>
-        <w:t>PREPARADO</w:t>
-      </w:r>
-      <w:r>
-        <w:t xml:space="preserve"> y no cambia nada. La nota completa está en </w:t>
-      </w:r>
-      <w:r>
-        <w:t>comportamiento.md</w:t>
-      </w:r>
-      <w:r>
-        <w:t>.</w:t>
+        <w:t>Cuando un envío falla, el consumidor marca el correo FALLIDO y le pone una espera que se duplica en cada intento (1, 2, 4, 8 minutos, hasta 2 horas). Cuando pasa esa espera vuelve a estar listo, y después de 8 intentos se deja de reintentar.</w:t>
       </w:r>
     </w:p>
     <w:p>
       <w:pPr>
-        <w:pStyle w:val="Ttulo1"/>
+        <w:pStyle w:val="Ttulo2"/>
       </w:pPr>
       <w:r>
-        <w:t>3. Bonificación: productor y consumidor con la cola de correo</w:t>
-      </w:r>
-    </w:p>
-    <w:p>
-      <w:pPr>
-        <w:pStyle w:val="Ttulo2"/>
-      </w:pPr>
-      <w:r>
-        <w:t>Problema que resuelve</w:t>
-      </w:r>
-    </w:p>
-    <w:p>
-      <w:r>
-        <w:t>Varias operaciones mandan un correo: invitar a un usuario, restablecer una contraseña, confirmar la cuenta de un Donador, rechazar una donación y recordar un turno. Si el correo se enviara dentro de la petición, un servidor SMTP lento haría esperar a quien invita, y uno caído haría fallar la invitación aunque el usuario ya estuviera creado. Además, si la operación fallara después de enviar, el correo ya habría salido con un enlace que no sirve.</w:t>
-      </w:r>
-    </w:p>
-    <w:p>
-      <w:pPr>
-        <w:pStyle w:val="Ttulo2"/>
-      </w:pPr>
-      <w:r>
-        <w:t>Componentes y cómo se comunican</w:t>
-      </w:r>
-    </w:p>
-    <w:p>
-      <w:pPr>
-        <w:pStyle w:val="Vineta"/>
-      </w:pPr>
-      <w:r>
-        <w:t xml:space="preserve">•  </w:t>
-      </w:r>
-      <w:r>
-        <w:t xml:space="preserve">Productores: </w:t>
-      </w:r>
-      <w:r>
-        <w:rPr>
-          <w:rFonts w:ascii="Consolas" w:hAnsi="Consolas"/>
-          <w:sz w:val="19"/>
-        </w:rPr>
-        <w:t>UsuariosService</w:t>
-      </w:r>
-      <w:r>
-        <w:t xml:space="preserve"> (invitaciones y restablecimientos), </w:t>
-      </w:r>
-      <w:r>
-        <w:rPr>
-          <w:rFonts w:ascii="Consolas" w:hAnsi="Consolas"/>
-          <w:sz w:val="19"/>
-        </w:rPr>
-        <w:t>DonadorService</w:t>
-      </w:r>
-      <w:r>
-        <w:t xml:space="preserve"> (confirmación de la cuenta), </w:t>
-      </w:r>
-      <w:r>
-        <w:rPr>
-          <w:rFonts w:ascii="Consolas" w:hAnsi="Consolas"/>
-          <w:sz w:val="19"/>
-        </w:rPr>
-        <w:t>ConciliacionService</w:t>
-      </w:r>
-      <w:r>
-        <w:t xml:space="preserve"> (rechazo de una donación) y los avisos de </w:t>
-      </w:r>
-      <w:r>
-        <w:rPr>
-          <w:rFonts w:ascii="Consolas" w:hAnsi="Consolas"/>
-          <w:sz w:val="19"/>
-        </w:rPr>
-        <w:t>turnos</w:t>
-      </w:r>
-      <w:r>
-        <w:t xml:space="preserve">. Cada uno llama a </w:t>
-      </w:r>
-      <w:r>
-        <w:rPr>
-          <w:rFonts w:ascii="Consolas" w:hAnsi="Consolas"/>
-          <w:sz w:val="19"/>
-        </w:rPr>
-        <w:t>NotificacionService.encolar</w:t>
-      </w:r>
-      <w:r>
-        <w:t xml:space="preserve"> dentro de la misma transacción que la operación. Si la operación se deshace, el correo tampoco queda en la cola.</w:t>
-      </w:r>
-    </w:p>
-    <w:p>
-      <w:pPr>
-        <w:pStyle w:val="Vineta"/>
-      </w:pPr>
-      <w:r>
-        <w:t xml:space="preserve">•  </w:t>
-      </w:r>
-      <w:r>
-        <w:t xml:space="preserve">Cola: la tabla </w:t>
-      </w:r>
-      <w:r>
-        <w:rPr>
-          <w:rFonts w:ascii="Consolas" w:hAnsi="Consolas"/>
-          <w:sz w:val="19"/>
-        </w:rPr>
-        <w:t>correo_saliente</w:t>
-      </w:r>
-      <w:r>
-        <w:t xml:space="preserve">, con estado </w:t>
-      </w:r>
-      <w:r>
-        <w:rPr>
-          <w:rFonts w:ascii="Consolas" w:hAnsi="Consolas"/>
-          <w:sz w:val="19"/>
-        </w:rPr>
-        <w:t>PENDIENTE</w:t>
-      </w:r>
-      <w:r>
-        <w:t xml:space="preserve">, </w:t>
-      </w:r>
-      <w:r>
-        <w:rPr>
-          <w:rFonts w:ascii="Consolas" w:hAnsi="Consolas"/>
-          <w:sz w:val="19"/>
-        </w:rPr>
-        <w:t>ENVIADO</w:t>
-      </w:r>
-      <w:r>
-        <w:t xml:space="preserve"> o </w:t>
-      </w:r>
-      <w:r>
-        <w:rPr>
-          <w:rFonts w:ascii="Consolas" w:hAnsi="Consolas"/>
-          <w:sz w:val="19"/>
-        </w:rPr>
-        <w:t>FALLIDO</w:t>
-      </w:r>
-      <w:r>
-        <w:t xml:space="preserve">, el número de intentos, el último error y </w:t>
-      </w:r>
-      <w:r>
-        <w:rPr>
-          <w:rFonts w:ascii="Consolas" w:hAnsi="Consolas"/>
-          <w:sz w:val="19"/>
-        </w:rPr>
-        <w:t>enviar_despues_de</w:t>
-      </w:r>
-      <w:r>
-        <w:t>. Tiene un índice por estado y fecha, que es la consulta del consumidor.</w:t>
-      </w:r>
-    </w:p>
-    <w:p>
-      <w:pPr>
-        <w:pStyle w:val="Vineta"/>
-      </w:pPr>
-      <w:r>
-        <w:t xml:space="preserve">•  </w:t>
-      </w:r>
-      <w:r>
-        <w:t xml:space="preserve">Consumidor: </w:t>
-      </w:r>
-      <w:r>
-        <w:rPr>
-          <w:rFonts w:ascii="Consolas" w:hAnsi="Consolas"/>
-          <w:sz w:val="19"/>
-        </w:rPr>
-        <w:t>NotificacionService.procesarCola</w:t>
-      </w:r>
-      <w:r>
-        <w:t xml:space="preserve">, una tarea </w:t>
-      </w:r>
-      <w:r>
-        <w:rPr>
-          <w:rFonts w:ascii="Consolas" w:hAnsi="Consolas"/>
-          <w:sz w:val="19"/>
-        </w:rPr>
-        <w:t>@Cron</w:t>
-      </w:r>
-      <w:r>
-        <w:t xml:space="preserve"> que corre cada minuto. Toma hasta 50 correos listos, del más viejo al más nuevo, y los envía por SMTP. Si uno falla, lo marca </w:t>
-      </w:r>
-      <w:r>
-        <w:rPr>
-          <w:rFonts w:ascii="Consolas" w:hAnsi="Consolas"/>
-          <w:sz w:val="19"/>
-        </w:rPr>
-        <w:t>FALLIDO</w:t>
-      </w:r>
-      <w:r>
-        <w:t xml:space="preserve"> y lo reprograma con espera exponencial (1, 2, 4, 8 minutos y hasta dos horas), hasta ocho intentos.</w:t>
-      </w:r>
-    </w:p>
-    <w:p>
-      <w:pPr>
-        <w:pStyle w:val="Vineta"/>
-      </w:pPr>
-      <w:r>
-        <w:t xml:space="preserve">•  </w:t>
-      </w:r>
-      <w:r>
-        <w:t>Proveedor: Resend, por SMTP (</w:t>
-      </w:r>
-      <w:r>
-        <w:rPr>
-          <w:rFonts w:ascii="Consolas" w:hAnsi="Consolas"/>
-          <w:sz w:val="19"/>
-        </w:rPr>
-        <w:t>smtp.resend.com</w:t>
-      </w:r>
-      <w:r>
-        <w:t xml:space="preserve">, puerto 465 con TLS) y con el remitente </w:t>
-      </w:r>
-      <w:r>
-        <w:rPr>
-          <w:rFonts w:ascii="Consolas" w:hAnsi="Consolas"/>
-          <w:sz w:val="19"/>
-        </w:rPr>
-        <w:t>no-reply@josephqaz.dev</w:t>
-      </w:r>
-      <w:r>
-        <w:t>. La API no usa el SDK de Resend; cambiar de proveedor es cambiar variables de entorno.</w:t>
-      </w:r>
-    </w:p>
-    <w:p>
-      <w:r>
-        <w:t>Productores y consumidor no se llaman entre sí. Solo comparten la tabla, así que la petición responde en cuanto la transacción confirma y el envío ocurre después, a su propio ritmo.</w:t>
-      </w:r>
-    </w:p>
-    <w:p>
-      <w:pPr>
-        <w:pStyle w:val="Ttulo2"/>
-      </w:pPr>
-      <w:r>
-        <w:t>Código y evidencia</w:t>
-      </w:r>
-    </w:p>
-    <w:p>
-      <w:pPr>
-        <w:pStyle w:val="Vineta"/>
-      </w:pPr>
-      <w:r>
-        <w:t xml:space="preserve">•  </w:t>
-      </w:r>
-      <w:r>
-        <w:t xml:space="preserve">Productor: </w:t>
-      </w:r>
-      <w:r>
-        <w:rPr>
-          <w:rFonts w:ascii="Consolas" w:hAnsi="Consolas"/>
-          <w:sz w:val="19"/>
-        </w:rPr>
-        <w:t>apps/api/src/modulos/notificaciones/notificacion.service.ts</w:t>
-      </w:r>
-      <w:r>
-        <w:t xml:space="preserve">, método </w:t>
-      </w:r>
-      <w:r>
-        <w:rPr>
-          <w:rFonts w:ascii="Consolas" w:hAnsi="Consolas"/>
-          <w:sz w:val="19"/>
-        </w:rPr>
-        <w:t>encolar</w:t>
-      </w:r>
-      <w:r>
-        <w:t xml:space="preserve"> (línea 56). Un ejemplo de uso está en </w:t>
-      </w:r>
-      <w:r>
-        <w:rPr>
-          <w:rFonts w:ascii="Consolas" w:hAnsi="Consolas"/>
-          <w:sz w:val="19"/>
-        </w:rPr>
-        <w:t>modulos/identidad/usuarios/usuarios.service.ts</w:t>
-      </w:r>
-      <w:r>
-        <w:t>, línea 131.</w:t>
-      </w:r>
-    </w:p>
-    <w:p>
-      <w:pPr>
-        <w:pStyle w:val="Vineta"/>
-      </w:pPr>
-      <w:r>
-        <w:t xml:space="preserve">•  </w:t>
-      </w:r>
-      <w:r>
-        <w:t xml:space="preserve">Consumidor: el mismo archivo, </w:t>
-      </w:r>
-      <w:r>
-        <w:rPr>
-          <w:rFonts w:ascii="Consolas" w:hAnsi="Consolas"/>
-          <w:sz w:val="19"/>
-        </w:rPr>
-        <w:t>procesarCola</w:t>
-      </w:r>
-      <w:r>
-        <w:t xml:space="preserve"> (líneas 62 a 79) y </w:t>
-      </w:r>
-      <w:r>
-        <w:rPr>
-          <w:rFonts w:ascii="Consolas" w:hAnsi="Consolas"/>
-          <w:sz w:val="19"/>
-        </w:rPr>
-        <w:t>enviar</w:t>
-      </w:r>
-      <w:r>
-        <w:t xml:space="preserve"> (líneas 81 a 114).</w:t>
-      </w:r>
-    </w:p>
-    <w:p>
-      <w:pPr>
-        <w:pStyle w:val="Vineta"/>
-      </w:pPr>
-      <w:r>
-        <w:t xml:space="preserve">•  </w:t>
-      </w:r>
-      <w:r>
-        <w:t xml:space="preserve">Cola: </w:t>
-      </w:r>
-      <w:r>
-        <w:rPr>
-          <w:rFonts w:ascii="Consolas" w:hAnsi="Consolas"/>
-          <w:sz w:val="19"/>
-        </w:rPr>
-        <w:t>apps/api/src/modulos/notificaciones/dao/correo-saliente.dao.ts</w:t>
-      </w:r>
-      <w:r>
-        <w:t xml:space="preserve"> y el modelo </w:t>
-      </w:r>
-      <w:r>
-        <w:rPr>
-          <w:rFonts w:ascii="Consolas" w:hAnsi="Consolas"/>
-          <w:sz w:val="19"/>
-        </w:rPr>
-        <w:t>CorreoSaliente</w:t>
-      </w:r>
-      <w:r>
-        <w:t xml:space="preserve"> en </w:t>
-      </w:r>
-      <w:r>
-        <w:rPr>
-          <w:rFonts w:ascii="Consolas" w:hAnsi="Consolas"/>
-          <w:sz w:val="19"/>
-        </w:rPr>
-        <w:t>prisma/schema.prisma</w:t>
-      </w:r>
-      <w:r>
-        <w:t>.</w:t>
+        <w:t>3c. Evidencia de funcionamiento</w:t>
       </w:r>
     </w:p>
     <w:p>
@@ -1955,27 +3676,7 @@
         <w:t>src/pruebas-integracion/notificaciones.int.test.ts</w:t>
       </w:r>
       <w:r>
-        <w:t xml:space="preserve">): con el SMTP arriba el correo queda </w:t>
-      </w:r>
-      <w:r>
-        <w:rPr>
-          <w:rFonts w:ascii="Consolas" w:hAnsi="Consolas"/>
-          <w:sz w:val="19"/>
-        </w:rPr>
-        <w:t>ENVIADO</w:t>
-      </w:r>
-      <w:r>
-        <w:t xml:space="preserve">; con el SMTP caído queda </w:t>
-      </w:r>
-      <w:r>
-        <w:rPr>
-          <w:rFonts w:ascii="Consolas" w:hAnsi="Consolas"/>
-          <w:sz w:val="19"/>
-        </w:rPr>
-        <w:t>FALLIDO</w:t>
-      </w:r>
-      <w:r>
-        <w:t xml:space="preserve">, espera y sale solo cuando vuelve; después del máximo de intentos no se reintenta; y con </w:t>
+        <w:t xml:space="preserve">): con el servidor de correo arriba el correo queda ENVIADO; con el servidor caído queda FALLIDO, espera y sale solo cuando el servidor vuelve; después del máximo de intentos no se reintenta; y con </w:t>
       </w:r>
       <w:r>
         <w:rPr>
@@ -1996,7 +3697,7 @@
         <w:t xml:space="preserve">•  </w:t>
       </w:r>
       <w:r>
-        <w:t xml:space="preserve">Prueba real con Resend, el 30 de octubre en la API local: un registro de Donador para </w:t>
+        <w:t xml:space="preserve">Prueba real con Resend el 30 de octubre, en la API local. Un registro de Donador para </w:t>
       </w:r>
       <w:r>
         <w:rPr>
@@ -2029,7 +3730,7 @@
         <w:drawing>
           <wp:inline xmlns:a="http://schemas.openxmlformats.org/drawingml/2006/main" xmlns:pic="http://schemas.openxmlformats.org/drawingml/2006/picture">
             <wp:extent cx="5831840" cy="1380579"/>
-            <wp:docPr id="4" name="Picture 4"/>
+            <wp:docPr id="5" name="Picture 5"/>
             <wp:cNvGraphicFramePr>
               <a:graphicFrameLocks noChangeAspect="1"/>
             </wp:cNvGraphicFramePr>
@@ -2041,7 +3742,7 @@
                     <pic:cNvPicPr/>
                   </pic:nvPicPr>
                   <pic:blipFill>
-                    <a:blip r:embed="rId30"/>
+                    <a:blip r:embed="rId31"/>
                     <a:stretch>
                       <a:fillRect/>
                     </a:stretch>
@@ -2070,7 +3771,7 @@
           <w:color w:val="57534E"/>
           <w:sz w:val="18"/>
         </w:rPr>
-        <w:t xml:space="preserve">Figura 4. </w:t>
+        <w:t xml:space="preserve">Figura 5. </w:t>
       </w:r>
       <w:r>
         <w:rPr>
@@ -2105,7 +3806,7 @@
         <w:drawing>
           <wp:inline xmlns:a="http://schemas.openxmlformats.org/drawingml/2006/main" xmlns:pic="http://schemas.openxmlformats.org/drawingml/2006/picture">
             <wp:extent cx="5831840" cy="2226568"/>
-            <wp:docPr id="5" name="Picture 5"/>
+            <wp:docPr id="6" name="Picture 6"/>
             <wp:cNvGraphicFramePr>
               <a:graphicFrameLocks noChangeAspect="1"/>
             </wp:cNvGraphicFramePr>
@@ -2117,7 +3818,7 @@
                     <pic:cNvPicPr/>
                   </pic:nvPicPr>
                   <pic:blipFill>
-                    <a:blip r:embed="rId31"/>
+                    <a:blip r:embed="rId32"/>
                     <a:stretch>
                       <a:fillRect/>
                     </a:stretch>
@@ -2146,7 +3847,7 @@
           <w:color w:val="57534E"/>
           <w:sz w:val="18"/>
         </w:rPr>
-        <w:t xml:space="preserve">Figura 5. </w:t>
+        <w:t xml:space="preserve">Figura 6. </w:t>
       </w:r>
       <w:r>
         <w:rPr>
@@ -2161,7 +3862,7 @@
         <w:pStyle w:val="Ttulo2"/>
       </w:pPr>
       <w:r>
-        <w:t>Limitaciones y fallos considerados</w:t>
+        <w:t>3d. Limitaciones y fallos considerados</w:t>
       </w:r>
     </w:p>
     <w:p>
@@ -2172,7 +3873,7 @@
         <w:t xml:space="preserve">•  </w:t>
       </w:r>
       <w:r>
-        <w:t>SMTP caído o lento: es el caso que la cola resuelve. La operación no se entera y el correo se reintenta solo. Lo cubre una prueba de integración.</w:t>
+        <w:t>Servidor de correo caído o lento: es el caso que la cola resuelve. La operación no se entera y el correo se reintenta solo, y una prueba de integración lo cubre.</w:t>
       </w:r>
     </w:p>
     <w:p>
@@ -2193,7 +3894,7 @@
         <w:t>procesando</w:t>
       </w:r>
       <w:r>
-        <w:t xml:space="preserve"> evita que un lote empiece antes de que termine el anterior, pero solo dentro de una instancia de la API. Con dos instancias, las dos leerían las mismas filas y el correo saldría dos veces. Hoy corre una sola instancia. El arreglo es reclamar el lote con </w:t>
+        <w:t xml:space="preserve"> evita que un lote empiece antes de que termine el anterior, pero solo dentro de una instancia de la API. Con dos instancias, las dos leerían las mismas filas y el correo saldría dos veces. Hoy corre una sola. El arreglo es reclamar el lote con </w:t>
       </w:r>
       <w:r>
         <w:rPr>
@@ -2203,7 +3904,7 @@
         <w:t>SELECT … FOR UPDATE SKIP LOCKED</w:t>
       </w:r>
       <w:r>
-        <w:t xml:space="preserve"> y quedó anotado como </w:t>
+        <w:t xml:space="preserve">, y quedó anotado como </w:t>
       </w:r>
       <w:r>
         <w:t>P-089</w:t>
@@ -2220,17 +3921,7 @@
         <w:t xml:space="preserve">•  </w:t>
       </w:r>
       <w:r>
-        <w:t xml:space="preserve">Caída entre enviar y marcar: si la API se cae después de que Resend acepta el correo y antes de marcarlo </w:t>
-      </w:r>
-      <w:r>
-        <w:rPr>
-          <w:rFonts w:ascii="Consolas" w:hAnsi="Consolas"/>
-          <w:sz w:val="19"/>
-        </w:rPr>
-        <w:t>ENVIADO</w:t>
-      </w:r>
-      <w:r>
-        <w:t>, el siguiente lote lo vuelve a enviar. La entrega es «al menos una vez»; para una invitación, un correo repetido es preferible a uno perdido.</w:t>
+        <w:t>Caída entre enviar y marcar: si la API se cae después de que Resend acepta el correo y antes de marcarlo ENVIADO, el siguiente lote lo vuelve a enviar. La entrega es «al menos una vez»; para una invitación, un correo repetido es preferible a uno perdido.</w:t>
       </w:r>
     </w:p>
     <w:p>
@@ -2245,7 +3936,6 @@
       </w:r>
     </w:p>
     <w:sectPr>
-      <w:footerReference w:type="default" r:id="rId8"/>
       <w:pgSz w:w="11906" w:h="16838"/>
       <w:pgMar w:top="1247" w:right="1361" w:bottom="1134" w:left="1361" w:header="720" w:footer="720" w:gutter="0"/>
       <w:cols w:space="720"/>

</xml_diff>

<commit_message>
Docs: ADR-0024, P-089 resuelto y el complemento en PDF
ADR-0024, vista general, patrones, despliegue, plan, plan de acción, recorridos
e informe de sesión. El complemento dice que P-089 quedó resuelto y sale también
en PDF revisado; el generador lleva cada título con su diagrama apaisado y fija
los anchos de las tablas.

Co-Authored-By: Claude Opus 5.5 <noreply@anthropic.com>
</commit_message>
<xml_diff>
--- a/docs/entregas/Complemento - Sustentacion segundo corte - Acopio.docx
+++ b/docs/entregas/Complemento - Sustentacion segundo corte - Acopio.docx
@@ -95,9 +95,15 @@
       </w:r>
     </w:p>
     <w:p>
-      <w:r>
-        <w:br w:type="page"/>
-      </w:r>
+      <w:pPr>
+        <w:sectPr>
+          <w:footerReference w:type="default" r:id="rId8"/>
+          <w:pgSz w:w="11906" w:h="16838"/>
+          <w:pgMar w:top="1247" w:right="1361" w:bottom="1134" w:left="1361" w:header="720" w:footer="720" w:gutter="0"/>
+          <w:cols w:space="720"/>
+          <w:docGrid w:linePitch="360"/>
+        </w:sectPr>
+      </w:pPr>
     </w:p>
     <w:p>
       <w:pPr>
@@ -122,17 +128,6 @@
     </w:p>
     <w:p>
       <w:pPr>
-        <w:sectPr>
-          <w:footerReference w:type="default" r:id="rId8"/>
-          <w:pgSz w:w="11906" w:h="16838"/>
-          <w:pgMar w:top="1247" w:right="1361" w:bottom="1134" w:left="1361" w:header="720" w:footer="720" w:gutter="0"/>
-          <w:cols w:space="720"/>
-          <w:docGrid w:linePitch="360"/>
-        </w:sectPr>
-      </w:pPr>
-    </w:p>
-    <w:p>
-      <w:pPr>
         <w:keepNext/>
         <w:spacing w:after="40"/>
         <w:jc w:val="center"/>
@@ -140,7 +135,7 @@
       <w:r>
         <w:drawing>
           <wp:inline xmlns:a="http://schemas.openxmlformats.org/drawingml/2006/main" xmlns:pic="http://schemas.openxmlformats.org/drawingml/2006/picture">
-            <wp:extent cx="8963660" cy="4132596"/>
+            <wp:extent cx="8043517" cy="3708375"/>
             <wp:docPr id="1" name="Picture 1"/>
             <wp:cNvGraphicFramePr>
               <a:graphicFrameLocks noChangeAspect="1"/>
@@ -161,7 +156,7 @@
                   <pic:spPr>
                     <a:xfrm>
                       <a:off x="0" y="0"/>
-                      <a:ext cx="8963660" cy="4132596"/>
+                      <a:ext cx="8043517" cy="3708375"/>
                     </a:xfrm>
                     <a:prstGeom prst="rect"/>
                   </pic:spPr>
@@ -338,13 +333,14 @@
         <w:tblStyle w:val="Tablaconcuadrcula"/>
         <w:tblW w:type="auto" w:w="0"/>
         <w:jc w:val="center"/>
+        <w:tblLayout w:type="fixed"/>
         <w:tblLook w:firstColumn="1" w:firstRow="1" w:lastColumn="0" w:lastRow="0" w:noHBand="0" w:noVBand="1" w:val="04A0"/>
       </w:tblPr>
       <w:tblGrid>
-        <w:gridCol w:w="2296"/>
-        <w:gridCol w:w="2296"/>
-        <w:gridCol w:w="2296"/>
-        <w:gridCol w:w="2296"/>
+        <w:gridCol w:w="1654"/>
+        <w:gridCol w:w="2257"/>
+        <w:gridCol w:w="2482"/>
+        <w:gridCol w:w="2791"/>
       </w:tblGrid>
       <w:tr>
         <w:trPr>
@@ -353,7 +349,7 @@
         </w:trPr>
         <w:tc>
           <w:tcPr>
-            <w:tcW w:type="dxa" w:w="2296"/>
+            <w:tcW w:type="dxa" w:w="1654"/>
             <w:shd w:val="clear" w:color="auto" w:fill="0F6E6E"/>
           </w:tcPr>
           <w:p>
@@ -373,7 +369,7 @@
         </w:tc>
         <w:tc>
           <w:tcPr>
-            <w:tcW w:type="dxa" w:w="2296"/>
+            <w:tcW w:type="dxa" w:w="2257"/>
             <w:shd w:val="clear" w:color="auto" w:fill="0F6E6E"/>
           </w:tcPr>
           <w:p>
@@ -393,7 +389,7 @@
         </w:tc>
         <w:tc>
           <w:tcPr>
-            <w:tcW w:type="dxa" w:w="2296"/>
+            <w:tcW w:type="dxa" w:w="2482"/>
             <w:shd w:val="clear" w:color="auto" w:fill="0F6E6E"/>
           </w:tcPr>
           <w:p>
@@ -413,7 +409,7 @@
         </w:tc>
         <w:tc>
           <w:tcPr>
-            <w:tcW w:type="dxa" w:w="2296"/>
+            <w:tcW w:type="dxa" w:w="2791"/>
             <w:shd w:val="clear" w:color="auto" w:fill="0F6E6E"/>
           </w:tcPr>
           <w:p>
@@ -464,7 +460,7 @@
         </w:trPr>
         <w:tc>
           <w:tcPr>
-            <w:tcW w:type="dxa" w:w="2296"/>
+            <w:tcW w:type="dxa" w:w="1654"/>
           </w:tcPr>
           <w:p>
             <w:pPr>
@@ -481,7 +477,7 @@
         </w:tc>
         <w:tc>
           <w:tcPr>
-            <w:tcW w:type="dxa" w:w="2296"/>
+            <w:tcW w:type="dxa" w:w="2257"/>
           </w:tcPr>
           <w:p>
             <w:pPr>
@@ -499,7 +495,7 @@
         </w:tc>
         <w:tc>
           <w:tcPr>
-            <w:tcW w:type="dxa" w:w="2296"/>
+            <w:tcW w:type="dxa" w:w="2482"/>
           </w:tcPr>
           <w:p>
             <w:pPr>
@@ -516,7 +512,7 @@
         </w:tc>
         <w:tc>
           <w:tcPr>
-            <w:tcW w:type="dxa" w:w="2296"/>
+            <w:tcW w:type="dxa" w:w="2791"/>
           </w:tcPr>
           <w:p>
             <w:pPr>
@@ -591,7 +587,7 @@
         </w:trPr>
         <w:tc>
           <w:tcPr>
-            <w:tcW w:type="dxa" w:w="2296"/>
+            <w:tcW w:type="dxa" w:w="1654"/>
           </w:tcPr>
           <w:p>
             <w:pPr>
@@ -608,7 +604,7 @@
         </w:tc>
         <w:tc>
           <w:tcPr>
-            <w:tcW w:type="dxa" w:w="2296"/>
+            <w:tcW w:type="dxa" w:w="2257"/>
           </w:tcPr>
           <w:p>
             <w:pPr>
@@ -639,7 +635,7 @@
         </w:tc>
         <w:tc>
           <w:tcPr>
-            <w:tcW w:type="dxa" w:w="2296"/>
+            <w:tcW w:type="dxa" w:w="2482"/>
           </w:tcPr>
           <w:p>
             <w:pPr>
@@ -656,7 +652,7 @@
         </w:tc>
         <w:tc>
           <w:tcPr>
-            <w:tcW w:type="dxa" w:w="2296"/>
+            <w:tcW w:type="dxa" w:w="2791"/>
           </w:tcPr>
           <w:p>
             <w:pPr>
@@ -783,7 +779,7 @@
         </w:trPr>
         <w:tc>
           <w:tcPr>
-            <w:tcW w:type="dxa" w:w="2296"/>
+            <w:tcW w:type="dxa" w:w="1654"/>
           </w:tcPr>
           <w:p>
             <w:pPr>
@@ -800,7 +796,7 @@
         </w:tc>
         <w:tc>
           <w:tcPr>
-            <w:tcW w:type="dxa" w:w="2296"/>
+            <w:tcW w:type="dxa" w:w="2257"/>
           </w:tcPr>
           <w:p>
             <w:pPr>
@@ -831,7 +827,7 @@
         </w:tc>
         <w:tc>
           <w:tcPr>
-            <w:tcW w:type="dxa" w:w="2296"/>
+            <w:tcW w:type="dxa" w:w="2482"/>
           </w:tcPr>
           <w:p>
             <w:pPr>
@@ -848,7 +844,7 @@
         </w:tc>
         <w:tc>
           <w:tcPr>
-            <w:tcW w:type="dxa" w:w="2296"/>
+            <w:tcW w:type="dxa" w:w="2791"/>
           </w:tcPr>
           <w:p>
             <w:pPr>
@@ -975,7 +971,7 @@
         </w:trPr>
         <w:tc>
           <w:tcPr>
-            <w:tcW w:type="dxa" w:w="2296"/>
+            <w:tcW w:type="dxa" w:w="1654"/>
           </w:tcPr>
           <w:p>
             <w:pPr>
@@ -992,7 +988,7 @@
         </w:tc>
         <w:tc>
           <w:tcPr>
-            <w:tcW w:type="dxa" w:w="2296"/>
+            <w:tcW w:type="dxa" w:w="2257"/>
           </w:tcPr>
           <w:p>
             <w:pPr>
@@ -1023,7 +1019,7 @@
         </w:tc>
         <w:tc>
           <w:tcPr>
-            <w:tcW w:type="dxa" w:w="2296"/>
+            <w:tcW w:type="dxa" w:w="2482"/>
           </w:tcPr>
           <w:p>
             <w:pPr>
@@ -1040,7 +1036,7 @@
         </w:tc>
         <w:tc>
           <w:tcPr>
-            <w:tcW w:type="dxa" w:w="2296"/>
+            <w:tcW w:type="dxa" w:w="2791"/>
           </w:tcPr>
           <w:p>
             <w:pPr>
@@ -1076,7 +1072,7 @@
         </w:trPr>
         <w:tc>
           <w:tcPr>
-            <w:tcW w:type="dxa" w:w="2296"/>
+            <w:tcW w:type="dxa" w:w="1654"/>
           </w:tcPr>
           <w:p>
             <w:pPr>
@@ -1093,7 +1089,7 @@
         </w:tc>
         <w:tc>
           <w:tcPr>
-            <w:tcW w:type="dxa" w:w="2296"/>
+            <w:tcW w:type="dxa" w:w="2257"/>
           </w:tcPr>
           <w:p>
             <w:pPr>
@@ -1163,7 +1159,7 @@
         </w:tc>
         <w:tc>
           <w:tcPr>
-            <w:tcW w:type="dxa" w:w="2296"/>
+            <w:tcW w:type="dxa" w:w="2482"/>
           </w:tcPr>
           <w:p>
             <w:pPr>
@@ -1180,7 +1176,7 @@
         </w:tc>
         <w:tc>
           <w:tcPr>
-            <w:tcW w:type="dxa" w:w="2296"/>
+            <w:tcW w:type="dxa" w:w="2791"/>
           </w:tcPr>
           <w:p>
             <w:pPr>
@@ -1295,11 +1291,12 @@
         <w:tblStyle w:val="Tablaconcuadrcula"/>
         <w:tblW w:type="auto" w:w="0"/>
         <w:jc w:val="center"/>
+        <w:tblLayout w:type="fixed"/>
         <w:tblLook w:firstColumn="1" w:firstRow="1" w:lastColumn="0" w:lastRow="0" w:noHBand="0" w:noVBand="1" w:val="04A0"/>
       </w:tblPr>
       <w:tblGrid>
-        <w:gridCol w:w="4592"/>
-        <w:gridCol w:w="4592"/>
+        <w:gridCol w:w="2268"/>
+        <w:gridCol w:w="6916"/>
       </w:tblGrid>
       <w:tr>
         <w:trPr>
@@ -1745,7 +1742,7 @@
               <w:rPr>
                 <w:sz w:val="16"/>
               </w:rPr>
-              <w:t xml:space="preserve"> ya depende de siete módulos y convendría partirlo si sigue creciendo, y la cola de correo solo es segura con una instancia de la API (P-089)</w:t>
+              <w:t xml:space="preserve"> ya depende de siete módulos y convendría partirlo si sigue creciendo</w:t>
             </w:r>
           </w:p>
         </w:tc>
@@ -1758,11 +1755,92 @@
     </w:p>
     <w:p>
       <w:pPr>
+        <w:sectPr>
+          <w:pgSz w:w="11906" w:h="16838"/>
+          <w:pgMar w:top="1247" w:right="1361" w:bottom="1134" w:left="1361" w:header="720" w:footer="720" w:gutter="0"/>
+          <w:cols w:space="720"/>
+          <w:docGrid w:linePitch="360"/>
+        </w:sectPr>
+      </w:pPr>
+    </w:p>
+    <w:p>
+      <w:pPr>
         <w:pStyle w:val="Ttulo1"/>
       </w:pPr>
       <w:r>
         <w:t>2. Diagrama de comportamiento: estados de la donación</w:t>
       </w:r>
+    </w:p>
+    <w:p>
+      <w:pPr>
+        <w:keepNext/>
+        <w:spacing w:after="40"/>
+        <w:jc w:val="center"/>
+      </w:pPr>
+      <w:r>
+        <w:drawing>
+          <wp:inline xmlns:a="http://schemas.openxmlformats.org/drawingml/2006/main" xmlns:pic="http://schemas.openxmlformats.org/drawingml/2006/picture">
+            <wp:extent cx="8114550" cy="4788375"/>
+            <wp:docPr id="3" name="Picture 3"/>
+            <wp:cNvGraphicFramePr>
+              <a:graphicFrameLocks noChangeAspect="1"/>
+            </wp:cNvGraphicFramePr>
+            <a:graphic>
+              <a:graphicData uri="http://schemas.openxmlformats.org/drawingml/2006/picture">
+                <pic:pic>
+                  <pic:nvPicPr>
+                    <pic:cNvPr id="0" name="comportamiento-01-estados-de-la-donacion.png"/>
+                    <pic:cNvPicPr/>
+                  </pic:nvPicPr>
+                  <pic:blipFill>
+                    <a:blip r:embed="rId29"/>
+                    <a:stretch>
+                      <a:fillRect/>
+                    </a:stretch>
+                  </pic:blipFill>
+                  <pic:spPr>
+                    <a:xfrm>
+                      <a:off x="0" y="0"/>
+                      <a:ext cx="8114550" cy="4788375"/>
+                    </a:xfrm>
+                    <a:prstGeom prst="rect"/>
+                  </pic:spPr>
+                </pic:pic>
+              </a:graphicData>
+            </a:graphic>
+          </wp:inline>
+        </w:drawing>
+      </w:r>
+    </w:p>
+    <w:p>
+      <w:pPr>
+        <w:jc w:val="center"/>
+      </w:pPr>
+      <w:r>
+        <w:rPr>
+          <w:b/>
+          <w:color w:val="57534E"/>
+          <w:sz w:val="18"/>
+        </w:rPr>
+        <w:t xml:space="preserve">Figura 3. </w:t>
+      </w:r>
+      <w:r>
+        <w:rPr>
+          <w:color w:val="57534E"/>
+          <w:sz w:val="18"/>
+        </w:rPr>
+        <w:t>Estados de la donación: PREPARADO, PENDIENTE, CONCILIADO, RECHAZADO y CANCELADO, con nueve transiciones numeradas y coloreadas según quién las dispara.</w:t>
+      </w:r>
+    </w:p>
+    <w:p>
+      <w:pPr>
+        <w:sectPr>
+          <w:pgSz w:w="16838" w:h="11906" w:orient="landscape"/>
+          <w:pgMar w:top="1247" w:right="1361" w:bottom="1134" w:left="1361" w:header="720" w:footer="720" w:gutter="0"/>
+          <w:cols w:space="720"/>
+          <w:docGrid w:linePitch="360"/>
+        </w:sectPr>
+      </w:pPr>
     </w:p>
     <w:p>
       <w:pPr>
@@ -1804,87 +1882,6 @@
     </w:p>
     <w:p>
       <w:pPr>
-        <w:sectPr>
-          <w:pgSz w:w="11906" w:h="16838"/>
-          <w:pgMar w:top="1247" w:right="1361" w:bottom="1134" w:left="1361" w:header="720" w:footer="720" w:gutter="0"/>
-          <w:cols w:space="720"/>
-          <w:docGrid w:linePitch="360"/>
-        </w:sectPr>
-      </w:pPr>
-    </w:p>
-    <w:p>
-      <w:pPr>
-        <w:keepNext/>
-        <w:spacing w:after="40"/>
-        <w:jc w:val="center"/>
-      </w:pPr>
-      <w:r>
-        <w:drawing>
-          <wp:inline xmlns:a="http://schemas.openxmlformats.org/drawingml/2006/main" xmlns:pic="http://schemas.openxmlformats.org/drawingml/2006/picture">
-            <wp:extent cx="8297570" cy="4896375"/>
-            <wp:docPr id="3" name="Picture 3"/>
-            <wp:cNvGraphicFramePr>
-              <a:graphicFrameLocks noChangeAspect="1"/>
-            </wp:cNvGraphicFramePr>
-            <a:graphic>
-              <a:graphicData uri="http://schemas.openxmlformats.org/drawingml/2006/picture">
-                <pic:pic>
-                  <pic:nvPicPr>
-                    <pic:cNvPr id="0" name="comportamiento-01-estados-de-la-donacion.png"/>
-                    <pic:cNvPicPr/>
-                  </pic:nvPicPr>
-                  <pic:blipFill>
-                    <a:blip r:embed="rId29"/>
-                    <a:stretch>
-                      <a:fillRect/>
-                    </a:stretch>
-                  </pic:blipFill>
-                  <pic:spPr>
-                    <a:xfrm>
-                      <a:off x="0" y="0"/>
-                      <a:ext cx="8297570" cy="4896375"/>
-                    </a:xfrm>
-                    <a:prstGeom prst="rect"/>
-                  </pic:spPr>
-                </pic:pic>
-              </a:graphicData>
-            </a:graphic>
-          </wp:inline>
-        </w:drawing>
-      </w:r>
-    </w:p>
-    <w:p>
-      <w:pPr>
-        <w:jc w:val="center"/>
-      </w:pPr>
-      <w:r>
-        <w:rPr>
-          <w:b/>
-          <w:color w:val="57534E"/>
-          <w:sz w:val="18"/>
-        </w:rPr>
-        <w:t xml:space="preserve">Figura 3. </w:t>
-      </w:r>
-      <w:r>
-        <w:rPr>
-          <w:color w:val="57534E"/>
-          <w:sz w:val="18"/>
-        </w:rPr>
-        <w:t>Estados de la donación: PREPARADO, PENDIENTE, CONCILIADO, RECHAZADO y CANCELADO, con nueve transiciones numeradas y coloreadas según quién las dispara.</w:t>
-      </w:r>
-    </w:p>
-    <w:p>
-      <w:pPr>
-        <w:sectPr>
-          <w:pgSz w:w="16838" w:h="11906" w:orient="landscape"/>
-          <w:pgMar w:top="1247" w:right="1361" w:bottom="1134" w:left="1361" w:header="720" w:footer="720" w:gutter="0"/>
-          <w:cols w:space="720"/>
-          <w:docGrid w:linePitch="360"/>
-        </w:sectPr>
-      </w:pPr>
-    </w:p>
-    <w:p>
-      <w:pPr>
         <w:pStyle w:val="Ttulo2"/>
       </w:pPr>
       <w:r>
@@ -1991,14 +1988,15 @@
         <w:tblStyle w:val="Tablaconcuadrcula"/>
         <w:tblW w:type="auto" w:w="0"/>
         <w:jc w:val="center"/>
+        <w:tblLayout w:type="fixed"/>
         <w:tblLook w:firstColumn="1" w:firstRow="1" w:lastColumn="0" w:lastRow="0" w:noHBand="0" w:noVBand="1" w:val="04A0"/>
       </w:tblPr>
       <w:tblGrid>
-        <w:gridCol w:w="1837"/>
-        <w:gridCol w:w="1837"/>
-        <w:gridCol w:w="1837"/>
-        <w:gridCol w:w="1837"/>
-        <w:gridCol w:w="1837"/>
+        <w:gridCol w:w="584"/>
+        <w:gridCol w:w="1666"/>
+        <w:gridCol w:w="1511"/>
+        <w:gridCol w:w="2384"/>
+        <w:gridCol w:w="3039"/>
       </w:tblGrid>
       <w:tr>
         <w:trPr>
@@ -2007,7 +2005,7 @@
         </w:trPr>
         <w:tc>
           <w:tcPr>
-            <w:tcW w:type="dxa" w:w="1837"/>
+            <w:tcW w:type="dxa" w:w="584"/>
             <w:shd w:val="clear" w:color="auto" w:fill="0F6E6E"/>
           </w:tcPr>
           <w:p>
@@ -2027,7 +2025,7 @@
         </w:tc>
         <w:tc>
           <w:tcPr>
-            <w:tcW w:type="dxa" w:w="1837"/>
+            <w:tcW w:type="dxa" w:w="1666"/>
             <w:shd w:val="clear" w:color="auto" w:fill="0F6E6E"/>
           </w:tcPr>
           <w:p>
@@ -2047,7 +2045,7 @@
         </w:tc>
         <w:tc>
           <w:tcPr>
-            <w:tcW w:type="dxa" w:w="1837"/>
+            <w:tcW w:type="dxa" w:w="1511"/>
             <w:shd w:val="clear" w:color="auto" w:fill="0F6E6E"/>
           </w:tcPr>
           <w:p>
@@ -2067,7 +2065,7 @@
         </w:tc>
         <w:tc>
           <w:tcPr>
-            <w:tcW w:type="dxa" w:w="1837"/>
+            <w:tcW w:type="dxa" w:w="2384"/>
             <w:shd w:val="clear" w:color="auto" w:fill="0F6E6E"/>
           </w:tcPr>
           <w:p>
@@ -2087,7 +2085,7 @@
         </w:tc>
         <w:tc>
           <w:tcPr>
-            <w:tcW w:type="dxa" w:w="1837"/>
+            <w:tcW w:type="dxa" w:w="3039"/>
             <w:shd w:val="clear" w:color="auto" w:fill="0F6E6E"/>
           </w:tcPr>
           <w:p>
@@ -2112,7 +2110,7 @@
         </w:trPr>
         <w:tc>
           <w:tcPr>
-            <w:tcW w:type="dxa" w:w="1837"/>
+            <w:tcW w:type="dxa" w:w="584"/>
           </w:tcPr>
           <w:p>
             <w:pPr>
@@ -2129,7 +2127,7 @@
         </w:tc>
         <w:tc>
           <w:tcPr>
-            <w:tcW w:type="dxa" w:w="1837"/>
+            <w:tcW w:type="dxa" w:w="1666"/>
           </w:tcPr>
           <w:p>
             <w:pPr>
@@ -2146,7 +2144,7 @@
         </w:tc>
         <w:tc>
           <w:tcPr>
-            <w:tcW w:type="dxa" w:w="1837"/>
+            <w:tcW w:type="dxa" w:w="1511"/>
           </w:tcPr>
           <w:p>
             <w:pPr>
@@ -2163,7 +2161,7 @@
         </w:tc>
         <w:tc>
           <w:tcPr>
-            <w:tcW w:type="dxa" w:w="1837"/>
+            <w:tcW w:type="dxa" w:w="2384"/>
           </w:tcPr>
           <w:p>
             <w:pPr>
@@ -2180,7 +2178,7 @@
         </w:tc>
         <w:tc>
           <w:tcPr>
-            <w:tcW w:type="dxa" w:w="1837"/>
+            <w:tcW w:type="dxa" w:w="3039"/>
           </w:tcPr>
           <w:p>
             <w:pPr>
@@ -2192,7 +2190,7 @@
                 <w:rFonts w:ascii="Consolas" w:hAnsi="Consolas"/>
                 <w:sz w:val="13"/>
               </w:rPr>
-              <w:t>DonacionesService.crear</w:t>
+              <w:t>DonacionesService.​crear</w:t>
             </w:r>
           </w:p>
         </w:tc>
@@ -2203,7 +2201,7 @@
         </w:trPr>
         <w:tc>
           <w:tcPr>
-            <w:tcW w:type="dxa" w:w="1837"/>
+            <w:tcW w:type="dxa" w:w="584"/>
           </w:tcPr>
           <w:p>
             <w:pPr>
@@ -2220,7 +2218,7 @@
         </w:tc>
         <w:tc>
           <w:tcPr>
-            <w:tcW w:type="dxa" w:w="1837"/>
+            <w:tcW w:type="dxa" w:w="1666"/>
           </w:tcPr>
           <w:p>
             <w:pPr>
@@ -2237,7 +2235,7 @@
         </w:tc>
         <w:tc>
           <w:tcPr>
-            <w:tcW w:type="dxa" w:w="1837"/>
+            <w:tcW w:type="dxa" w:w="1511"/>
           </w:tcPr>
           <w:p>
             <w:pPr>
@@ -2254,7 +2252,7 @@
         </w:tc>
         <w:tc>
           <w:tcPr>
-            <w:tcW w:type="dxa" w:w="1837"/>
+            <w:tcW w:type="dxa" w:w="2384"/>
           </w:tcPr>
           <w:p>
             <w:pPr>
@@ -2271,7 +2269,7 @@
         </w:tc>
         <w:tc>
           <w:tcPr>
-            <w:tcW w:type="dxa" w:w="1837"/>
+            <w:tcW w:type="dxa" w:w="3039"/>
           </w:tcPr>
           <w:p>
             <w:pPr>
@@ -2283,7 +2281,7 @@
                 <w:rFonts w:ascii="Consolas" w:hAnsi="Consolas"/>
                 <w:sz w:val="13"/>
               </w:rPr>
-              <w:t>RecepcionService.recibir</w:t>
+              <w:t>RecepcionService.​recibir</w:t>
             </w:r>
           </w:p>
         </w:tc>
@@ -2294,7 +2292,7 @@
         </w:trPr>
         <w:tc>
           <w:tcPr>
-            <w:tcW w:type="dxa" w:w="1837"/>
+            <w:tcW w:type="dxa" w:w="584"/>
           </w:tcPr>
           <w:p>
             <w:pPr>
@@ -2311,7 +2309,7 @@
         </w:tc>
         <w:tc>
           <w:tcPr>
-            <w:tcW w:type="dxa" w:w="1837"/>
+            <w:tcW w:type="dxa" w:w="1666"/>
           </w:tcPr>
           <w:p>
             <w:pPr>
@@ -2328,7 +2326,7 @@
         </w:tc>
         <w:tc>
           <w:tcPr>
-            <w:tcW w:type="dxa" w:w="1837"/>
+            <w:tcW w:type="dxa" w:w="1511"/>
           </w:tcPr>
           <w:p>
             <w:pPr>
@@ -2345,7 +2343,7 @@
         </w:tc>
         <w:tc>
           <w:tcPr>
-            <w:tcW w:type="dxa" w:w="1837"/>
+            <w:tcW w:type="dxa" w:w="2384"/>
           </w:tcPr>
           <w:p>
             <w:pPr>
@@ -2362,7 +2360,7 @@
         </w:tc>
         <w:tc>
           <w:tcPr>
-            <w:tcW w:type="dxa" w:w="1837"/>
+            <w:tcW w:type="dxa" w:w="3039"/>
           </w:tcPr>
           <w:p>
             <w:pPr>
@@ -2374,7 +2372,7 @@
                 <w:rFonts w:ascii="Consolas" w:hAnsi="Consolas"/>
                 <w:sz w:val="13"/>
               </w:rPr>
-              <w:t>ConciliacionService.vincular</w:t>
+              <w:t>ConciliacionService.​vincular</w:t>
             </w:r>
           </w:p>
         </w:tc>
@@ -2385,7 +2383,7 @@
         </w:trPr>
         <w:tc>
           <w:tcPr>
-            <w:tcW w:type="dxa" w:w="1837"/>
+            <w:tcW w:type="dxa" w:w="584"/>
           </w:tcPr>
           <w:p>
             <w:pPr>
@@ -2402,7 +2400,7 @@
         </w:tc>
         <w:tc>
           <w:tcPr>
-            <w:tcW w:type="dxa" w:w="1837"/>
+            <w:tcW w:type="dxa" w:w="1666"/>
           </w:tcPr>
           <w:p>
             <w:pPr>
@@ -2419,7 +2417,7 @@
         </w:tc>
         <w:tc>
           <w:tcPr>
-            <w:tcW w:type="dxa" w:w="1837"/>
+            <w:tcW w:type="dxa" w:w="1511"/>
           </w:tcPr>
           <w:p>
             <w:pPr>
@@ -2436,7 +2434,7 @@
         </w:tc>
         <w:tc>
           <w:tcPr>
-            <w:tcW w:type="dxa" w:w="1837"/>
+            <w:tcW w:type="dxa" w:w="2384"/>
           </w:tcPr>
           <w:p>
             <w:pPr>
@@ -2453,7 +2451,7 @@
         </w:tc>
         <w:tc>
           <w:tcPr>
-            <w:tcW w:type="dxa" w:w="1837"/>
+            <w:tcW w:type="dxa" w:w="3039"/>
           </w:tcPr>
           <w:p>
             <w:pPr>
@@ -2465,7 +2463,7 @@
                 <w:rFonts w:ascii="Consolas" w:hAnsi="Consolas"/>
                 <w:sz w:val="13"/>
               </w:rPr>
-              <w:t>ConciliacionService.vincular</w:t>
+              <w:t>ConciliacionService.​vincular</w:t>
             </w:r>
           </w:p>
         </w:tc>
@@ -2476,7 +2474,7 @@
         </w:trPr>
         <w:tc>
           <w:tcPr>
-            <w:tcW w:type="dxa" w:w="1837"/>
+            <w:tcW w:type="dxa" w:w="584"/>
           </w:tcPr>
           <w:p>
             <w:pPr>
@@ -2493,7 +2491,7 @@
         </w:tc>
         <w:tc>
           <w:tcPr>
-            <w:tcW w:type="dxa" w:w="1837"/>
+            <w:tcW w:type="dxa" w:w="1666"/>
           </w:tcPr>
           <w:p>
             <w:pPr>
@@ -2510,7 +2508,7 @@
         </w:tc>
         <w:tc>
           <w:tcPr>
-            <w:tcW w:type="dxa" w:w="1837"/>
+            <w:tcW w:type="dxa" w:w="1511"/>
           </w:tcPr>
           <w:p>
             <w:pPr>
@@ -2527,7 +2525,7 @@
         </w:tc>
         <w:tc>
           <w:tcPr>
-            <w:tcW w:type="dxa" w:w="1837"/>
+            <w:tcW w:type="dxa" w:w="2384"/>
           </w:tcPr>
           <w:p>
             <w:pPr>
@@ -2544,7 +2542,7 @@
         </w:tc>
         <w:tc>
           <w:tcPr>
-            <w:tcW w:type="dxa" w:w="1837"/>
+            <w:tcW w:type="dxa" w:w="3039"/>
           </w:tcPr>
           <w:p>
             <w:pPr>
@@ -2556,7 +2554,7 @@
                 <w:rFonts w:ascii="Consolas" w:hAnsi="Consolas"/>
                 <w:sz w:val="13"/>
               </w:rPr>
-              <w:t>ConciliacionService.conciliar</w:t>
+              <w:t>ConciliacionService.​conciliar</w:t>
             </w:r>
           </w:p>
         </w:tc>
@@ -2567,7 +2565,7 @@
         </w:trPr>
         <w:tc>
           <w:tcPr>
-            <w:tcW w:type="dxa" w:w="1837"/>
+            <w:tcW w:type="dxa" w:w="584"/>
           </w:tcPr>
           <w:p>
             <w:pPr>
@@ -2584,7 +2582,7 @@
         </w:tc>
         <w:tc>
           <w:tcPr>
-            <w:tcW w:type="dxa" w:w="1837"/>
+            <w:tcW w:type="dxa" w:w="1666"/>
           </w:tcPr>
           <w:p>
             <w:pPr>
@@ -2601,7 +2599,7 @@
         </w:tc>
         <w:tc>
           <w:tcPr>
-            <w:tcW w:type="dxa" w:w="1837"/>
+            <w:tcW w:type="dxa" w:w="1511"/>
           </w:tcPr>
           <w:p>
             <w:pPr>
@@ -2618,7 +2616,7 @@
         </w:tc>
         <w:tc>
           <w:tcPr>
-            <w:tcW w:type="dxa" w:w="1837"/>
+            <w:tcW w:type="dxa" w:w="2384"/>
           </w:tcPr>
           <w:p>
             <w:pPr>
@@ -2635,7 +2633,7 @@
         </w:tc>
         <w:tc>
           <w:tcPr>
-            <w:tcW w:type="dxa" w:w="1837"/>
+            <w:tcW w:type="dxa" w:w="3039"/>
           </w:tcPr>
           <w:p>
             <w:pPr>
@@ -2647,7 +2645,7 @@
                 <w:rFonts w:ascii="Consolas" w:hAnsi="Consolas"/>
                 <w:sz w:val="13"/>
               </w:rPr>
-              <w:t>ConciliacionService.rechazar</w:t>
+              <w:t>ConciliacionService.​rechazar</w:t>
             </w:r>
           </w:p>
         </w:tc>
@@ -2658,7 +2656,7 @@
         </w:trPr>
         <w:tc>
           <w:tcPr>
-            <w:tcW w:type="dxa" w:w="1837"/>
+            <w:tcW w:type="dxa" w:w="584"/>
           </w:tcPr>
           <w:p>
             <w:pPr>
@@ -2675,7 +2673,7 @@
         </w:tc>
         <w:tc>
           <w:tcPr>
-            <w:tcW w:type="dxa" w:w="1837"/>
+            <w:tcW w:type="dxa" w:w="1666"/>
           </w:tcPr>
           <w:p>
             <w:pPr>
@@ -2692,7 +2690,7 @@
         </w:tc>
         <w:tc>
           <w:tcPr>
-            <w:tcW w:type="dxa" w:w="1837"/>
+            <w:tcW w:type="dxa" w:w="1511"/>
           </w:tcPr>
           <w:p>
             <w:pPr>
@@ -2709,7 +2707,7 @@
         </w:tc>
         <w:tc>
           <w:tcPr>
-            <w:tcW w:type="dxa" w:w="1837"/>
+            <w:tcW w:type="dxa" w:w="2384"/>
           </w:tcPr>
           <w:p>
             <w:pPr>
@@ -2726,7 +2724,7 @@
         </w:tc>
         <w:tc>
           <w:tcPr>
-            <w:tcW w:type="dxa" w:w="1837"/>
+            <w:tcW w:type="dxa" w:w="3039"/>
           </w:tcPr>
           <w:p>
             <w:pPr>
@@ -2738,7 +2736,7 @@
                 <w:rFonts w:ascii="Consolas" w:hAnsi="Consolas"/>
                 <w:sz w:val="13"/>
               </w:rPr>
-              <w:t>ConciliacionService.revertirRechazo</w:t>
+              <w:t>ConciliacionService.​revertirRechazo</w:t>
             </w:r>
           </w:p>
         </w:tc>
@@ -2749,7 +2747,7 @@
         </w:trPr>
         <w:tc>
           <w:tcPr>
-            <w:tcW w:type="dxa" w:w="1837"/>
+            <w:tcW w:type="dxa" w:w="584"/>
           </w:tcPr>
           <w:p>
             <w:pPr>
@@ -2766,7 +2764,7 @@
         </w:tc>
         <w:tc>
           <w:tcPr>
-            <w:tcW w:type="dxa" w:w="1837"/>
+            <w:tcW w:type="dxa" w:w="1666"/>
           </w:tcPr>
           <w:p>
             <w:pPr>
@@ -2783,7 +2781,7 @@
         </w:tc>
         <w:tc>
           <w:tcPr>
-            <w:tcW w:type="dxa" w:w="1837"/>
+            <w:tcW w:type="dxa" w:w="1511"/>
           </w:tcPr>
           <w:p>
             <w:pPr>
@@ -2800,7 +2798,7 @@
         </w:tc>
         <w:tc>
           <w:tcPr>
-            <w:tcW w:type="dxa" w:w="1837"/>
+            <w:tcW w:type="dxa" w:w="2384"/>
           </w:tcPr>
           <w:p>
             <w:pPr>
@@ -2817,7 +2815,7 @@
         </w:tc>
         <w:tc>
           <w:tcPr>
-            <w:tcW w:type="dxa" w:w="1837"/>
+            <w:tcW w:type="dxa" w:w="3039"/>
           </w:tcPr>
           <w:p>
             <w:pPr>
@@ -2829,7 +2827,7 @@
                 <w:rFonts w:ascii="Consolas" w:hAnsi="Consolas"/>
                 <w:sz w:val="13"/>
               </w:rPr>
-              <w:t>DonacionesService.cancelar</w:t>
+              <w:t>DonacionesService.​cancelar</w:t>
             </w:r>
           </w:p>
         </w:tc>
@@ -2840,7 +2838,7 @@
         </w:trPr>
         <w:tc>
           <w:tcPr>
-            <w:tcW w:type="dxa" w:w="1837"/>
+            <w:tcW w:type="dxa" w:w="584"/>
           </w:tcPr>
           <w:p>
             <w:pPr>
@@ -2857,7 +2855,7 @@
         </w:tc>
         <w:tc>
           <w:tcPr>
-            <w:tcW w:type="dxa" w:w="1837"/>
+            <w:tcW w:type="dxa" w:w="1666"/>
           </w:tcPr>
           <w:p>
             <w:pPr>
@@ -2874,7 +2872,7 @@
         </w:tc>
         <w:tc>
           <w:tcPr>
-            <w:tcW w:type="dxa" w:w="1837"/>
+            <w:tcW w:type="dxa" w:w="1511"/>
           </w:tcPr>
           <w:p>
             <w:pPr>
@@ -2898,7 +2896,7 @@
         </w:tc>
         <w:tc>
           <w:tcPr>
-            <w:tcW w:type="dxa" w:w="1837"/>
+            <w:tcW w:type="dxa" w:w="2384"/>
           </w:tcPr>
           <w:p>
             <w:pPr>
@@ -2915,7 +2913,7 @@
         </w:tc>
         <w:tc>
           <w:tcPr>
-            <w:tcW w:type="dxa" w:w="1837"/>
+            <w:tcW w:type="dxa" w:w="3039"/>
           </w:tcPr>
           <w:p>
             <w:pPr>
@@ -2927,7 +2925,7 @@
                 <w:rFonts w:ascii="Consolas" w:hAnsi="Consolas"/>
                 <w:sz w:val="13"/>
               </w:rPr>
-              <w:t>TareasCustodiaService.cancelarVencidas</w:t>
+              <w:t>TareasCustodiaService.​cancelarVencidas</w:t>
             </w:r>
           </w:p>
         </w:tc>
@@ -3029,14 +3027,6 @@
     </w:p>
     <w:p>
       <w:pPr>
-        <w:pStyle w:val="Ttulo2"/>
-      </w:pPr>
-      <w:r>
-        <w:t>3b. Componentes y cómo se comunican</w:t>
-      </w:r>
-    </w:p>
-    <w:p>
-      <w:pPr>
         <w:sectPr>
           <w:pgSz w:w="11906" w:h="16838"/>
           <w:pgMar w:top="1247" w:right="1361" w:bottom="1134" w:left="1361" w:header="720" w:footer="720" w:gutter="0"/>
@@ -3047,6 +3037,14 @@
     </w:p>
     <w:p>
       <w:pPr>
+        <w:pStyle w:val="Ttulo2"/>
+      </w:pPr>
+      <w:r>
+        <w:t>3b. Componentes y cómo se comunican</w:t>
+      </w:r>
+    </w:p>
+    <w:p>
+      <w:pPr>
         <w:keepNext/>
         <w:spacing w:after="40"/>
         <w:jc w:val="center"/>
@@ -3054,7 +3052,7 @@
       <w:r>
         <w:drawing>
           <wp:inline xmlns:a="http://schemas.openxmlformats.org/drawingml/2006/main" xmlns:pic="http://schemas.openxmlformats.org/drawingml/2006/picture">
-            <wp:extent cx="8780689" cy="4896374"/>
+            <wp:extent cx="8587013" cy="4788375"/>
             <wp:docPr id="4" name="Picture 4"/>
             <wp:cNvGraphicFramePr>
               <a:graphicFrameLocks noChangeAspect="1"/>
@@ -3075,7 +3073,7 @@
                   <pic:spPr>
                     <a:xfrm>
                       <a:off x="0" y="0"/>
-                      <a:ext cx="8780689" cy="4896374"/>
+                      <a:ext cx="8587013" cy="4788375"/>
                     </a:xfrm>
                     <a:prstGeom prst="rect"/>
                   </pic:spPr>
@@ -3136,12 +3134,13 @@
         <w:tblStyle w:val="Tablaconcuadrcula"/>
         <w:tblW w:type="auto" w:w="0"/>
         <w:jc w:val="center"/>
+        <w:tblLayout w:type="fixed"/>
         <w:tblLook w:firstColumn="1" w:firstRow="1" w:lastColumn="0" w:lastRow="0" w:noHBand="0" w:noVBand="1" w:val="04A0"/>
       </w:tblPr>
       <w:tblGrid>
-        <w:gridCol w:w="3061"/>
-        <w:gridCol w:w="3061"/>
-        <w:gridCol w:w="3061"/>
+        <w:gridCol w:w="2589"/>
+        <w:gridCol w:w="2959"/>
+        <w:gridCol w:w="3636"/>
       </w:tblGrid>
       <w:tr>
         <w:trPr>
@@ -3150,7 +3149,7 @@
         </w:trPr>
         <w:tc>
           <w:tcPr>
-            <w:tcW w:type="dxa" w:w="3061"/>
+            <w:tcW w:type="dxa" w:w="2589"/>
             <w:shd w:val="clear" w:color="auto" w:fill="0F6E6E"/>
           </w:tcPr>
           <w:p>
@@ -3170,7 +3169,7 @@
         </w:tc>
         <w:tc>
           <w:tcPr>
-            <w:tcW w:type="dxa" w:w="3061"/>
+            <w:tcW w:type="dxa" w:w="2959"/>
             <w:shd w:val="clear" w:color="auto" w:fill="0F6E6E"/>
           </w:tcPr>
           <w:p>
@@ -3190,7 +3189,7 @@
         </w:tc>
         <w:tc>
           <w:tcPr>
-            <w:tcW w:type="dxa" w:w="3061"/>
+            <w:tcW w:type="dxa" w:w="3636"/>
             <w:shd w:val="clear" w:color="auto" w:fill="0F6E6E"/>
           </w:tcPr>
           <w:p>
@@ -3215,7 +3214,7 @@
         </w:trPr>
         <w:tc>
           <w:tcPr>
-            <w:tcW w:type="dxa" w:w="3061"/>
+            <w:tcW w:type="dxa" w:w="2589"/>
           </w:tcPr>
           <w:p>
             <w:pPr>
@@ -3272,7 +3271,7 @@
         </w:tc>
         <w:tc>
           <w:tcPr>
-            <w:tcW w:type="dxa" w:w="3061"/>
+            <w:tcW w:type="dxa" w:w="2959"/>
           </w:tcPr>
           <w:p>
             <w:pPr>
@@ -3290,7 +3289,7 @@
                 <w:rFonts w:ascii="Consolas" w:hAnsi="Consolas"/>
                 <w:sz w:val="13"/>
               </w:rPr>
-              <w:t>NotificacionService.encolar</w:t>
+              <w:t>NotificacionService.​encolar</w:t>
             </w:r>
             <w:r>
               <w:rPr>
@@ -3302,7 +3301,7 @@
         </w:tc>
         <w:tc>
           <w:tcPr>
-            <w:tcW w:type="dxa" w:w="3061"/>
+            <w:tcW w:type="dxa" w:w="3636"/>
           </w:tcPr>
           <w:p>
             <w:pPr>
@@ -3314,7 +3313,7 @@
                 <w:rFonts w:ascii="Consolas" w:hAnsi="Consolas"/>
                 <w:sz w:val="13"/>
               </w:rPr>
-              <w:t>notificacion.service.ts</w:t>
+              <w:t>notificacion.​service.​ts</w:t>
             </w:r>
             <w:r>
               <w:rPr>
@@ -3333,14 +3332,14 @@
               <w:rPr>
                 <w:sz w:val="16"/>
               </w:rPr>
-              <w:t xml:space="preserve"> (línea 56); un uso en </w:t>
+              <w:t xml:space="preserve"> (línea 59); un uso en </w:t>
             </w:r>
             <w:r>
               <w:rPr>
                 <w:rFonts w:ascii="Consolas" w:hAnsi="Consolas"/>
                 <w:sz w:val="13"/>
               </w:rPr>
-              <w:t>identidad/usuarios/usuarios.service.ts</w:t>
+              <w:t>identidad/usuarios/usuarios.​service.​ts</w:t>
             </w:r>
             <w:r>
               <w:rPr>
@@ -3357,7 +3356,7 @@
         </w:trPr>
         <w:tc>
           <w:tcPr>
-            <w:tcW w:type="dxa" w:w="3061"/>
+            <w:tcW w:type="dxa" w:w="2589"/>
           </w:tcPr>
           <w:p>
             <w:pPr>
@@ -3381,7 +3380,7 @@
         </w:tc>
         <w:tc>
           <w:tcPr>
-            <w:tcW w:type="dxa" w:w="3061"/>
+            <w:tcW w:type="dxa" w:w="2959"/>
           </w:tcPr>
           <w:p>
             <w:pPr>
@@ -3411,7 +3410,7 @@
         </w:tc>
         <w:tc>
           <w:tcPr>
-            <w:tcW w:type="dxa" w:w="3061"/>
+            <w:tcW w:type="dxa" w:w="3636"/>
           </w:tcPr>
           <w:p>
             <w:pPr>
@@ -3442,7 +3441,7 @@
                 <w:rFonts w:ascii="Consolas" w:hAnsi="Consolas"/>
                 <w:sz w:val="13"/>
               </w:rPr>
-              <w:t>prisma/schema.prisma</w:t>
+              <w:t>prisma/schema.​prisma</w:t>
             </w:r>
             <w:r>
               <w:rPr>
@@ -3455,7 +3454,7 @@
                 <w:rFonts w:ascii="Consolas" w:hAnsi="Consolas"/>
                 <w:sz w:val="13"/>
               </w:rPr>
-              <w:t>notificaciones/dao/correo-saliente.dao.ts</w:t>
+              <w:t>notificaciones/dao/correo-saliente.​dao.​ts</w:t>
             </w:r>
           </w:p>
         </w:tc>
@@ -3466,7 +3465,7 @@
         </w:trPr>
         <w:tc>
           <w:tcPr>
-            <w:tcW w:type="dxa" w:w="3061"/>
+            <w:tcW w:type="dxa" w:w="2589"/>
           </w:tcPr>
           <w:p>
             <w:pPr>
@@ -3478,13 +3477,13 @@
                 <w:rFonts w:ascii="Consolas" w:hAnsi="Consolas"/>
                 <w:sz w:val="13"/>
               </w:rPr>
-              <w:t>NotificacionService.procesarCola</w:t>
+              <w:t>NotificacionService.​procesarCola</w:t>
             </w:r>
           </w:p>
         </w:tc>
         <w:tc>
           <w:tcPr>
-            <w:tcW w:type="dxa" w:w="3061"/>
+            <w:tcW w:type="dxa" w:w="2959"/>
           </w:tcPr>
           <w:p>
             <w:pPr>
@@ -3508,13 +3507,39 @@
               <w:rPr>
                 <w:sz w:val="16"/>
               </w:rPr>
-              <w:t>), toma hasta 50 correos listos del más viejo al más nuevo y los envía</w:t>
+              <w:t xml:space="preserve">), reclama hasta 50 correos listos del más viejo al más nuevo y los envía. El reclamo es un solo </w:t>
+            </w:r>
+            <w:r>
+              <w:rPr>
+                <w:rFonts w:ascii="Consolas" w:hAnsi="Consolas"/>
+                <w:sz w:val="13"/>
+              </w:rPr>
+              <w:t>UPDATE</w:t>
+            </w:r>
+            <w:r>
+              <w:rPr>
+                <w:sz w:val="16"/>
+              </w:rPr>
+              <w:t xml:space="preserve"> con </w:t>
+            </w:r>
+            <w:r>
+              <w:rPr>
+                <w:rFonts w:ascii="Consolas" w:hAnsi="Consolas"/>
+                <w:sz w:val="13"/>
+              </w:rPr>
+              <w:t>FOR UPDATE SKIP LOCKED</w:t>
+            </w:r>
+            <w:r>
+              <w:rPr>
+                <w:sz w:val="16"/>
+              </w:rPr>
+              <w:t xml:space="preserve"> que aparta el lote cinco minutos, así que dos instancias de la API se reparten las filas sin repetir correos</w:t>
             </w:r>
           </w:p>
         </w:tc>
         <w:tc>
           <w:tcPr>
-            <w:tcW w:type="dxa" w:w="3061"/>
+            <w:tcW w:type="dxa" w:w="3636"/>
           </w:tcPr>
           <w:p>
             <w:pPr>
@@ -3526,7 +3551,7 @@
                 <w:rFonts w:ascii="Consolas" w:hAnsi="Consolas"/>
                 <w:sz w:val="13"/>
               </w:rPr>
-              <w:t>notificacion.service.ts</w:t>
+              <w:t>notificacion.​service.​ts</w:t>
             </w:r>
             <w:r>
               <w:rPr>
@@ -3545,7 +3570,7 @@
               <w:rPr>
                 <w:sz w:val="16"/>
               </w:rPr>
-              <w:t xml:space="preserve"> (líneas 62 a 79) y </w:t>
+              <w:t xml:space="preserve"> (líneas 65 a 82) y </w:t>
             </w:r>
             <w:r>
               <w:rPr>
@@ -3558,7 +3583,27 @@
               <w:rPr>
                 <w:sz w:val="16"/>
               </w:rPr>
-              <w:t xml:space="preserve"> (81 a 114)</w:t>
+              <w:t xml:space="preserve"> (84 a 117); el reclamo, en </w:t>
+            </w:r>
+            <w:r>
+              <w:rPr>
+                <w:rFonts w:ascii="Consolas" w:hAnsi="Consolas"/>
+                <w:sz w:val="13"/>
+              </w:rPr>
+              <w:t>notificaciones/dao/correo-saliente.​dao.​ts</w:t>
+            </w:r>
+            <w:r>
+              <w:rPr>
+                <w:sz w:val="16"/>
+              </w:rPr>
+              <w:t xml:space="preserve">, método </w:t>
+            </w:r>
+            <w:r>
+              <w:rPr>
+                <w:rFonts w:ascii="Consolas" w:hAnsi="Consolas"/>
+                <w:sz w:val="13"/>
+              </w:rPr>
+              <w:t>reclamar</w:t>
             </w:r>
           </w:p>
         </w:tc>
@@ -3569,7 +3614,7 @@
         </w:trPr>
         <w:tc>
           <w:tcPr>
-            <w:tcW w:type="dxa" w:w="3061"/>
+            <w:tcW w:type="dxa" w:w="2589"/>
           </w:tcPr>
           <w:p>
             <w:pPr>
@@ -3586,7 +3631,7 @@
         </w:tc>
         <w:tc>
           <w:tcPr>
-            <w:tcW w:type="dxa" w:w="3061"/>
+            <w:tcW w:type="dxa" w:w="2959"/>
           </w:tcPr>
           <w:p>
             <w:pPr>
@@ -3604,7 +3649,7 @@
                 <w:rFonts w:ascii="Consolas" w:hAnsi="Consolas"/>
                 <w:sz w:val="13"/>
               </w:rPr>
-              <w:t>smtp.resend.com</w:t>
+              <w:t>smtp.​resend.​com</w:t>
             </w:r>
             <w:r>
               <w:rPr>
@@ -3616,7 +3661,7 @@
         </w:tc>
         <w:tc>
           <w:tcPr>
-            <w:tcW w:type="dxa" w:w="3061"/>
+            <w:tcW w:type="dxa" w:w="3636"/>
           </w:tcPr>
           <w:p>
             <w:pPr>
@@ -3628,7 +3673,7 @@
                 <w:rFonts w:ascii="Consolas" w:hAnsi="Consolas"/>
                 <w:sz w:val="13"/>
               </w:rPr>
-              <w:t>.env.example</w:t>
+              <w:t>.env.​example</w:t>
             </w:r>
             <w:r>
               <w:rPr>
@@ -3676,7 +3721,7 @@
         <w:t>src/pruebas-integracion/notificaciones.int.test.ts</w:t>
       </w:r>
       <w:r>
-        <w:t xml:space="preserve">): con el servidor de correo arriba el correo queda ENVIADO; con el servidor caído queda FALLIDO, espera y sale solo cuando el servidor vuelve; después del máximo de intentos no se reintenta; y con </w:t>
+        <w:t xml:space="preserve">): con el servidor de correo arriba el correo queda ENVIADO; con el servidor caído queda FALLIDO, espera y sale solo cuando el servidor vuelve; después del máximo de intentos no se reintenta; con </w:t>
       </w:r>
       <w:r>
         <w:rPr>
@@ -3686,7 +3731,7 @@
         <w:t>CORREO_ACTIVO=false</w:t>
       </w:r>
       <w:r>
-        <w:t xml:space="preserve"> no se encola nada.</w:t>
+        <w:t xml:space="preserve"> no se encola nada; y con dos instancias a la vez cada correo sale una sola vez.</w:t>
       </w:r>
     </w:p>
     <w:p>
@@ -3894,23 +3939,23 @@
         <w:t>procesando</w:t>
       </w:r>
       <w:r>
-        <w:t xml:space="preserve"> evita que un lote empiece antes de que termine el anterior, pero solo dentro de una instancia de la API. Con dos instancias, las dos leerían las mismas filas y el correo saldría dos veces. Hoy corre una sola. El arreglo es reclamar el lote con </w:t>
+        <w:t xml:space="preserve"> solo evitaba dos lotes dentro de una instancia, y con dos instancias de la API el mismo correo podía salir dos veces. Lo vimos al escribir esta ficha y lo resolvimos el mismo día (</w:t>
+      </w:r>
+      <w:r>
+        <w:t>P-089</w:t>
+      </w:r>
+      <w:r>
+        <w:t xml:space="preserve">): el consumidor reclama el lote con </w:t>
       </w:r>
       <w:r>
         <w:rPr>
           <w:rFonts w:ascii="Consolas" w:hAnsi="Consolas"/>
           <w:sz w:val="19"/>
         </w:rPr>
-        <w:t>SELECT … FOR UPDATE SKIP LOCKED</w:t>
+        <w:t>UPDATE … WHERE id IN (SELECT … FOR UPDATE SKIP LOCKED)</w:t>
       </w:r>
       <w:r>
-        <w:t xml:space="preserve">, y quedó anotado como </w:t>
-      </w:r>
-      <w:r>
-        <w:t>P-089</w:t>
-      </w:r>
-      <w:r>
-        <w:t>.</w:t>
+        <w:t xml:space="preserve"> y lo aparta cinco minutos. Una prueba de integración pone dos instancias a procesar la cola al mismo tiempo con un servidor de correo lento; con el código anterior salieron seis correos repetidos, y con el reclamo cada uno sale una vez. Si la instancia que apartó el lote se cae, el préstamo vence y los correos vuelven a la cola.</w:t>
       </w:r>
     </w:p>
     <w:p>

</xml_diff>